<commit_message>
Actualizado el documento de certificación con todas las pruebas fallidas de la página
</commit_message>
<xml_diff>
--- a/Formatos/Carta de certificación.docx
+++ b/Formatos/Carta de certificación.docx
@@ -1,6 +1,6 @@
 
 <file path=word/document.xml><?xml version="1.0" encoding="utf-8"?>
-<w:document xmlns:wpc="http://schemas.microsoft.com/office/word/2010/wordprocessingCanvas" xmlns:cx="http://schemas.microsoft.com/office/drawing/2014/chartex" xmlns:cx1="http://schemas.microsoft.com/office/drawing/2015/9/8/chartex" xmlns:cx2="http://schemas.microsoft.com/office/drawing/2015/10/21/chartex" xmlns:cx3="http://schemas.microsoft.com/office/drawing/2016/5/9/chartex" xmlns:cx4="http://schemas.microsoft.com/office/drawing/2016/5/10/chartex" xmlns:cx5="http://schemas.microsoft.com/office/drawing/2016/5/11/chartex" xmlns:cx6="http://schemas.microsoft.com/office/drawing/2016/5/12/chartex" xmlns:cx7="http://schemas.microsoft.com/office/drawing/2016/5/13/chartex" xmlns:cx8="http://schemas.microsoft.com/office/drawing/2016/5/14/chartex" xmlns:mc="http://schemas.openxmlformats.org/markup-compatibility/2006" xmlns:aink="http://schemas.microsoft.com/office/drawing/2016/ink" xmlns:am3d="http://schemas.microsoft.com/office/drawing/2017/model3d" xmlns:o="urn:schemas-microsoft-com:office:office" xmlns:oel="http://schemas.microsoft.com/office/2019/extlst" xmlns:r="http://schemas.openxmlformats.org/officeDocument/2006/relationships" xmlns:m="http://schemas.openxmlformats.org/officeDocument/2006/math" xmlns:v="urn:schemas-microsoft-com:vml" xmlns:wp14="http://schemas.microsoft.com/office/word/2010/wordprocessingDrawing" xmlns:wp="http://schemas.openxmlformats.org/drawingml/2006/wordprocessingDrawing" xmlns:w10="urn:schemas-microsoft-com:office:word" xmlns:w="http://schemas.openxmlformats.org/wordprocessingml/2006/main" xmlns:w14="http://schemas.microsoft.com/office/word/2010/wordml" xmlns:w15="http://schemas.microsoft.com/office/word/2012/wordml" xmlns:w16cex="http://schemas.microsoft.com/office/word/2018/wordml/cex" xmlns:w16cid="http://schemas.microsoft.com/office/word/2016/wordml/cid" xmlns:w16="http://schemas.microsoft.com/office/word/2018/wordml" xmlns:w16du="http://schemas.microsoft.com/office/word/2023/wordml/word16du" xmlns:w16sdtdh="http://schemas.microsoft.com/office/word/2020/wordml/sdtdatahash" xmlns:w16sdtfl="http://schemas.microsoft.com/office/word/2024/wordml/sdtformatlock" xmlns:w16se="http://schemas.microsoft.com/office/word/2015/wordml/symex" xmlns:wpg="http://schemas.microsoft.com/office/word/2010/wordprocessingGroup" xmlns:wpi="http://schemas.microsoft.com/office/word/2010/wordprocessingInk" xmlns:wne="http://schemas.microsoft.com/office/word/2006/wordml" xmlns:wps="http://schemas.microsoft.com/office/word/2010/wordprocessingShape" xmlns:a="http://schemas.openxmlformats.org/drawingml/2006/main" xmlns:pic="http://schemas.openxmlformats.org/drawingml/2006/picture" xmlns:a14="http://schemas.microsoft.com/office/drawing/2010/main" mc:Ignorable="w14 w15 w16se w16cid w16 w16cex w16sdtdh w16sdtfl w16du wp14">
+<w:document xmlns:wpc="http://schemas.microsoft.com/office/word/2010/wordprocessingCanvas" xmlns:cx="http://schemas.microsoft.com/office/drawing/2014/chartex" xmlns:cx1="http://schemas.microsoft.com/office/drawing/2015/9/8/chartex" xmlns:cx2="http://schemas.microsoft.com/office/drawing/2015/10/21/chartex" xmlns:cx3="http://schemas.microsoft.com/office/drawing/2016/5/9/chartex" xmlns:cx4="http://schemas.microsoft.com/office/drawing/2016/5/10/chartex" xmlns:cx5="http://schemas.microsoft.com/office/drawing/2016/5/11/chartex" xmlns:cx6="http://schemas.microsoft.com/office/drawing/2016/5/12/chartex" xmlns:cx7="http://schemas.microsoft.com/office/drawing/2016/5/13/chartex" xmlns:cx8="http://schemas.microsoft.com/office/drawing/2016/5/14/chartex" xmlns:mc="http://schemas.openxmlformats.org/markup-compatibility/2006" xmlns:aink="http://schemas.microsoft.com/office/drawing/2016/ink" xmlns:am3d="http://schemas.microsoft.com/office/drawing/2017/model3d" xmlns:o="urn:schemas-microsoft-com:office:office" xmlns:oel="http://schemas.microsoft.com/office/2019/extlst" xmlns:r="http://schemas.openxmlformats.org/officeDocument/2006/relationships" xmlns:m="http://schemas.openxmlformats.org/officeDocument/2006/math" xmlns:v="urn:schemas-microsoft-com:vml" xmlns:wp14="http://schemas.microsoft.com/office/word/2010/wordprocessingDrawing" xmlns:wp="http://schemas.openxmlformats.org/drawingml/2006/wordprocessingDrawing" xmlns:w10="urn:schemas-microsoft-com:office:word" xmlns:w="http://schemas.openxmlformats.org/wordprocessingml/2006/main" xmlns:w14="http://schemas.microsoft.com/office/word/2010/wordml" xmlns:w15="http://schemas.microsoft.com/office/word/2012/wordml" xmlns:w16cex="http://schemas.microsoft.com/office/word/2018/wordml/cex" xmlns:w16cid="http://schemas.microsoft.com/office/word/2016/wordml/cid" xmlns:w16="http://schemas.microsoft.com/office/word/2018/wordml" xmlns:w16du="http://schemas.microsoft.com/office/word/2023/wordml/word16du" xmlns:w16sdtdh="http://schemas.microsoft.com/office/word/2020/wordml/sdtdatahash" xmlns:w16sdtfl="http://schemas.microsoft.com/office/word/2024/wordml/sdtformatlock" xmlns:w16se="http://schemas.microsoft.com/office/word/2015/wordml/symex" xmlns:wpg="http://schemas.microsoft.com/office/word/2010/wordprocessingGroup" xmlns:wpi="http://schemas.microsoft.com/office/word/2010/wordprocessingInk" xmlns:wne="http://schemas.microsoft.com/office/word/2006/wordml" xmlns:wps="http://schemas.microsoft.com/office/word/2010/wordprocessingShape" mc:Ignorable="w14 w15 w16se w16cid w16 w16cex w16sdtdh w16sdtfl w16du wp14">
   <w:background w:color="FFFFFF"/>
   <w:body>
     <w:p>
@@ -15,14 +15,14 @@
         </w:pBdr>
         <w:spacing w:before="0" w:after="0" w:line="276" w:lineRule="auto"/>
         <w:rPr>
-          <w:rFonts w:ascii="Trebuchet MS" w:hAnsi="Trebuchet MS" w:eastAsia="Trebuchet MS" w:cs="Trebuchet MS"/>
+          <w:rFonts w:ascii="Trebuchet MS" w:eastAsia="Trebuchet MS" w:hAnsi="Trebuchet MS" w:cs="Trebuchet MS"/>
           <w:sz w:val="20"/>
           <w:szCs w:val="20"/>
         </w:rPr>
       </w:pPr>
       <w:r>
         <w:rPr>
-          <w:rFonts w:ascii="Trebuchet MS" w:hAnsi="Trebuchet MS" w:eastAsia="Trebuchet MS" w:cs="Trebuchet MS"/>
+          <w:rFonts w:ascii="Trebuchet MS" w:eastAsia="Trebuchet MS" w:hAnsi="Trebuchet MS" w:cs="Trebuchet MS"/>
           <w:sz w:val="20"/>
           <w:szCs w:val="20"/>
         </w:rPr>
@@ -30,7 +30,7 @@
       </w:r>
       <w:r>
         <w:rPr>
-          <w:rFonts w:ascii="Trebuchet MS" w:hAnsi="Trebuchet MS" w:eastAsia="Trebuchet MS" w:cs="Trebuchet MS"/>
+          <w:rFonts w:ascii="Trebuchet MS" w:eastAsia="Trebuchet MS" w:hAnsi="Trebuchet MS" w:cs="Trebuchet MS"/>
           <w:sz w:val="20"/>
           <w:szCs w:val="20"/>
         </w:rPr>
@@ -38,7 +38,7 @@
       </w:r>
       <w:r>
         <w:rPr>
-          <w:rFonts w:ascii="Trebuchet MS" w:hAnsi="Trebuchet MS" w:eastAsia="Trebuchet MS" w:cs="Trebuchet MS"/>
+          <w:rFonts w:ascii="Trebuchet MS" w:eastAsia="Trebuchet MS" w:hAnsi="Trebuchet MS" w:cs="Trebuchet MS"/>
           <w:sz w:val="20"/>
           <w:szCs w:val="20"/>
         </w:rPr>
@@ -46,7 +46,7 @@
       </w:r>
       <w:r>
         <w:rPr>
-          <w:rFonts w:ascii="Trebuchet MS" w:hAnsi="Trebuchet MS" w:eastAsia="Trebuchet MS" w:cs="Trebuchet MS"/>
+          <w:rFonts w:ascii="Trebuchet MS" w:eastAsia="Trebuchet MS" w:hAnsi="Trebuchet MS" w:cs="Trebuchet MS"/>
           <w:sz w:val="20"/>
           <w:szCs w:val="20"/>
         </w:rPr>
@@ -54,7 +54,7 @@
       </w:r>
       <w:r>
         <w:rPr>
-          <w:rFonts w:ascii="Trebuchet MS" w:hAnsi="Trebuchet MS" w:eastAsia="Trebuchet MS" w:cs="Trebuchet MS"/>
+          <w:rFonts w:ascii="Trebuchet MS" w:eastAsia="Trebuchet MS" w:hAnsi="Trebuchet MS" w:cs="Trebuchet MS"/>
           <w:sz w:val="20"/>
           <w:szCs w:val="20"/>
         </w:rPr>
@@ -62,7 +62,7 @@
       </w:r>
       <w:r>
         <w:rPr>
-          <w:rFonts w:ascii="Trebuchet MS" w:hAnsi="Trebuchet MS" w:eastAsia="Trebuchet MS" w:cs="Trebuchet MS"/>
+          <w:rFonts w:ascii="Trebuchet MS" w:eastAsia="Trebuchet MS" w:hAnsi="Trebuchet MS" w:cs="Trebuchet MS"/>
           <w:sz w:val="20"/>
           <w:szCs w:val="20"/>
         </w:rPr>
@@ -70,7 +70,7 @@
       </w:r>
       <w:r>
         <w:rPr>
-          <w:rFonts w:ascii="Trebuchet MS" w:hAnsi="Trebuchet MS" w:eastAsia="Trebuchet MS" w:cs="Trebuchet MS"/>
+          <w:rFonts w:ascii="Trebuchet MS" w:eastAsia="Trebuchet MS" w:hAnsi="Trebuchet MS" w:cs="Trebuchet MS"/>
           <w:sz w:val="20"/>
           <w:szCs w:val="20"/>
         </w:rPr>
@@ -90,7 +90,7 @@
         <w:spacing w:before="0" w:after="0" w:line="276" w:lineRule="auto"/>
         <w:jc w:val="left"/>
         <w:rPr>
-          <w:rFonts w:ascii="Trebuchet MS" w:hAnsi="Trebuchet MS" w:eastAsia="Trebuchet MS" w:cs="Trebuchet MS"/>
+          <w:rFonts w:ascii="Trebuchet MS" w:eastAsia="Trebuchet MS" w:hAnsi="Trebuchet MS" w:cs="Trebuchet MS"/>
           <w:sz w:val="20"/>
           <w:szCs w:val="20"/>
         </w:rPr>
@@ -108,14 +108,14 @@
         </w:pBdr>
         <w:spacing w:before="0" w:after="0" w:line="276" w:lineRule="auto"/>
         <w:rPr>
-          <w:rFonts w:ascii="Trebuchet MS" w:hAnsi="Trebuchet MS" w:eastAsia="Trebuchet MS" w:cs="Trebuchet MS"/>
+          <w:rFonts w:ascii="Trebuchet MS" w:eastAsia="Trebuchet MS" w:hAnsi="Trebuchet MS" w:cs="Trebuchet MS"/>
           <w:sz w:val="20"/>
           <w:szCs w:val="20"/>
         </w:rPr>
       </w:pPr>
       <w:r>
         <w:rPr>
-          <w:rFonts w:ascii="Trebuchet MS" w:hAnsi="Trebuchet MS" w:eastAsia="Trebuchet MS" w:cs="Trebuchet MS"/>
+          <w:rFonts w:ascii="Trebuchet MS" w:eastAsia="Trebuchet MS" w:hAnsi="Trebuchet MS" w:cs="Trebuchet MS"/>
           <w:sz w:val="20"/>
           <w:szCs w:val="20"/>
         </w:rPr>
@@ -127,7 +127,7 @@
         <w:pStyle w:val="Normal15"/>
         <w:spacing w:before="0" w:after="0" w:line="276" w:lineRule="auto"/>
         <w:rPr>
-          <w:rFonts w:ascii="Trebuchet MS" w:hAnsi="Trebuchet MS" w:eastAsia="Trebuchet MS" w:cs="Trebuchet MS"/>
+          <w:rFonts w:ascii="Trebuchet MS" w:eastAsia="Trebuchet MS" w:hAnsi="Trebuchet MS" w:cs="Trebuchet MS"/>
           <w:sz w:val="20"/>
           <w:szCs w:val="20"/>
         </w:rPr>
@@ -145,7 +145,7 @@
         </w:pBdr>
         <w:spacing w:before="0" w:after="0" w:line="276" w:lineRule="auto"/>
         <w:rPr>
-          <w:rFonts w:ascii="Trebuchet MS" w:hAnsi="Trebuchet MS" w:eastAsia="Trebuchet MS" w:cs="Trebuchet MS"/>
+          <w:rFonts w:ascii="Trebuchet MS" w:eastAsia="Trebuchet MS" w:hAnsi="Trebuchet MS" w:cs="Trebuchet MS"/>
           <w:b/>
           <w:bCs/>
           <w:sz w:val="20"/>
@@ -154,7 +154,7 @@
       </w:pPr>
       <w:r>
         <w:rPr>
-          <w:rFonts w:ascii="Trebuchet MS" w:hAnsi="Trebuchet MS" w:eastAsia="Trebuchet MS" w:cs="Trebuchet MS"/>
+          <w:rFonts w:ascii="Trebuchet MS" w:eastAsia="Trebuchet MS" w:hAnsi="Trebuchet MS" w:cs="Trebuchet MS"/>
           <w:sz w:val="20"/>
           <w:szCs w:val="20"/>
         </w:rPr>
@@ -162,7 +162,7 @@
       </w:r>
       <w:r>
         <w:rPr>
-          <w:rFonts w:ascii="Trebuchet MS" w:hAnsi="Trebuchet MS" w:eastAsia="Trebuchet MS" w:cs="Trebuchet MS"/>
+          <w:rFonts w:ascii="Trebuchet MS" w:eastAsia="Trebuchet MS" w:hAnsi="Trebuchet MS" w:cs="Trebuchet MS"/>
           <w:b/>
           <w:bCs/>
           <w:sz w:val="20"/>
@@ -172,7 +172,7 @@
       </w:r>
       <w:r>
         <w:rPr>
-          <w:rFonts w:ascii="Trebuchet MS" w:hAnsi="Trebuchet MS" w:eastAsia="Trebuchet MS" w:cs="Trebuchet MS"/>
+          <w:rFonts w:ascii="Trebuchet MS" w:eastAsia="Trebuchet MS" w:hAnsi="Trebuchet MS" w:cs="Trebuchet MS"/>
           <w:b/>
           <w:bCs/>
           <w:sz w:val="20"/>
@@ -193,14 +193,14 @@
         </w:pBdr>
         <w:spacing w:before="0" w:after="0" w:line="276" w:lineRule="auto"/>
         <w:rPr>
-          <w:rFonts w:ascii="Trebuchet MS" w:hAnsi="Trebuchet MS" w:eastAsia="Trebuchet MS" w:cs="Trebuchet MS"/>
+          <w:rFonts w:ascii="Trebuchet MS" w:eastAsia="Trebuchet MS" w:hAnsi="Trebuchet MS" w:cs="Trebuchet MS"/>
           <w:sz w:val="20"/>
           <w:szCs w:val="20"/>
         </w:rPr>
       </w:pPr>
       <w:r>
         <w:rPr>
-          <w:rFonts w:ascii="Trebuchet MS" w:hAnsi="Trebuchet MS" w:eastAsia="Trebuchet MS" w:cs="Trebuchet MS"/>
+          <w:rFonts w:ascii="Trebuchet MS" w:eastAsia="Trebuchet MS" w:hAnsi="Trebuchet MS" w:cs="Trebuchet MS"/>
           <w:sz w:val="20"/>
           <w:szCs w:val="20"/>
         </w:rPr>
@@ -219,7 +219,7 @@
         </w:pBdr>
         <w:spacing w:before="0" w:after="0" w:line="276" w:lineRule="auto"/>
         <w:rPr>
-          <w:rFonts w:ascii="Trebuchet MS" w:hAnsi="Trebuchet MS" w:eastAsia="Trebuchet MS" w:cs="Trebuchet MS"/>
+          <w:rFonts w:ascii="Trebuchet MS" w:eastAsia="Trebuchet MS" w:hAnsi="Trebuchet MS" w:cs="Trebuchet MS"/>
           <w:sz w:val="20"/>
           <w:szCs w:val="20"/>
         </w:rPr>
@@ -238,7 +238,7 @@
         <w:spacing w:before="0" w:after="0" w:line="276" w:lineRule="auto"/>
         <w:jc w:val="left"/>
         <w:rPr>
-          <w:rFonts w:ascii="Trebuchet MS" w:hAnsi="Trebuchet MS" w:eastAsia="Trebuchet MS" w:cs="Trebuchet MS"/>
+          <w:rFonts w:ascii="Trebuchet MS" w:eastAsia="Trebuchet MS" w:hAnsi="Trebuchet MS" w:cs="Trebuchet MS"/>
           <w:sz w:val="20"/>
           <w:szCs w:val="20"/>
         </w:rPr>
@@ -256,14 +256,14 @@
         </w:pBdr>
         <w:spacing w:before="0" w:after="0" w:line="276" w:lineRule="auto"/>
         <w:rPr>
-          <w:rFonts w:ascii="Trebuchet MS" w:hAnsi="Trebuchet MS" w:eastAsia="Trebuchet MS" w:cs="Trebuchet MS"/>
+          <w:rFonts w:ascii="Trebuchet MS" w:eastAsia="Trebuchet MS" w:hAnsi="Trebuchet MS" w:cs="Trebuchet MS"/>
           <w:sz w:val="20"/>
           <w:szCs w:val="20"/>
         </w:rPr>
       </w:pPr>
       <w:r>
         <w:rPr>
-          <w:rFonts w:ascii="Trebuchet MS" w:hAnsi="Trebuchet MS" w:eastAsia="Trebuchet MS" w:cs="Trebuchet MS"/>
+          <w:rFonts w:ascii="Trebuchet MS" w:eastAsia="Trebuchet MS" w:hAnsi="Trebuchet MS" w:cs="Trebuchet MS"/>
           <w:b/>
           <w:sz w:val="20"/>
           <w:szCs w:val="20"/>
@@ -272,7 +272,7 @@
       </w:r>
       <w:r>
         <w:rPr>
-          <w:rFonts w:ascii="Trebuchet MS" w:hAnsi="Trebuchet MS" w:eastAsia="Trebuchet MS" w:cs="Trebuchet MS"/>
+          <w:rFonts w:ascii="Trebuchet MS" w:eastAsia="Trebuchet MS" w:hAnsi="Trebuchet MS" w:cs="Trebuchet MS"/>
           <w:sz w:val="20"/>
           <w:szCs w:val="20"/>
         </w:rPr>
@@ -292,98 +292,11 @@
         <w:spacing w:before="0" w:after="0" w:line="276" w:lineRule="auto"/>
         <w:jc w:val="left"/>
         <w:rPr>
-          <w:rFonts w:ascii="Trebuchet MS" w:hAnsi="Trebuchet MS" w:eastAsia="Trebuchet MS" w:cs="Trebuchet MS"/>
-          <w:sz w:val="20"/>
-          <w:szCs w:val="20"/>
-        </w:rPr>
-      </w:pPr>
-    </w:p>
-    <w:p>
-      <w:pPr>
-        <w:pStyle w:val="Normal15"/>
-        <w:pBdr>
-          <w:top w:val="nil" w:color="FF000000" w:sz="0" w:space="0"/>
-          <w:left w:val="nil" w:color="FF000000" w:sz="0" w:space="0"/>
-          <w:bottom w:val="nil" w:color="FF000000" w:sz="0" w:space="0"/>
-          <w:right w:val="nil" w:color="FF000000" w:sz="0" w:space="0"/>
-          <w:between w:val="nil" w:color="FF000000" w:sz="0" w:space="0"/>
-        </w:pBdr>
-        <w:spacing w:before="0" w:after="0" w:line="276" w:lineRule="auto"/>
-        <w:rPr>
-          <w:sz w:val="20"/>
-          <w:szCs w:val="20"/>
-        </w:rPr>
-      </w:pPr>
-      <w:r>
-        <w:rPr>
-          <w:sz w:val="20"/>
-          <w:szCs w:val="20"/>
-        </w:rPr>
-        <w:t xml:space="preserve">Grupo de pruebas </w:t>
-      </w:r>
-      <w:r>
-        <w:rPr>
-          <w:sz w:val="20"/>
-          <w:szCs w:val="20"/>
-        </w:rPr>
-        <w:t>1</w:t>
-      </w:r>
-      <w:r>
-        <w:rPr>
-          <w:sz w:val="20"/>
-          <w:szCs w:val="20"/>
-        </w:rPr>
-        <w:t xml:space="preserve"> Certifica que sobre el proyecto basado en el aplicativo </w:t>
-      </w:r>
-      <w:r>
-        <w:rPr>
-          <w:sz w:val="20"/>
-          <w:szCs w:val="20"/>
-        </w:rPr>
-        <w:t>TimeAndDate.com</w:t>
-      </w:r>
-      <w:r>
-        <w:rPr>
-          <w:sz w:val="20"/>
-          <w:szCs w:val="20"/>
-        </w:rPr>
-        <w:t xml:space="preserve"> </w:t>
-      </w:r>
-      <w:r>
-        <w:rPr>
-          <w:sz w:val="20"/>
-          <w:szCs w:val="20"/>
-        </w:rPr>
-        <w:t xml:space="preserve">se realizó revisión de flujos y servicios, y pruebas funcionales cumpliendo con los requisitos especificados por el cliente, La versión certificada del producto es la correspondiente al sprint </w:t>
-      </w:r>
-      <w:r>
-        <w:rPr>
-          <w:sz w:val="20"/>
-          <w:szCs w:val="20"/>
-        </w:rPr>
-        <w:t>1</w:t>
-      </w:r>
-      <w:r>
-        <w:rPr>
-          <w:sz w:val="20"/>
-          <w:szCs w:val="20"/>
-        </w:rPr>
-        <w:t xml:space="preserve"> del 202</w:t>
-      </w:r>
-      <w:r>
-        <w:rPr>
-          <w:sz w:val="20"/>
-          <w:szCs w:val="20"/>
-        </w:rPr>
-        <w:t>6</w:t>
-      </w:r>
-      <w:r>
-        <w:rPr>
-          <w:sz w:val="20"/>
-          <w:szCs w:val="20"/>
-        </w:rPr>
-        <w:t>.</w:t>
-      </w:r>
+          <w:rFonts w:ascii="Trebuchet MS" w:eastAsia="Trebuchet MS" w:hAnsi="Trebuchet MS" w:cs="Trebuchet MS"/>
+          <w:sz w:val="20"/>
+          <w:szCs w:val="20"/>
+        </w:rPr>
+      </w:pPr>
     </w:p>
     <w:p>
       <w:pPr>
@@ -401,6 +314,76 @@
           <w:szCs w:val="20"/>
         </w:rPr>
       </w:pPr>
+      <w:r>
+        <w:rPr>
+          <w:sz w:val="20"/>
+          <w:szCs w:val="20"/>
+        </w:rPr>
+        <w:t xml:space="preserve">Grupo de pruebas </w:t>
+      </w:r>
+      <w:r>
+        <w:rPr>
+          <w:sz w:val="20"/>
+          <w:szCs w:val="20"/>
+        </w:rPr>
+        <w:t>1</w:t>
+      </w:r>
+      <w:r>
+        <w:rPr>
+          <w:sz w:val="20"/>
+          <w:szCs w:val="20"/>
+        </w:rPr>
+        <w:t xml:space="preserve"> Certifica que sobre el proyecto basado en el aplicativo </w:t>
+      </w:r>
+      <w:r>
+        <w:rPr>
+          <w:sz w:val="20"/>
+          <w:szCs w:val="20"/>
+        </w:rPr>
+        <w:t>TimeAndDate.com</w:t>
+      </w:r>
+      <w:r>
+        <w:rPr>
+          <w:sz w:val="20"/>
+          <w:szCs w:val="20"/>
+        </w:rPr>
+        <w:t xml:space="preserve"> </w:t>
+      </w:r>
+      <w:r>
+        <w:rPr>
+          <w:sz w:val="20"/>
+          <w:szCs w:val="20"/>
+        </w:rPr>
+        <w:t xml:space="preserve">se realizó revisión de flujos y servicios, y pruebas funcionales cumpliendo con los requisitos especificados por el cliente, La versión certificada del producto es la correspondiente al sprint </w:t>
+      </w:r>
+      <w:r>
+        <w:rPr>
+          <w:sz w:val="20"/>
+          <w:szCs w:val="20"/>
+        </w:rPr>
+        <w:t>1</w:t>
+      </w:r>
+      <w:r>
+        <w:rPr>
+          <w:sz w:val="20"/>
+          <w:szCs w:val="20"/>
+        </w:rPr>
+        <w:t xml:space="preserve"> del 202</w:t>
+      </w:r>
+      <w:r>
+        <w:rPr>
+          <w:sz w:val="20"/>
+          <w:szCs w:val="20"/>
+        </w:rPr>
+        <w:t>6</w:t>
+      </w:r>
+      <w:r>
+        <w:rPr>
+          <w:sz w:val="20"/>
+          <w:szCs w:val="20"/>
+        </w:rPr>
+        <w:t>.</w:t>
+      </w:r>
     </w:p>
     <w:p>
       <w:pPr>
@@ -418,6 +401,23 @@
           <w:szCs w:val="20"/>
         </w:rPr>
       </w:pPr>
+    </w:p>
+    <w:p>
+      <w:pPr>
+        <w:pStyle w:val="Normal15"/>
+        <w:pBdr>
+          <w:top w:val="nil"/>
+          <w:left w:val="nil"/>
+          <w:bottom w:val="nil"/>
+          <w:right w:val="nil"/>
+          <w:between w:val="nil"/>
+        </w:pBdr>
+        <w:spacing w:before="0" w:after="0" w:line="276" w:lineRule="auto"/>
+        <w:rPr>
+          <w:sz w:val="20"/>
+          <w:szCs w:val="20"/>
+        </w:rPr>
+      </w:pPr>
       <w:r>
         <w:rPr>
           <w:sz w:val="20"/>
@@ -436,7 +436,7 @@
         </w:rPr>
       </w:pPr>
     </w:p>
-    <w:bookmarkStart w:name="_Hlk103867856" w:id="0"/>
+    <w:bookmarkStart w:id="0" w:name="_Hlk103867856"/>
     <w:bookmarkEnd w:id="0"/>
     <w:p>
       <w:pPr>
@@ -511,7 +511,7 @@
           <w:sz w:val="20"/>
           <w:szCs w:val="20"/>
         </w:rPr>
-        <w:t>- P-1.1/ P-1.3 incorrecto</w:t>
+        <w:t>- P-1.1 / P-1.3 / I-1.1 / I-1.2 incorrecto</w:t>
       </w:r>
     </w:p>
     <w:p>
@@ -534,7 +534,7 @@
           <w:szCs w:val="20"/>
         </w:rPr>
       </w:pPr>
-      <w:hyperlink w:tgtFrame="_blank" w:history="1" r:id="rId11">
+      <w:hyperlink r:id="rId11" w:tgtFrame="_blank" w:history="1">
         <w:r>
           <w:rPr>
             <w:sz w:val="20"/>
@@ -578,7 +578,7 @@
           <w:szCs w:val="20"/>
         </w:rPr>
       </w:pPr>
-      <w:hyperlink w:tgtFrame="_blank" w:history="1" r:id="rId12">
+      <w:hyperlink r:id="rId12" w:tgtFrame="_blank" w:history="1">
         <w:r>
           <w:rPr>
             <w:sz w:val="20"/>
@@ -622,7 +622,7 @@
           <w:szCs w:val="20"/>
         </w:rPr>
       </w:pPr>
-      <w:hyperlink w:tgtFrame="_blank" w:history="1" r:id="rId13">
+      <w:hyperlink r:id="rId13" w:tgtFrame="_blank" w:history="1">
         <w:r>
           <w:rPr>
             <w:sz w:val="20"/>
@@ -666,7 +666,7 @@
           <w:szCs w:val="20"/>
         </w:rPr>
       </w:pPr>
-      <w:hyperlink w:tgtFrame="_blank" w:history="1" r:id="rId14">
+      <w:hyperlink r:id="rId14" w:tgtFrame="_blank" w:history="1">
         <w:r>
           <w:rPr>
             <w:sz w:val="20"/>
@@ -710,7 +710,7 @@
           <w:szCs w:val="20"/>
         </w:rPr>
       </w:pPr>
-      <w:hyperlink w:tgtFrame="_blank" w:history="1" r:id="rId15">
+      <w:hyperlink r:id="rId15" w:tgtFrame="_blank" w:history="1">
         <w:r>
           <w:rPr>
             <w:sz w:val="20"/>
@@ -725,6 +725,13 @@
           <w:szCs w:val="20"/>
         </w:rPr>
         <w:t>  </w:t>
+      </w:r>
+      <w:r>
+        <w:rPr>
+          <w:sz w:val="20"/>
+          <w:szCs w:val="20"/>
+        </w:rPr>
+        <w:t>- I-6.1 incorrecto</w:t>
       </w:r>
     </w:p>
     <w:p>
@@ -747,7 +754,7 @@
           <w:szCs w:val="20"/>
         </w:rPr>
       </w:pPr>
-      <w:hyperlink w:tgtFrame="_blank" w:history="1" r:id="rId16">
+      <w:hyperlink r:id="rId16" w:tgtFrame="_blank" w:history="1">
         <w:r>
           <w:rPr>
             <w:sz w:val="20"/>
@@ -761,7 +768,7 @@
           <w:sz w:val="20"/>
           <w:szCs w:val="20"/>
         </w:rPr>
-        <w:t>  </w:t>
+        <w:t xml:space="preserve"> </w:t>
       </w:r>
     </w:p>
     <w:p>
@@ -784,7 +791,7 @@
           <w:szCs w:val="20"/>
         </w:rPr>
       </w:pPr>
-      <w:hyperlink w:tgtFrame="_blank" w:history="1" r:id="rId17">
+      <w:hyperlink r:id="rId17" w:tgtFrame="_blank" w:history="1">
         <w:r>
           <w:rPr>
             <w:sz w:val="20"/>
@@ -806,6 +813,13 @@
           <w:szCs w:val="20"/>
         </w:rPr>
         <w:t>- P-8.4</w:t>
+      </w:r>
+      <w:r>
+        <w:rPr>
+          <w:sz w:val="20"/>
+          <w:szCs w:val="20"/>
+        </w:rPr>
+        <w:t xml:space="preserve"> incorrecto</w:t>
       </w:r>
     </w:p>
     <w:p>
@@ -828,7 +842,7 @@
           <w:szCs w:val="20"/>
         </w:rPr>
       </w:pPr>
-      <w:hyperlink w:tgtFrame="_blank" w:history="1" r:id="rId18">
+      <w:hyperlink r:id="rId18" w:tgtFrame="_blank" w:history="1">
         <w:r>
           <w:rPr>
             <w:sz w:val="20"/>
@@ -842,7 +856,7 @@
           <w:sz w:val="20"/>
           <w:szCs w:val="20"/>
         </w:rPr>
-        <w:t>  </w:t>
+        <w:t xml:space="preserve"> </w:t>
       </w:r>
     </w:p>
     <w:p>
@@ -865,7 +879,7 @@
           <w:szCs w:val="20"/>
         </w:rPr>
       </w:pPr>
-      <w:hyperlink w:tgtFrame="_blank" w:history="1" r:id="rId19">
+      <w:hyperlink r:id="rId19" w:tgtFrame="_blank" w:history="1">
         <w:r>
           <w:rPr>
             <w:sz w:val="20"/>
@@ -874,13 +888,6 @@
           <w:t>HU-10 Conocer e interactuar con la empresa</w:t>
         </w:r>
       </w:hyperlink>
-      <w:r>
-        <w:rPr>
-          <w:sz w:val="20"/>
-          <w:szCs w:val="20"/>
-        </w:rPr>
-        <w:t>  </w:t>
-      </w:r>
     </w:p>
     <w:p>
       <w:pPr>
@@ -902,7 +909,7 @@
           <w:szCs w:val="20"/>
         </w:rPr>
       </w:pPr>
-      <w:hyperlink w:tgtFrame="_blank" w:history="1" r:id="rId20">
+      <w:hyperlink r:id="rId20" w:tgtFrame="_blank" w:history="1">
         <w:r>
           <w:rPr>
             <w:sz w:val="20"/>
@@ -916,7 +923,7 @@
           <w:sz w:val="20"/>
           <w:szCs w:val="20"/>
         </w:rPr>
-        <w:t>  </w:t>
+        <w:t xml:space="preserve"> </w:t>
       </w:r>
     </w:p>
     <w:p>
@@ -939,7 +946,7 @@
           <w:szCs w:val="20"/>
         </w:rPr>
       </w:pPr>
-      <w:hyperlink w:tgtFrame="_blank" w:history="1" r:id="rId21">
+      <w:hyperlink r:id="rId21" w:tgtFrame="_blank" w:history="1">
         <w:r>
           <w:rPr>
             <w:sz w:val="20"/>
@@ -948,13 +955,6 @@
           <w:t>HU-12 Ver página traducida</w:t>
         </w:r>
       </w:hyperlink>
-      <w:r>
-        <w:rPr>
-          <w:sz w:val="20"/>
-          <w:szCs w:val="20"/>
-        </w:rPr>
-        <w:t>  </w:t>
-      </w:r>
     </w:p>
     <w:p>
       <w:pPr>
@@ -976,7 +976,7 @@
           <w:szCs w:val="20"/>
         </w:rPr>
       </w:pPr>
-      <w:hyperlink w:tgtFrame="_blank" w:history="1" r:id="rId22">
+      <w:hyperlink r:id="rId22" w:tgtFrame="_blank" w:history="1">
         <w:r>
           <w:rPr>
             <w:sz w:val="20"/>
@@ -991,6 +991,20 @@
           <w:szCs w:val="20"/>
         </w:rPr>
         <w:t>  </w:t>
+      </w:r>
+      <w:r>
+        <w:rPr>
+          <w:sz w:val="20"/>
+          <w:szCs w:val="20"/>
+        </w:rPr>
+        <w:t xml:space="preserve">- </w:t>
+      </w:r>
+      <w:r>
+        <w:rPr>
+          <w:sz w:val="20"/>
+          <w:szCs w:val="20"/>
+        </w:rPr>
+        <w:t>E-4.1 incorrecto</w:t>
       </w:r>
     </w:p>
     <w:p>
@@ -1013,7 +1027,7 @@
           <w:szCs w:val="20"/>
         </w:rPr>
       </w:pPr>
-      <w:hyperlink w:tgtFrame="_blank" w:history="1" r:id="rId23">
+      <w:hyperlink r:id="rId23" w:tgtFrame="_blank" w:history="1">
         <w:r>
           <w:rPr>
             <w:sz w:val="20"/>
@@ -1023,11 +1037,14 @@
         </w:r>
       </w:hyperlink>
       <w:r>
-        <w:rPr>
-          <w:sz w:val="20"/>
-          <w:szCs w:val="20"/>
-        </w:rPr>
-        <w:t>  </w:t>
+        <w:t xml:space="preserve"> </w:t>
+      </w:r>
+      <w:r>
+        <w:rPr>
+          <w:sz w:val="20"/>
+          <w:szCs w:val="20"/>
+        </w:rPr>
+        <w:t>- E-4.1 incorrecto</w:t>
       </w:r>
     </w:p>
     <w:p>
@@ -1050,7 +1067,7 @@
           <w:szCs w:val="20"/>
         </w:rPr>
       </w:pPr>
-      <w:hyperlink w:tgtFrame="_blank" w:history="1" r:id="rId24">
+      <w:hyperlink r:id="rId24" w:tgtFrame="_blank" w:history="1">
         <w:r>
           <w:rPr>
             <w:sz w:val="20"/>
@@ -1064,7 +1081,7 @@
           <w:sz w:val="20"/>
           <w:szCs w:val="20"/>
         </w:rPr>
-        <w:t>  </w:t>
+        <w:t xml:space="preserve"> </w:t>
       </w:r>
     </w:p>
     <w:p>
@@ -1087,7 +1104,7 @@
           <w:szCs w:val="20"/>
         </w:rPr>
       </w:pPr>
-      <w:hyperlink w:tgtFrame="_blank" w:history="1" r:id="rId25">
+      <w:hyperlink r:id="rId25" w:tgtFrame="_blank" w:history="1">
         <w:r>
           <w:rPr>
             <w:sz w:val="20"/>
@@ -1169,7 +1186,7 @@
         </w:pBdr>
         <w:spacing w:before="0" w:after="0" w:line="276" w:lineRule="auto"/>
         <w:rPr>
-          <w:rFonts w:ascii="Trebuchet MS" w:hAnsi="Trebuchet MS" w:eastAsia="Trebuchet MS" w:cs="Trebuchet MS"/>
+          <w:rFonts w:ascii="Trebuchet MS" w:eastAsia="Trebuchet MS" w:hAnsi="Trebuchet MS" w:cs="Trebuchet MS"/>
           <w:sz w:val="20"/>
           <w:szCs w:val="20"/>
         </w:rPr>
@@ -1187,14 +1204,14 @@
         </w:pBdr>
         <w:spacing w:before="0" w:after="0" w:line="276" w:lineRule="auto"/>
         <w:rPr>
-          <w:rFonts w:ascii="Trebuchet MS" w:hAnsi="Trebuchet MS" w:eastAsia="Trebuchet MS" w:cs="Trebuchet MS"/>
+          <w:rFonts w:ascii="Trebuchet MS" w:eastAsia="Trebuchet MS" w:hAnsi="Trebuchet MS" w:cs="Trebuchet MS"/>
           <w:sz w:val="20"/>
           <w:szCs w:val="20"/>
         </w:rPr>
       </w:pPr>
       <w:r>
         <w:rPr>
-          <w:rFonts w:ascii="Trebuchet MS" w:hAnsi="Trebuchet MS" w:eastAsia="Trebuchet MS" w:cs="Trebuchet MS"/>
+          <w:rFonts w:ascii="Trebuchet MS" w:eastAsia="Trebuchet MS" w:hAnsi="Trebuchet MS" w:cs="Trebuchet MS"/>
           <w:sz w:val="20"/>
           <w:szCs w:val="20"/>
         </w:rPr>
@@ -1213,7 +1230,7 @@
         </w:pBdr>
         <w:spacing w:before="0" w:after="0" w:line="276" w:lineRule="auto"/>
         <w:rPr>
-          <w:rFonts w:ascii="Trebuchet MS" w:hAnsi="Trebuchet MS" w:eastAsia="Trebuchet MS" w:cs="Trebuchet MS"/>
+          <w:rFonts w:ascii="Trebuchet MS" w:eastAsia="Trebuchet MS" w:hAnsi="Trebuchet MS" w:cs="Trebuchet MS"/>
           <w:sz w:val="20"/>
           <w:szCs w:val="20"/>
         </w:rPr>
@@ -1231,7 +1248,7 @@
         </w:pBdr>
         <w:spacing w:before="0" w:after="0" w:line="276" w:lineRule="auto"/>
         <w:rPr>
-          <w:rFonts w:ascii="Trebuchet MS" w:hAnsi="Trebuchet MS" w:eastAsia="Trebuchet MS" w:cs="Trebuchet MS"/>
+          <w:rFonts w:ascii="Trebuchet MS" w:eastAsia="Trebuchet MS" w:hAnsi="Trebuchet MS" w:cs="Trebuchet MS"/>
           <w:sz w:val="20"/>
           <w:szCs w:val="20"/>
         </w:rPr>
@@ -1249,7 +1266,7 @@
         </w:pBdr>
         <w:spacing w:before="0" w:after="0" w:line="276" w:lineRule="auto"/>
         <w:rPr>
-          <w:rFonts w:ascii="Trebuchet MS" w:hAnsi="Trebuchet MS" w:eastAsia="Trebuchet MS" w:cs="Trebuchet MS"/>
+          <w:rFonts w:ascii="Trebuchet MS" w:eastAsia="Trebuchet MS" w:hAnsi="Trebuchet MS" w:cs="Trebuchet MS"/>
           <w:sz w:val="20"/>
           <w:szCs w:val="20"/>
         </w:rPr>
@@ -1320,14 +1337,14 @@
         </w:pBdr>
         <w:spacing w:before="0" w:after="0" w:line="276" w:lineRule="auto"/>
         <w:rPr>
-          <w:rFonts w:ascii="Trebuchet MS" w:hAnsi="Trebuchet MS" w:eastAsia="Trebuchet MS" w:cs="Trebuchet MS"/>
+          <w:rFonts w:ascii="Trebuchet MS" w:eastAsia="Trebuchet MS" w:hAnsi="Trebuchet MS" w:cs="Trebuchet MS"/>
           <w:sz w:val="20"/>
           <w:szCs w:val="20"/>
         </w:rPr>
       </w:pPr>
       <w:r>
         <w:rPr>
-          <w:rFonts w:ascii="Trebuchet MS" w:hAnsi="Trebuchet MS" w:eastAsia="Trebuchet MS" w:cs="Trebuchet MS"/>
+          <w:rFonts w:ascii="Trebuchet MS" w:eastAsia="Trebuchet MS" w:hAnsi="Trebuchet MS" w:cs="Trebuchet MS"/>
           <w:sz w:val="20"/>
           <w:szCs w:val="20"/>
         </w:rPr>
@@ -1346,14 +1363,14 @@
         </w:pBdr>
         <w:spacing w:before="0" w:after="0" w:line="276" w:lineRule="auto"/>
         <w:rPr>
-          <w:rFonts w:ascii="Trebuchet MS" w:hAnsi="Trebuchet MS" w:eastAsia="Trebuchet MS" w:cs="Trebuchet MS"/>
+          <w:rFonts w:ascii="Trebuchet MS" w:eastAsia="Trebuchet MS" w:hAnsi="Trebuchet MS" w:cs="Trebuchet MS"/>
           <w:sz w:val="20"/>
           <w:szCs w:val="20"/>
         </w:rPr>
       </w:pPr>
       <w:r>
         <w:rPr>
-          <w:rFonts w:ascii="Trebuchet MS" w:hAnsi="Trebuchet MS" w:eastAsia="Trebuchet MS" w:cs="Trebuchet MS"/>
+          <w:rFonts w:ascii="Trebuchet MS" w:eastAsia="Trebuchet MS" w:hAnsi="Trebuchet MS" w:cs="Trebuchet MS"/>
           <w:sz w:val="20"/>
           <w:szCs w:val="20"/>
         </w:rPr>
@@ -1372,14 +1389,14 @@
         </w:pBdr>
         <w:spacing w:before="0" w:after="0" w:line="276" w:lineRule="auto"/>
         <w:rPr>
-          <w:rFonts w:ascii="Trebuchet MS" w:hAnsi="Trebuchet MS" w:eastAsia="Trebuchet MS" w:cs="Trebuchet MS"/>
+          <w:rFonts w:ascii="Trebuchet MS" w:eastAsia="Trebuchet MS" w:hAnsi="Trebuchet MS" w:cs="Trebuchet MS"/>
           <w:sz w:val="20"/>
           <w:szCs w:val="20"/>
         </w:rPr>
       </w:pPr>
       <w:r>
         <w:rPr>
-          <w:rFonts w:ascii="Trebuchet MS" w:hAnsi="Trebuchet MS" w:eastAsia="Trebuchet MS" w:cs="Trebuchet MS"/>
+          <w:rFonts w:ascii="Trebuchet MS" w:eastAsia="Trebuchet MS" w:hAnsi="Trebuchet MS" w:cs="Trebuchet MS"/>
           <w:sz w:val="20"/>
           <w:szCs w:val="20"/>
         </w:rPr>
@@ -1398,14 +1415,14 @@
         </w:pBdr>
         <w:spacing w:before="0" w:after="0" w:line="276" w:lineRule="auto"/>
         <w:rPr>
-          <w:rFonts w:ascii="Trebuchet MS" w:hAnsi="Trebuchet MS" w:eastAsia="Trebuchet MS" w:cs="Trebuchet MS"/>
+          <w:rFonts w:ascii="Trebuchet MS" w:eastAsia="Trebuchet MS" w:hAnsi="Trebuchet MS" w:cs="Trebuchet MS"/>
           <w:sz w:val="20"/>
           <w:szCs w:val="20"/>
         </w:rPr>
       </w:pPr>
       <w:r>
         <w:rPr>
-          <w:rFonts w:ascii="Trebuchet MS" w:hAnsi="Trebuchet MS" w:eastAsia="Trebuchet MS" w:cs="Trebuchet MS"/>
+          <w:rFonts w:ascii="Trebuchet MS" w:eastAsia="Trebuchet MS" w:hAnsi="Trebuchet MS" w:cs="Trebuchet MS"/>
           <w:sz w:val="20"/>
           <w:szCs w:val="20"/>
         </w:rPr>
@@ -1415,7 +1432,7 @@
     <w:sectPr>
       <w:headerReference w:type="default" r:id="rId27"/>
       <w:footerReference w:type="default" r:id="rId28"/>
-      <w:pgSz w:w="12240" w:h="15840" w:orient="portrait"/>
+      <w:pgSz w:w="12240" w:h="15840"/>
       <w:pgMar w:top="0" w:right="1140" w:bottom="0" w:left="1700" w:header="566" w:footer="566" w:gutter="0"/>
       <w:pgNumType w:start="1"/>
       <w:cols w:space="720"/>
@@ -1476,7 +1493,7 @@
       </w:tabs>
       <w:jc w:val="right"/>
       <w:rPr>
-        <w:rFonts w:ascii="Trebuchet MS" w:hAnsi="Trebuchet MS" w:eastAsia="Trebuchet MS" w:cs="Trebuchet MS"/>
+        <w:rFonts w:ascii="Trebuchet MS" w:eastAsia="Trebuchet MS" w:hAnsi="Trebuchet MS" w:cs="Trebuchet MS"/>
         <w:color w:val="000000"/>
         <w:sz w:val="20"/>
         <w:szCs w:val="20"/>
@@ -1484,7 +1501,7 @@
     </w:pPr>
     <w:r>
       <w:rPr>
-        <w:rFonts w:ascii="Trebuchet MS" w:hAnsi="Trebuchet MS" w:eastAsia="Trebuchet MS" w:cs="Trebuchet MS"/>
+        <w:rFonts w:ascii="Trebuchet MS" w:eastAsia="Trebuchet MS" w:hAnsi="Trebuchet MS" w:cs="Trebuchet MS"/>
         <w:sz w:val="20"/>
         <w:szCs w:val="20"/>
       </w:rPr>
@@ -1492,7 +1509,7 @@
     </w:r>
     <w:r>
       <w:rPr>
-        <w:rFonts w:ascii="Trebuchet MS" w:hAnsi="Trebuchet MS" w:eastAsia="Trebuchet MS" w:cs="Trebuchet MS"/>
+        <w:rFonts w:ascii="Trebuchet MS" w:eastAsia="Trebuchet MS" w:hAnsi="Trebuchet MS" w:cs="Trebuchet MS"/>
         <w:sz w:val="20"/>
         <w:szCs w:val="20"/>
       </w:rPr>
@@ -1500,7 +1517,7 @@
     </w:r>
     <w:r>
       <w:rPr>
-        <w:rFonts w:ascii="Trebuchet MS" w:hAnsi="Trebuchet MS" w:eastAsia="Trebuchet MS" w:cs="Trebuchet MS"/>
+        <w:rFonts w:ascii="Trebuchet MS" w:eastAsia="Trebuchet MS" w:hAnsi="Trebuchet MS" w:cs="Trebuchet MS"/>
         <w:sz w:val="20"/>
         <w:szCs w:val="20"/>
       </w:rPr>
@@ -1508,7 +1525,7 @@
     </w:r>
     <w:r>
       <w:rPr>
-        <w:rFonts w:ascii="Trebuchet MS" w:hAnsi="Trebuchet MS" w:eastAsia="Trebuchet MS" w:cs="Trebuchet MS"/>
+        <w:rFonts w:ascii="Trebuchet MS" w:eastAsia="Trebuchet MS" w:hAnsi="Trebuchet MS" w:cs="Trebuchet MS"/>
         <w:sz w:val="20"/>
         <w:szCs w:val="20"/>
       </w:rPr>
@@ -1516,7 +1533,7 @@
     </w:r>
     <w:r>
       <w:rPr>
-        <w:rFonts w:ascii="Muli" w:hAnsi="Muli" w:eastAsia="Muli" w:cs="Muli"/>
+        <w:rFonts w:ascii="Muli" w:eastAsia="Muli" w:hAnsi="Muli" w:cs="Muli"/>
         <w:color w:val="666666"/>
         <w:sz w:val="18"/>
         <w:szCs w:val="18"/>
@@ -1525,7 +1542,7 @@
     </w:r>
     <w:r>
       <w:rPr>
-        <w:rFonts w:ascii="Muli" w:hAnsi="Muli" w:eastAsia="Muli" w:cs="Muli"/>
+        <w:rFonts w:ascii="Muli" w:eastAsia="Muli" w:hAnsi="Muli" w:cs="Muli"/>
         <w:noProof/>
         <w:color w:val="666666"/>
         <w:sz w:val="18"/>
@@ -1535,7 +1552,7 @@
     </w:r>
     <w:r>
       <w:rPr>
-        <w:rFonts w:ascii="Muli" w:hAnsi="Muli" w:eastAsia="Muli" w:cs="Muli"/>
+        <w:rFonts w:ascii="Muli" w:eastAsia="Muli" w:hAnsi="Muli" w:cs="Muli"/>
         <w:color w:val="666666"/>
         <w:sz w:val="18"/>
         <w:szCs w:val="18"/>
@@ -1544,7 +1561,7 @@
     </w:r>
     <w:r>
       <w:rPr>
-        <w:rFonts w:ascii="Muli" w:hAnsi="Muli" w:eastAsia="Muli" w:cs="Muli"/>
+        <w:rFonts w:ascii="Muli" w:eastAsia="Muli" w:hAnsi="Muli" w:cs="Muli"/>
         <w:color w:val="666666"/>
         <w:sz w:val="18"/>
         <w:szCs w:val="18"/>
@@ -1553,7 +1570,7 @@
     </w:r>
     <w:r>
       <w:rPr>
-        <w:rFonts w:ascii="Muli" w:hAnsi="Muli" w:eastAsia="Muli" w:cs="Muli"/>
+        <w:rFonts w:ascii="Muli" w:eastAsia="Muli" w:hAnsi="Muli" w:cs="Muli"/>
         <w:noProof/>
         <w:color w:val="666666"/>
         <w:sz w:val="18"/>
@@ -1563,7 +1580,7 @@
     </w:r>
     <w:r>
       <w:rPr>
-        <w:rFonts w:ascii="Muli" w:hAnsi="Muli" w:eastAsia="Muli" w:cs="Muli"/>
+        <w:rFonts w:ascii="Muli" w:eastAsia="Muli" w:hAnsi="Muli" w:cs="Muli"/>
         <w:noProof/>
         <w:color w:val="666666"/>
         <w:sz w:val="18"/>
@@ -1573,7 +1590,7 @@
     </w:r>
     <w:r>
       <w:rPr>
-        <w:rFonts w:ascii="Muli" w:hAnsi="Muli" w:eastAsia="Muli" w:cs="Muli"/>
+        <w:rFonts w:ascii="Muli" w:eastAsia="Muli" w:hAnsi="Muli" w:cs="Muli"/>
         <w:color w:val="666666"/>
         <w:sz w:val="18"/>
         <w:szCs w:val="18"/>
@@ -1582,7 +1599,7 @@
     </w:r>
     <w:r>
       <w:rPr>
-        <w:rFonts w:ascii="Muli" w:hAnsi="Muli" w:eastAsia="Muli" w:cs="Muli"/>
+        <w:rFonts w:ascii="Muli" w:eastAsia="Muli" w:hAnsi="Muli" w:cs="Muli"/>
         <w:noProof/>
         <w:color w:val="666666"/>
         <w:sz w:val="18"/>
@@ -1592,7 +1609,7 @@
     </w:r>
     <w:r>
       <w:rPr>
-        <w:rFonts w:ascii="Muli" w:hAnsi="Muli" w:eastAsia="Muli" w:cs="Muli"/>
+        <w:rFonts w:ascii="Muli" w:eastAsia="Muli" w:hAnsi="Muli" w:cs="Muli"/>
         <w:color w:val="666666"/>
         <w:sz w:val="18"/>
         <w:szCs w:val="18"/>
@@ -1601,7 +1618,7 @@
     </w:r>
     <w:r>
       <w:rPr>
-        <w:rFonts w:ascii="Muli" w:hAnsi="Muli" w:eastAsia="Muli" w:cs="Muli"/>
+        <w:rFonts w:ascii="Muli" w:eastAsia="Muli" w:hAnsi="Muli" w:cs="Muli"/>
         <w:color w:val="666666"/>
         <w:sz w:val="18"/>
         <w:szCs w:val="18"/>
@@ -1610,7 +1627,7 @@
     </w:r>
     <w:r>
       <w:rPr>
-        <w:rFonts w:ascii="Muli" w:hAnsi="Muli" w:eastAsia="Muli" w:cs="Muli"/>
+        <w:rFonts w:ascii="Muli" w:eastAsia="Muli" w:hAnsi="Muli" w:cs="Muli"/>
         <w:noProof/>
         <w:color w:val="666666"/>
         <w:sz w:val="18"/>
@@ -1620,7 +1637,7 @@
     </w:r>
     <w:r>
       <w:rPr>
-        <w:rFonts w:ascii="Muli" w:hAnsi="Muli" w:eastAsia="Muli" w:cs="Muli"/>
+        <w:rFonts w:ascii="Muli" w:eastAsia="Muli" w:hAnsi="Muli" w:cs="Muli"/>
         <w:noProof/>
         <w:color w:val="666666"/>
         <w:sz w:val="18"/>
@@ -1630,7 +1647,7 @@
     </w:r>
     <w:r>
       <w:rPr>
-        <w:rFonts w:ascii="Trebuchet MS" w:hAnsi="Trebuchet MS" w:eastAsia="Trebuchet MS" w:cs="Trebuchet MS"/>
+        <w:rFonts w:ascii="Trebuchet MS" w:eastAsia="Trebuchet MS" w:hAnsi="Trebuchet MS" w:cs="Trebuchet MS"/>
         <w:sz w:val="20"/>
         <w:szCs w:val="20"/>
       </w:rPr>
@@ -1638,13 +1655,13 @@
     </w:r>
     <w:r>
       <w:rPr>
-        <w:rFonts w:ascii="Calibri" w:hAnsi="Calibri" w:eastAsia="Calibri" w:cs="Calibri"/>
+        <w:rFonts w:ascii="Calibri" w:eastAsia="Calibri" w:hAnsi="Calibri" w:cs="Calibri"/>
       </w:rPr>
       <w:t xml:space="preserve">                                        </w:t>
     </w:r>
     <w:r>
       <w:rPr>
-        <w:rFonts w:ascii="Open Sans" w:hAnsi="Open Sans" w:eastAsia="Open Sans" w:cs="Open Sans"/>
+        <w:rFonts w:ascii="Open Sans" w:eastAsia="Open Sans" w:hAnsi="Open Sans" w:cs="Open Sans"/>
         <w:color w:val="666666"/>
         <w:sz w:val="16"/>
         <w:szCs w:val="16"/>
@@ -1653,7 +1670,7 @@
     </w:r>
     <w:r>
       <w:rPr>
-        <w:rFonts w:ascii="Quicksand" w:hAnsi="Quicksand" w:eastAsia="Quicksand" w:cs="Quicksand"/>
+        <w:rFonts w:ascii="Quicksand" w:eastAsia="Quicksand" w:hAnsi="Quicksand" w:cs="Quicksand"/>
         <w:b/>
         <w:bCs/>
         <w:color w:val="666666"/>
@@ -1732,7 +1749,7 @@
         <w:ind w:left="720" w:hanging="360"/>
       </w:pPr>
       <w:rPr>
-        <w:rFonts w:hint="default" w:ascii="Symbol" w:hAnsi="Symbol"/>
+        <w:rFonts w:ascii="Symbol" w:hAnsi="Symbol" w:hint="default"/>
         <w:sz w:val="20"/>
       </w:rPr>
     </w:lvl>
@@ -1748,7 +1765,7 @@
         <w:ind w:left="1440" w:hanging="360"/>
       </w:pPr>
       <w:rPr>
-        <w:rFonts w:hint="default" w:ascii="Symbol" w:hAnsi="Symbol"/>
+        <w:rFonts w:ascii="Symbol" w:hAnsi="Symbol" w:hint="default"/>
         <w:sz w:val="20"/>
       </w:rPr>
     </w:lvl>
@@ -1764,7 +1781,7 @@
         <w:ind w:left="2160" w:hanging="360"/>
       </w:pPr>
       <w:rPr>
-        <w:rFonts w:hint="default" w:ascii="Symbol" w:hAnsi="Symbol"/>
+        <w:rFonts w:ascii="Symbol" w:hAnsi="Symbol" w:hint="default"/>
         <w:sz w:val="20"/>
       </w:rPr>
     </w:lvl>
@@ -1780,7 +1797,7 @@
         <w:ind w:left="2880" w:hanging="360"/>
       </w:pPr>
       <w:rPr>
-        <w:rFonts w:hint="default" w:ascii="Symbol" w:hAnsi="Symbol"/>
+        <w:rFonts w:ascii="Symbol" w:hAnsi="Symbol" w:hint="default"/>
         <w:sz w:val="20"/>
       </w:rPr>
     </w:lvl>
@@ -1796,7 +1813,7 @@
         <w:ind w:left="3600" w:hanging="360"/>
       </w:pPr>
       <w:rPr>
-        <w:rFonts w:hint="default" w:ascii="Symbol" w:hAnsi="Symbol"/>
+        <w:rFonts w:ascii="Symbol" w:hAnsi="Symbol" w:hint="default"/>
         <w:sz w:val="20"/>
       </w:rPr>
     </w:lvl>
@@ -1812,7 +1829,7 @@
         <w:ind w:left="4320" w:hanging="360"/>
       </w:pPr>
       <w:rPr>
-        <w:rFonts w:hint="default" w:ascii="Symbol" w:hAnsi="Symbol"/>
+        <w:rFonts w:ascii="Symbol" w:hAnsi="Symbol" w:hint="default"/>
         <w:sz w:val="20"/>
       </w:rPr>
     </w:lvl>
@@ -1828,7 +1845,7 @@
         <w:ind w:left="5040" w:hanging="360"/>
       </w:pPr>
       <w:rPr>
-        <w:rFonts w:hint="default" w:ascii="Symbol" w:hAnsi="Symbol"/>
+        <w:rFonts w:ascii="Symbol" w:hAnsi="Symbol" w:hint="default"/>
         <w:sz w:val="20"/>
       </w:rPr>
     </w:lvl>
@@ -1844,7 +1861,7 @@
         <w:ind w:left="5760" w:hanging="360"/>
       </w:pPr>
       <w:rPr>
-        <w:rFonts w:hint="default" w:ascii="Symbol" w:hAnsi="Symbol"/>
+        <w:rFonts w:ascii="Symbol" w:hAnsi="Symbol" w:hint="default"/>
         <w:sz w:val="20"/>
       </w:rPr>
     </w:lvl>
@@ -1860,7 +1877,7 @@
         <w:ind w:left="6480" w:hanging="360"/>
       </w:pPr>
       <w:rPr>
-        <w:rFonts w:hint="default" w:ascii="Symbol" w:hAnsi="Symbol"/>
+        <w:rFonts w:ascii="Symbol" w:hAnsi="Symbol" w:hint="default"/>
         <w:sz w:val="20"/>
       </w:rPr>
     </w:lvl>
@@ -1878,7 +1895,7 @@
         <w:ind w:left="720" w:hanging="360"/>
       </w:pPr>
       <w:rPr>
-        <w:rFonts w:hint="default" w:ascii="Symbol" w:hAnsi="Symbol"/>
+        <w:rFonts w:ascii="Symbol" w:hAnsi="Symbol" w:hint="default"/>
       </w:rPr>
     </w:lvl>
     <w:lvl w:ilvl="1" w:tplc="240A0003" w:tentative="1">
@@ -1890,7 +1907,7 @@
         <w:ind w:left="1440" w:hanging="360"/>
       </w:pPr>
       <w:rPr>
-        <w:rFonts w:hint="default" w:ascii="Courier New" w:hAnsi="Courier New" w:cs="Courier New"/>
+        <w:rFonts w:ascii="Courier New" w:hAnsi="Courier New" w:cs="Courier New" w:hint="default"/>
       </w:rPr>
     </w:lvl>
     <w:lvl w:ilvl="2" w:tplc="240A0005" w:tentative="1">
@@ -1902,7 +1919,7 @@
         <w:ind w:left="2160" w:hanging="360"/>
       </w:pPr>
       <w:rPr>
-        <w:rFonts w:hint="default" w:ascii="Wingdings" w:hAnsi="Wingdings"/>
+        <w:rFonts w:ascii="Wingdings" w:hAnsi="Wingdings" w:hint="default"/>
       </w:rPr>
     </w:lvl>
     <w:lvl w:ilvl="3" w:tplc="240A0001" w:tentative="1">
@@ -1914,7 +1931,7 @@
         <w:ind w:left="2880" w:hanging="360"/>
       </w:pPr>
       <w:rPr>
-        <w:rFonts w:hint="default" w:ascii="Symbol" w:hAnsi="Symbol"/>
+        <w:rFonts w:ascii="Symbol" w:hAnsi="Symbol" w:hint="default"/>
       </w:rPr>
     </w:lvl>
     <w:lvl w:ilvl="4" w:tplc="240A0003" w:tentative="1">
@@ -1926,7 +1943,7 @@
         <w:ind w:left="3600" w:hanging="360"/>
       </w:pPr>
       <w:rPr>
-        <w:rFonts w:hint="default" w:ascii="Courier New" w:hAnsi="Courier New" w:cs="Courier New"/>
+        <w:rFonts w:ascii="Courier New" w:hAnsi="Courier New" w:cs="Courier New" w:hint="default"/>
       </w:rPr>
     </w:lvl>
     <w:lvl w:ilvl="5" w:tplc="240A0005" w:tentative="1">
@@ -1938,7 +1955,7 @@
         <w:ind w:left="4320" w:hanging="360"/>
       </w:pPr>
       <w:rPr>
-        <w:rFonts w:hint="default" w:ascii="Wingdings" w:hAnsi="Wingdings"/>
+        <w:rFonts w:ascii="Wingdings" w:hAnsi="Wingdings" w:hint="default"/>
       </w:rPr>
     </w:lvl>
     <w:lvl w:ilvl="6" w:tplc="240A0001" w:tentative="1">
@@ -1950,7 +1967,7 @@
         <w:ind w:left="5040" w:hanging="360"/>
       </w:pPr>
       <w:rPr>
-        <w:rFonts w:hint="default" w:ascii="Symbol" w:hAnsi="Symbol"/>
+        <w:rFonts w:ascii="Symbol" w:hAnsi="Symbol" w:hint="default"/>
       </w:rPr>
     </w:lvl>
     <w:lvl w:ilvl="7" w:tplc="240A0003" w:tentative="1">
@@ -1962,7 +1979,7 @@
         <w:ind w:left="5760" w:hanging="360"/>
       </w:pPr>
       <w:rPr>
-        <w:rFonts w:hint="default" w:ascii="Courier New" w:hAnsi="Courier New" w:cs="Courier New"/>
+        <w:rFonts w:ascii="Courier New" w:hAnsi="Courier New" w:cs="Courier New" w:hint="default"/>
       </w:rPr>
     </w:lvl>
     <w:lvl w:ilvl="8" w:tplc="240A0005" w:tentative="1">
@@ -1974,7 +1991,7 @@
         <w:ind w:left="6480" w:hanging="360"/>
       </w:pPr>
       <w:rPr>
-        <w:rFonts w:hint="default" w:ascii="Wingdings" w:hAnsi="Wingdings"/>
+        <w:rFonts w:ascii="Wingdings" w:hAnsi="Wingdings" w:hint="default"/>
       </w:rPr>
     </w:lvl>
   </w:abstractNum>
@@ -1994,7 +2011,7 @@
         <w:ind w:left="720" w:hanging="360"/>
       </w:pPr>
       <w:rPr>
-        <w:rFonts w:hint="default" w:ascii="Symbol" w:hAnsi="Symbol"/>
+        <w:rFonts w:ascii="Symbol" w:hAnsi="Symbol" w:hint="default"/>
         <w:sz w:val="20"/>
       </w:rPr>
     </w:lvl>
@@ -2010,7 +2027,7 @@
         <w:ind w:left="1440" w:hanging="360"/>
       </w:pPr>
       <w:rPr>
-        <w:rFonts w:hint="default" w:ascii="Symbol" w:hAnsi="Symbol"/>
+        <w:rFonts w:ascii="Symbol" w:hAnsi="Symbol" w:hint="default"/>
         <w:sz w:val="20"/>
       </w:rPr>
     </w:lvl>
@@ -2026,7 +2043,7 @@
         <w:ind w:left="2160" w:hanging="360"/>
       </w:pPr>
       <w:rPr>
-        <w:rFonts w:hint="default" w:ascii="Symbol" w:hAnsi="Symbol"/>
+        <w:rFonts w:ascii="Symbol" w:hAnsi="Symbol" w:hint="default"/>
         <w:sz w:val="20"/>
       </w:rPr>
     </w:lvl>
@@ -2042,7 +2059,7 @@
         <w:ind w:left="2880" w:hanging="360"/>
       </w:pPr>
       <w:rPr>
-        <w:rFonts w:hint="default" w:ascii="Symbol" w:hAnsi="Symbol"/>
+        <w:rFonts w:ascii="Symbol" w:hAnsi="Symbol" w:hint="default"/>
         <w:sz w:val="20"/>
       </w:rPr>
     </w:lvl>
@@ -2058,7 +2075,7 @@
         <w:ind w:left="3600" w:hanging="360"/>
       </w:pPr>
       <w:rPr>
-        <w:rFonts w:hint="default" w:ascii="Symbol" w:hAnsi="Symbol"/>
+        <w:rFonts w:ascii="Symbol" w:hAnsi="Symbol" w:hint="default"/>
         <w:sz w:val="20"/>
       </w:rPr>
     </w:lvl>
@@ -2074,7 +2091,7 @@
         <w:ind w:left="4320" w:hanging="360"/>
       </w:pPr>
       <w:rPr>
-        <w:rFonts w:hint="default" w:ascii="Symbol" w:hAnsi="Symbol"/>
+        <w:rFonts w:ascii="Symbol" w:hAnsi="Symbol" w:hint="default"/>
         <w:sz w:val="20"/>
       </w:rPr>
     </w:lvl>
@@ -2090,7 +2107,7 @@
         <w:ind w:left="5040" w:hanging="360"/>
       </w:pPr>
       <w:rPr>
-        <w:rFonts w:hint="default" w:ascii="Symbol" w:hAnsi="Symbol"/>
+        <w:rFonts w:ascii="Symbol" w:hAnsi="Symbol" w:hint="default"/>
         <w:sz w:val="20"/>
       </w:rPr>
     </w:lvl>
@@ -2106,7 +2123,7 @@
         <w:ind w:left="5760" w:hanging="360"/>
       </w:pPr>
       <w:rPr>
-        <w:rFonts w:hint="default" w:ascii="Symbol" w:hAnsi="Symbol"/>
+        <w:rFonts w:ascii="Symbol" w:hAnsi="Symbol" w:hint="default"/>
         <w:sz w:val="20"/>
       </w:rPr>
     </w:lvl>
@@ -2122,7 +2139,7 @@
         <w:ind w:left="6480" w:hanging="360"/>
       </w:pPr>
       <w:rPr>
-        <w:rFonts w:hint="default" w:ascii="Symbol" w:hAnsi="Symbol"/>
+        <w:rFonts w:ascii="Symbol" w:hAnsi="Symbol" w:hint="default"/>
         <w:sz w:val="20"/>
       </w:rPr>
     </w:lvl>
@@ -2140,7 +2157,7 @@
         <w:ind w:left="720" w:hanging="360"/>
       </w:pPr>
       <w:rPr>
-        <w:rFonts w:hint="default" w:ascii="Symbol" w:hAnsi="Symbol"/>
+        <w:rFonts w:ascii="Symbol" w:hAnsi="Symbol" w:hint="default"/>
         <w:u w:val="none"/>
       </w:rPr>
     </w:lvl>
@@ -2257,7 +2274,7 @@
         <w:ind w:left="720" w:hanging="360"/>
       </w:pPr>
       <w:rPr>
-        <w:rFonts w:hint="default" w:ascii="Symbol" w:hAnsi="Symbol"/>
+        <w:rFonts w:ascii="Symbol" w:hAnsi="Symbol" w:hint="default"/>
         <w:sz w:val="20"/>
       </w:rPr>
     </w:lvl>
@@ -2273,7 +2290,7 @@
         <w:ind w:left="1440" w:hanging="360"/>
       </w:pPr>
       <w:rPr>
-        <w:rFonts w:hint="default" w:ascii="Symbol" w:hAnsi="Symbol"/>
+        <w:rFonts w:ascii="Symbol" w:hAnsi="Symbol" w:hint="default"/>
         <w:sz w:val="20"/>
       </w:rPr>
     </w:lvl>
@@ -2289,7 +2306,7 @@
         <w:ind w:left="2160" w:hanging="360"/>
       </w:pPr>
       <w:rPr>
-        <w:rFonts w:hint="default" w:ascii="Symbol" w:hAnsi="Symbol"/>
+        <w:rFonts w:ascii="Symbol" w:hAnsi="Symbol" w:hint="default"/>
         <w:sz w:val="20"/>
       </w:rPr>
     </w:lvl>
@@ -2305,7 +2322,7 @@
         <w:ind w:left="2880" w:hanging="360"/>
       </w:pPr>
       <w:rPr>
-        <w:rFonts w:hint="default" w:ascii="Symbol" w:hAnsi="Symbol"/>
+        <w:rFonts w:ascii="Symbol" w:hAnsi="Symbol" w:hint="default"/>
         <w:sz w:val="20"/>
       </w:rPr>
     </w:lvl>
@@ -2321,7 +2338,7 @@
         <w:ind w:left="3600" w:hanging="360"/>
       </w:pPr>
       <w:rPr>
-        <w:rFonts w:hint="default" w:ascii="Symbol" w:hAnsi="Symbol"/>
+        <w:rFonts w:ascii="Symbol" w:hAnsi="Symbol" w:hint="default"/>
         <w:sz w:val="20"/>
       </w:rPr>
     </w:lvl>
@@ -2337,7 +2354,7 @@
         <w:ind w:left="4320" w:hanging="360"/>
       </w:pPr>
       <w:rPr>
-        <w:rFonts w:hint="default" w:ascii="Symbol" w:hAnsi="Symbol"/>
+        <w:rFonts w:ascii="Symbol" w:hAnsi="Symbol" w:hint="default"/>
         <w:sz w:val="20"/>
       </w:rPr>
     </w:lvl>
@@ -2353,7 +2370,7 @@
         <w:ind w:left="5040" w:hanging="360"/>
       </w:pPr>
       <w:rPr>
-        <w:rFonts w:hint="default" w:ascii="Symbol" w:hAnsi="Symbol"/>
+        <w:rFonts w:ascii="Symbol" w:hAnsi="Symbol" w:hint="default"/>
         <w:sz w:val="20"/>
       </w:rPr>
     </w:lvl>
@@ -2369,7 +2386,7 @@
         <w:ind w:left="5760" w:hanging="360"/>
       </w:pPr>
       <w:rPr>
-        <w:rFonts w:hint="default" w:ascii="Symbol" w:hAnsi="Symbol"/>
+        <w:rFonts w:ascii="Symbol" w:hAnsi="Symbol" w:hint="default"/>
         <w:sz w:val="20"/>
       </w:rPr>
     </w:lvl>
@@ -2385,7 +2402,7 @@
         <w:ind w:left="6480" w:hanging="360"/>
       </w:pPr>
       <w:rPr>
-        <w:rFonts w:hint="default" w:ascii="Symbol" w:hAnsi="Symbol"/>
+        <w:rFonts w:ascii="Symbol" w:hAnsi="Symbol" w:hint="default"/>
         <w:sz w:val="20"/>
       </w:rPr>
     </w:lvl>
@@ -2406,7 +2423,7 @@
         <w:ind w:left="720" w:hanging="360"/>
       </w:pPr>
       <w:rPr>
-        <w:rFonts w:hint="default" w:ascii="Symbol" w:hAnsi="Symbol"/>
+        <w:rFonts w:ascii="Symbol" w:hAnsi="Symbol" w:hint="default"/>
         <w:sz w:val="20"/>
       </w:rPr>
     </w:lvl>
@@ -2422,7 +2439,7 @@
         <w:ind w:left="1440" w:hanging="360"/>
       </w:pPr>
       <w:rPr>
-        <w:rFonts w:hint="default" w:ascii="Symbol" w:hAnsi="Symbol"/>
+        <w:rFonts w:ascii="Symbol" w:hAnsi="Symbol" w:hint="default"/>
         <w:sz w:val="20"/>
       </w:rPr>
     </w:lvl>
@@ -2438,7 +2455,7 @@
         <w:ind w:left="2160" w:hanging="360"/>
       </w:pPr>
       <w:rPr>
-        <w:rFonts w:hint="default" w:ascii="Symbol" w:hAnsi="Symbol"/>
+        <w:rFonts w:ascii="Symbol" w:hAnsi="Symbol" w:hint="default"/>
         <w:sz w:val="20"/>
       </w:rPr>
     </w:lvl>
@@ -2454,7 +2471,7 @@
         <w:ind w:left="2880" w:hanging="360"/>
       </w:pPr>
       <w:rPr>
-        <w:rFonts w:hint="default" w:ascii="Symbol" w:hAnsi="Symbol"/>
+        <w:rFonts w:ascii="Symbol" w:hAnsi="Symbol" w:hint="default"/>
         <w:sz w:val="20"/>
       </w:rPr>
     </w:lvl>
@@ -2470,7 +2487,7 @@
         <w:ind w:left="3600" w:hanging="360"/>
       </w:pPr>
       <w:rPr>
-        <w:rFonts w:hint="default" w:ascii="Symbol" w:hAnsi="Symbol"/>
+        <w:rFonts w:ascii="Symbol" w:hAnsi="Symbol" w:hint="default"/>
         <w:sz w:val="20"/>
       </w:rPr>
     </w:lvl>
@@ -2486,7 +2503,7 @@
         <w:ind w:left="4320" w:hanging="360"/>
       </w:pPr>
       <w:rPr>
-        <w:rFonts w:hint="default" w:ascii="Symbol" w:hAnsi="Symbol"/>
+        <w:rFonts w:ascii="Symbol" w:hAnsi="Symbol" w:hint="default"/>
         <w:sz w:val="20"/>
       </w:rPr>
     </w:lvl>
@@ -2502,7 +2519,7 @@
         <w:ind w:left="5040" w:hanging="360"/>
       </w:pPr>
       <w:rPr>
-        <w:rFonts w:hint="default" w:ascii="Symbol" w:hAnsi="Symbol"/>
+        <w:rFonts w:ascii="Symbol" w:hAnsi="Symbol" w:hint="default"/>
         <w:sz w:val="20"/>
       </w:rPr>
     </w:lvl>
@@ -2518,7 +2535,7 @@
         <w:ind w:left="5760" w:hanging="360"/>
       </w:pPr>
       <w:rPr>
-        <w:rFonts w:hint="default" w:ascii="Symbol" w:hAnsi="Symbol"/>
+        <w:rFonts w:ascii="Symbol" w:hAnsi="Symbol" w:hint="default"/>
         <w:sz w:val="20"/>
       </w:rPr>
     </w:lvl>
@@ -2534,7 +2551,7 @@
         <w:ind w:left="6480" w:hanging="360"/>
       </w:pPr>
       <w:rPr>
-        <w:rFonts w:hint="default" w:ascii="Symbol" w:hAnsi="Symbol"/>
+        <w:rFonts w:ascii="Symbol" w:hAnsi="Symbol" w:hint="default"/>
         <w:sz w:val="20"/>
       </w:rPr>
     </w:lvl>
@@ -2555,7 +2572,7 @@
         <w:ind w:left="720" w:hanging="360"/>
       </w:pPr>
       <w:rPr>
-        <w:rFonts w:hint="default" w:ascii="Symbol" w:hAnsi="Symbol"/>
+        <w:rFonts w:ascii="Symbol" w:hAnsi="Symbol" w:hint="default"/>
         <w:sz w:val="20"/>
       </w:rPr>
     </w:lvl>
@@ -2571,7 +2588,7 @@
         <w:ind w:left="1440" w:hanging="360"/>
       </w:pPr>
       <w:rPr>
-        <w:rFonts w:hint="default" w:ascii="Symbol" w:hAnsi="Symbol"/>
+        <w:rFonts w:ascii="Symbol" w:hAnsi="Symbol" w:hint="default"/>
         <w:sz w:val="20"/>
       </w:rPr>
     </w:lvl>
@@ -2587,7 +2604,7 @@
         <w:ind w:left="2160" w:hanging="360"/>
       </w:pPr>
       <w:rPr>
-        <w:rFonts w:hint="default" w:ascii="Symbol" w:hAnsi="Symbol"/>
+        <w:rFonts w:ascii="Symbol" w:hAnsi="Symbol" w:hint="default"/>
         <w:sz w:val="20"/>
       </w:rPr>
     </w:lvl>
@@ -2603,7 +2620,7 @@
         <w:ind w:left="2880" w:hanging="360"/>
       </w:pPr>
       <w:rPr>
-        <w:rFonts w:hint="default" w:ascii="Symbol" w:hAnsi="Symbol"/>
+        <w:rFonts w:ascii="Symbol" w:hAnsi="Symbol" w:hint="default"/>
         <w:sz w:val="20"/>
       </w:rPr>
     </w:lvl>
@@ -2619,7 +2636,7 @@
         <w:ind w:left="3600" w:hanging="360"/>
       </w:pPr>
       <w:rPr>
-        <w:rFonts w:hint="default" w:ascii="Symbol" w:hAnsi="Symbol"/>
+        <w:rFonts w:ascii="Symbol" w:hAnsi="Symbol" w:hint="default"/>
         <w:sz w:val="20"/>
       </w:rPr>
     </w:lvl>
@@ -2635,7 +2652,7 @@
         <w:ind w:left="4320" w:hanging="360"/>
       </w:pPr>
       <w:rPr>
-        <w:rFonts w:hint="default" w:ascii="Symbol" w:hAnsi="Symbol"/>
+        <w:rFonts w:ascii="Symbol" w:hAnsi="Symbol" w:hint="default"/>
         <w:sz w:val="20"/>
       </w:rPr>
     </w:lvl>
@@ -2651,7 +2668,7 @@
         <w:ind w:left="5040" w:hanging="360"/>
       </w:pPr>
       <w:rPr>
-        <w:rFonts w:hint="default" w:ascii="Symbol" w:hAnsi="Symbol"/>
+        <w:rFonts w:ascii="Symbol" w:hAnsi="Symbol" w:hint="default"/>
         <w:sz w:val="20"/>
       </w:rPr>
     </w:lvl>
@@ -2667,7 +2684,7 @@
         <w:ind w:left="5760" w:hanging="360"/>
       </w:pPr>
       <w:rPr>
-        <w:rFonts w:hint="default" w:ascii="Symbol" w:hAnsi="Symbol"/>
+        <w:rFonts w:ascii="Symbol" w:hAnsi="Symbol" w:hint="default"/>
         <w:sz w:val="20"/>
       </w:rPr>
     </w:lvl>
@@ -2683,7 +2700,7 @@
         <w:ind w:left="6480" w:hanging="360"/>
       </w:pPr>
       <w:rPr>
-        <w:rFonts w:hint="default" w:ascii="Symbol" w:hAnsi="Symbol"/>
+        <w:rFonts w:ascii="Symbol" w:hAnsi="Symbol" w:hint="default"/>
         <w:sz w:val="20"/>
       </w:rPr>
     </w:lvl>
@@ -2704,7 +2721,7 @@
         <w:ind w:left="720" w:hanging="360"/>
       </w:pPr>
       <w:rPr>
-        <w:rFonts w:hint="default" w:ascii="Symbol" w:hAnsi="Symbol"/>
+        <w:rFonts w:ascii="Symbol" w:hAnsi="Symbol" w:hint="default"/>
         <w:sz w:val="20"/>
       </w:rPr>
     </w:lvl>
@@ -2720,7 +2737,7 @@
         <w:ind w:left="1440" w:hanging="360"/>
       </w:pPr>
       <w:rPr>
-        <w:rFonts w:hint="default" w:ascii="Symbol" w:hAnsi="Symbol"/>
+        <w:rFonts w:ascii="Symbol" w:hAnsi="Symbol" w:hint="default"/>
         <w:sz w:val="20"/>
       </w:rPr>
     </w:lvl>
@@ -2736,7 +2753,7 @@
         <w:ind w:left="2160" w:hanging="360"/>
       </w:pPr>
       <w:rPr>
-        <w:rFonts w:hint="default" w:ascii="Symbol" w:hAnsi="Symbol"/>
+        <w:rFonts w:ascii="Symbol" w:hAnsi="Symbol" w:hint="default"/>
         <w:sz w:val="20"/>
       </w:rPr>
     </w:lvl>
@@ -2752,7 +2769,7 @@
         <w:ind w:left="2880" w:hanging="360"/>
       </w:pPr>
       <w:rPr>
-        <w:rFonts w:hint="default" w:ascii="Symbol" w:hAnsi="Symbol"/>
+        <w:rFonts w:ascii="Symbol" w:hAnsi="Symbol" w:hint="default"/>
         <w:sz w:val="20"/>
       </w:rPr>
     </w:lvl>
@@ -2768,7 +2785,7 @@
         <w:ind w:left="3600" w:hanging="360"/>
       </w:pPr>
       <w:rPr>
-        <w:rFonts w:hint="default" w:ascii="Symbol" w:hAnsi="Symbol"/>
+        <w:rFonts w:ascii="Symbol" w:hAnsi="Symbol" w:hint="default"/>
         <w:sz w:val="20"/>
       </w:rPr>
     </w:lvl>
@@ -2784,7 +2801,7 @@
         <w:ind w:left="4320" w:hanging="360"/>
       </w:pPr>
       <w:rPr>
-        <w:rFonts w:hint="default" w:ascii="Symbol" w:hAnsi="Symbol"/>
+        <w:rFonts w:ascii="Symbol" w:hAnsi="Symbol" w:hint="default"/>
         <w:sz w:val="20"/>
       </w:rPr>
     </w:lvl>
@@ -2800,7 +2817,7 @@
         <w:ind w:left="5040" w:hanging="360"/>
       </w:pPr>
       <w:rPr>
-        <w:rFonts w:hint="default" w:ascii="Symbol" w:hAnsi="Symbol"/>
+        <w:rFonts w:ascii="Symbol" w:hAnsi="Symbol" w:hint="default"/>
         <w:sz w:val="20"/>
       </w:rPr>
     </w:lvl>
@@ -2816,7 +2833,7 @@
         <w:ind w:left="5760" w:hanging="360"/>
       </w:pPr>
       <w:rPr>
-        <w:rFonts w:hint="default" w:ascii="Symbol" w:hAnsi="Symbol"/>
+        <w:rFonts w:ascii="Symbol" w:hAnsi="Symbol" w:hint="default"/>
         <w:sz w:val="20"/>
       </w:rPr>
     </w:lvl>
@@ -2832,7 +2849,7 @@
         <w:ind w:left="6480" w:hanging="360"/>
       </w:pPr>
       <w:rPr>
-        <w:rFonts w:hint="default" w:ascii="Symbol" w:hAnsi="Symbol"/>
+        <w:rFonts w:ascii="Symbol" w:hAnsi="Symbol" w:hint="default"/>
         <w:sz w:val="20"/>
       </w:rPr>
     </w:lvl>
@@ -2850,7 +2867,7 @@
         <w:ind w:left="720" w:hanging="360"/>
       </w:pPr>
       <w:rPr>
-        <w:rFonts w:hint="default" w:ascii="Symbol" w:hAnsi="Symbol"/>
+        <w:rFonts w:ascii="Symbol" w:hAnsi="Symbol" w:hint="default"/>
       </w:rPr>
     </w:lvl>
     <w:lvl w:ilvl="1" w:tplc="B66E252C">
@@ -2862,7 +2879,7 @@
         <w:ind w:left="1440" w:hanging="360"/>
       </w:pPr>
       <w:rPr>
-        <w:rFonts w:hint="default" w:ascii="Courier New" w:hAnsi="Courier New"/>
+        <w:rFonts w:ascii="Courier New" w:hAnsi="Courier New" w:hint="default"/>
       </w:rPr>
     </w:lvl>
     <w:lvl w:ilvl="2" w:tplc="8910AA3A">
@@ -2874,7 +2891,7 @@
         <w:ind w:left="2160" w:hanging="360"/>
       </w:pPr>
       <w:rPr>
-        <w:rFonts w:hint="default" w:ascii="Wingdings" w:hAnsi="Wingdings"/>
+        <w:rFonts w:ascii="Wingdings" w:hAnsi="Wingdings" w:hint="default"/>
       </w:rPr>
     </w:lvl>
     <w:lvl w:ilvl="3" w:tplc="008C6360">
@@ -2886,7 +2903,7 @@
         <w:ind w:left="2880" w:hanging="360"/>
       </w:pPr>
       <w:rPr>
-        <w:rFonts w:hint="default" w:ascii="Symbol" w:hAnsi="Symbol"/>
+        <w:rFonts w:ascii="Symbol" w:hAnsi="Symbol" w:hint="default"/>
       </w:rPr>
     </w:lvl>
     <w:lvl w:ilvl="4" w:tplc="F566CB9A">
@@ -2898,7 +2915,7 @@
         <w:ind w:left="3600" w:hanging="360"/>
       </w:pPr>
       <w:rPr>
-        <w:rFonts w:hint="default" w:ascii="Courier New" w:hAnsi="Courier New"/>
+        <w:rFonts w:ascii="Courier New" w:hAnsi="Courier New" w:hint="default"/>
       </w:rPr>
     </w:lvl>
     <w:lvl w:ilvl="5" w:tplc="671291E0">
@@ -2910,7 +2927,7 @@
         <w:ind w:left="4320" w:hanging="360"/>
       </w:pPr>
       <w:rPr>
-        <w:rFonts w:hint="default" w:ascii="Wingdings" w:hAnsi="Wingdings"/>
+        <w:rFonts w:ascii="Wingdings" w:hAnsi="Wingdings" w:hint="default"/>
       </w:rPr>
     </w:lvl>
     <w:lvl w:ilvl="6" w:tplc="A336B72E">
@@ -2922,7 +2939,7 @@
         <w:ind w:left="5040" w:hanging="360"/>
       </w:pPr>
       <w:rPr>
-        <w:rFonts w:hint="default" w:ascii="Symbol" w:hAnsi="Symbol"/>
+        <w:rFonts w:ascii="Symbol" w:hAnsi="Symbol" w:hint="default"/>
       </w:rPr>
     </w:lvl>
     <w:lvl w:ilvl="7" w:tplc="E82C9710">
@@ -2934,7 +2951,7 @@
         <w:ind w:left="5760" w:hanging="360"/>
       </w:pPr>
       <w:rPr>
-        <w:rFonts w:hint="default" w:ascii="Courier New" w:hAnsi="Courier New"/>
+        <w:rFonts w:ascii="Courier New" w:hAnsi="Courier New" w:hint="default"/>
       </w:rPr>
     </w:lvl>
     <w:lvl w:ilvl="8" w:tplc="EB6C3086">
@@ -2946,7 +2963,7 @@
         <w:ind w:left="6480" w:hanging="360"/>
       </w:pPr>
       <w:rPr>
-        <w:rFonts w:hint="default" w:ascii="Wingdings" w:hAnsi="Wingdings"/>
+        <w:rFonts w:ascii="Wingdings" w:hAnsi="Wingdings" w:hint="default"/>
       </w:rPr>
     </w:lvl>
   </w:abstractNum>
@@ -2963,7 +2980,7 @@
         <w:ind w:left="720" w:hanging="360"/>
       </w:pPr>
       <w:rPr>
-        <w:rFonts w:hint="default" w:ascii="Symbol" w:hAnsi="Symbol"/>
+        <w:rFonts w:ascii="Symbol" w:hAnsi="Symbol" w:hint="default"/>
       </w:rPr>
     </w:lvl>
     <w:lvl w:ilvl="1" w:tplc="8ED2B948">
@@ -2975,7 +2992,7 @@
         <w:ind w:left="1440" w:hanging="360"/>
       </w:pPr>
       <w:rPr>
-        <w:rFonts w:hint="default" w:ascii="Courier New" w:hAnsi="Courier New"/>
+        <w:rFonts w:ascii="Courier New" w:hAnsi="Courier New" w:hint="default"/>
       </w:rPr>
     </w:lvl>
     <w:lvl w:ilvl="2" w:tplc="7D9C6AA8">
@@ -2987,7 +3004,7 @@
         <w:ind w:left="2160" w:hanging="360"/>
       </w:pPr>
       <w:rPr>
-        <w:rFonts w:hint="default" w:ascii="Wingdings" w:hAnsi="Wingdings"/>
+        <w:rFonts w:ascii="Wingdings" w:hAnsi="Wingdings" w:hint="default"/>
       </w:rPr>
     </w:lvl>
     <w:lvl w:ilvl="3" w:tplc="3CA61FF2">
@@ -2999,7 +3016,7 @@
         <w:ind w:left="2880" w:hanging="360"/>
       </w:pPr>
       <w:rPr>
-        <w:rFonts w:hint="default" w:ascii="Symbol" w:hAnsi="Symbol"/>
+        <w:rFonts w:ascii="Symbol" w:hAnsi="Symbol" w:hint="default"/>
       </w:rPr>
     </w:lvl>
     <w:lvl w:ilvl="4" w:tplc="F6D88414">
@@ -3011,7 +3028,7 @@
         <w:ind w:left="3600" w:hanging="360"/>
       </w:pPr>
       <w:rPr>
-        <w:rFonts w:hint="default" w:ascii="Courier New" w:hAnsi="Courier New"/>
+        <w:rFonts w:ascii="Courier New" w:hAnsi="Courier New" w:hint="default"/>
       </w:rPr>
     </w:lvl>
     <w:lvl w:ilvl="5" w:tplc="948C6B0C">
@@ -3023,7 +3040,7 @@
         <w:ind w:left="4320" w:hanging="360"/>
       </w:pPr>
       <w:rPr>
-        <w:rFonts w:hint="default" w:ascii="Wingdings" w:hAnsi="Wingdings"/>
+        <w:rFonts w:ascii="Wingdings" w:hAnsi="Wingdings" w:hint="default"/>
       </w:rPr>
     </w:lvl>
     <w:lvl w:ilvl="6" w:tplc="09DEDF2C">
@@ -3035,7 +3052,7 @@
         <w:ind w:left="5040" w:hanging="360"/>
       </w:pPr>
       <w:rPr>
-        <w:rFonts w:hint="default" w:ascii="Symbol" w:hAnsi="Symbol"/>
+        <w:rFonts w:ascii="Symbol" w:hAnsi="Symbol" w:hint="default"/>
       </w:rPr>
     </w:lvl>
     <w:lvl w:ilvl="7" w:tplc="3572A1C4">
@@ -3047,7 +3064,7 @@
         <w:ind w:left="5760" w:hanging="360"/>
       </w:pPr>
       <w:rPr>
-        <w:rFonts w:hint="default" w:ascii="Courier New" w:hAnsi="Courier New"/>
+        <w:rFonts w:ascii="Courier New" w:hAnsi="Courier New" w:hint="default"/>
       </w:rPr>
     </w:lvl>
     <w:lvl w:ilvl="8" w:tplc="5EF66DB8">
@@ -3059,7 +3076,7 @@
         <w:ind w:left="6480" w:hanging="360"/>
       </w:pPr>
       <w:rPr>
-        <w:rFonts w:hint="default" w:ascii="Wingdings" w:hAnsi="Wingdings"/>
+        <w:rFonts w:ascii="Wingdings" w:hAnsi="Wingdings" w:hint="default"/>
       </w:rPr>
     </w:lvl>
   </w:abstractNum>
@@ -3079,7 +3096,7 @@
         <w:ind w:left="720" w:hanging="360"/>
       </w:pPr>
       <w:rPr>
-        <w:rFonts w:hint="default" w:ascii="Symbol" w:hAnsi="Symbol"/>
+        <w:rFonts w:ascii="Symbol" w:hAnsi="Symbol" w:hint="default"/>
         <w:sz w:val="20"/>
       </w:rPr>
     </w:lvl>
@@ -3095,7 +3112,7 @@
         <w:ind w:left="1440" w:hanging="360"/>
       </w:pPr>
       <w:rPr>
-        <w:rFonts w:hint="default" w:ascii="Symbol" w:hAnsi="Symbol"/>
+        <w:rFonts w:ascii="Symbol" w:hAnsi="Symbol" w:hint="default"/>
         <w:sz w:val="20"/>
       </w:rPr>
     </w:lvl>
@@ -3111,7 +3128,7 @@
         <w:ind w:left="2160" w:hanging="360"/>
       </w:pPr>
       <w:rPr>
-        <w:rFonts w:hint="default" w:ascii="Symbol" w:hAnsi="Symbol"/>
+        <w:rFonts w:ascii="Symbol" w:hAnsi="Symbol" w:hint="default"/>
         <w:sz w:val="20"/>
       </w:rPr>
     </w:lvl>
@@ -3127,7 +3144,7 @@
         <w:ind w:left="2880" w:hanging="360"/>
       </w:pPr>
       <w:rPr>
-        <w:rFonts w:hint="default" w:ascii="Symbol" w:hAnsi="Symbol"/>
+        <w:rFonts w:ascii="Symbol" w:hAnsi="Symbol" w:hint="default"/>
         <w:sz w:val="20"/>
       </w:rPr>
     </w:lvl>
@@ -3143,7 +3160,7 @@
         <w:ind w:left="3600" w:hanging="360"/>
       </w:pPr>
       <w:rPr>
-        <w:rFonts w:hint="default" w:ascii="Symbol" w:hAnsi="Symbol"/>
+        <w:rFonts w:ascii="Symbol" w:hAnsi="Symbol" w:hint="default"/>
         <w:sz w:val="20"/>
       </w:rPr>
     </w:lvl>
@@ -3159,7 +3176,7 @@
         <w:ind w:left="4320" w:hanging="360"/>
       </w:pPr>
       <w:rPr>
-        <w:rFonts w:hint="default" w:ascii="Symbol" w:hAnsi="Symbol"/>
+        <w:rFonts w:ascii="Symbol" w:hAnsi="Symbol" w:hint="default"/>
         <w:sz w:val="20"/>
       </w:rPr>
     </w:lvl>
@@ -3175,7 +3192,7 @@
         <w:ind w:left="5040" w:hanging="360"/>
       </w:pPr>
       <w:rPr>
-        <w:rFonts w:hint="default" w:ascii="Symbol" w:hAnsi="Symbol"/>
+        <w:rFonts w:ascii="Symbol" w:hAnsi="Symbol" w:hint="default"/>
         <w:sz w:val="20"/>
       </w:rPr>
     </w:lvl>
@@ -3191,7 +3208,7 @@
         <w:ind w:left="5760" w:hanging="360"/>
       </w:pPr>
       <w:rPr>
-        <w:rFonts w:hint="default" w:ascii="Symbol" w:hAnsi="Symbol"/>
+        <w:rFonts w:ascii="Symbol" w:hAnsi="Symbol" w:hint="default"/>
         <w:sz w:val="20"/>
       </w:rPr>
     </w:lvl>
@@ -3207,7 +3224,7 @@
         <w:ind w:left="6480" w:hanging="360"/>
       </w:pPr>
       <w:rPr>
-        <w:rFonts w:hint="default" w:ascii="Symbol" w:hAnsi="Symbol"/>
+        <w:rFonts w:ascii="Symbol" w:hAnsi="Symbol" w:hint="default"/>
         <w:sz w:val="20"/>
       </w:rPr>
     </w:lvl>
@@ -3228,7 +3245,7 @@
         <w:ind w:left="720" w:hanging="360"/>
       </w:pPr>
       <w:rPr>
-        <w:rFonts w:hint="default" w:ascii="Symbol" w:hAnsi="Symbol"/>
+        <w:rFonts w:ascii="Symbol" w:hAnsi="Symbol" w:hint="default"/>
         <w:sz w:val="20"/>
       </w:rPr>
     </w:lvl>
@@ -3244,7 +3261,7 @@
         <w:ind w:left="1440" w:hanging="360"/>
       </w:pPr>
       <w:rPr>
-        <w:rFonts w:hint="default" w:ascii="Symbol" w:hAnsi="Symbol"/>
+        <w:rFonts w:ascii="Symbol" w:hAnsi="Symbol" w:hint="default"/>
         <w:sz w:val="20"/>
       </w:rPr>
     </w:lvl>
@@ -3260,7 +3277,7 @@
         <w:ind w:left="2160" w:hanging="360"/>
       </w:pPr>
       <w:rPr>
-        <w:rFonts w:hint="default" w:ascii="Symbol" w:hAnsi="Symbol"/>
+        <w:rFonts w:ascii="Symbol" w:hAnsi="Symbol" w:hint="default"/>
         <w:sz w:val="20"/>
       </w:rPr>
     </w:lvl>
@@ -3276,7 +3293,7 @@
         <w:ind w:left="2880" w:hanging="360"/>
       </w:pPr>
       <w:rPr>
-        <w:rFonts w:hint="default" w:ascii="Symbol" w:hAnsi="Symbol"/>
+        <w:rFonts w:ascii="Symbol" w:hAnsi="Symbol" w:hint="default"/>
         <w:sz w:val="20"/>
       </w:rPr>
     </w:lvl>
@@ -3292,7 +3309,7 @@
         <w:ind w:left="3600" w:hanging="360"/>
       </w:pPr>
       <w:rPr>
-        <w:rFonts w:hint="default" w:ascii="Symbol" w:hAnsi="Symbol"/>
+        <w:rFonts w:ascii="Symbol" w:hAnsi="Symbol" w:hint="default"/>
         <w:sz w:val="20"/>
       </w:rPr>
     </w:lvl>
@@ -3308,7 +3325,7 @@
         <w:ind w:left="4320" w:hanging="360"/>
       </w:pPr>
       <w:rPr>
-        <w:rFonts w:hint="default" w:ascii="Symbol" w:hAnsi="Symbol"/>
+        <w:rFonts w:ascii="Symbol" w:hAnsi="Symbol" w:hint="default"/>
         <w:sz w:val="20"/>
       </w:rPr>
     </w:lvl>
@@ -3324,7 +3341,7 @@
         <w:ind w:left="5040" w:hanging="360"/>
       </w:pPr>
       <w:rPr>
-        <w:rFonts w:hint="default" w:ascii="Symbol" w:hAnsi="Symbol"/>
+        <w:rFonts w:ascii="Symbol" w:hAnsi="Symbol" w:hint="default"/>
         <w:sz w:val="20"/>
       </w:rPr>
     </w:lvl>
@@ -3340,7 +3357,7 @@
         <w:ind w:left="5760" w:hanging="360"/>
       </w:pPr>
       <w:rPr>
-        <w:rFonts w:hint="default" w:ascii="Symbol" w:hAnsi="Symbol"/>
+        <w:rFonts w:ascii="Symbol" w:hAnsi="Symbol" w:hint="default"/>
         <w:sz w:val="20"/>
       </w:rPr>
     </w:lvl>
@@ -3356,7 +3373,7 @@
         <w:ind w:left="6480" w:hanging="360"/>
       </w:pPr>
       <w:rPr>
-        <w:rFonts w:hint="default" w:ascii="Symbol" w:hAnsi="Symbol"/>
+        <w:rFonts w:ascii="Symbol" w:hAnsi="Symbol" w:hint="default"/>
         <w:sz w:val="20"/>
       </w:rPr>
     </w:lvl>
@@ -3377,7 +3394,7 @@
         <w:ind w:left="720" w:hanging="360"/>
       </w:pPr>
       <w:rPr>
-        <w:rFonts w:hint="default" w:ascii="Symbol" w:hAnsi="Symbol"/>
+        <w:rFonts w:ascii="Symbol" w:hAnsi="Symbol" w:hint="default"/>
         <w:sz w:val="20"/>
       </w:rPr>
     </w:lvl>
@@ -3393,7 +3410,7 @@
         <w:ind w:left="1440" w:hanging="360"/>
       </w:pPr>
       <w:rPr>
-        <w:rFonts w:hint="default" w:ascii="Symbol" w:hAnsi="Symbol"/>
+        <w:rFonts w:ascii="Symbol" w:hAnsi="Symbol" w:hint="default"/>
         <w:sz w:val="20"/>
       </w:rPr>
     </w:lvl>
@@ -3409,7 +3426,7 @@
         <w:ind w:left="2160" w:hanging="360"/>
       </w:pPr>
       <w:rPr>
-        <w:rFonts w:hint="default" w:ascii="Symbol" w:hAnsi="Symbol"/>
+        <w:rFonts w:ascii="Symbol" w:hAnsi="Symbol" w:hint="default"/>
         <w:sz w:val="20"/>
       </w:rPr>
     </w:lvl>
@@ -3425,7 +3442,7 @@
         <w:ind w:left="2880" w:hanging="360"/>
       </w:pPr>
       <w:rPr>
-        <w:rFonts w:hint="default" w:ascii="Symbol" w:hAnsi="Symbol"/>
+        <w:rFonts w:ascii="Symbol" w:hAnsi="Symbol" w:hint="default"/>
         <w:sz w:val="20"/>
       </w:rPr>
     </w:lvl>
@@ -3441,7 +3458,7 @@
         <w:ind w:left="3600" w:hanging="360"/>
       </w:pPr>
       <w:rPr>
-        <w:rFonts w:hint="default" w:ascii="Symbol" w:hAnsi="Symbol"/>
+        <w:rFonts w:ascii="Symbol" w:hAnsi="Symbol" w:hint="default"/>
         <w:sz w:val="20"/>
       </w:rPr>
     </w:lvl>
@@ -3457,7 +3474,7 @@
         <w:ind w:left="4320" w:hanging="360"/>
       </w:pPr>
       <w:rPr>
-        <w:rFonts w:hint="default" w:ascii="Symbol" w:hAnsi="Symbol"/>
+        <w:rFonts w:ascii="Symbol" w:hAnsi="Symbol" w:hint="default"/>
         <w:sz w:val="20"/>
       </w:rPr>
     </w:lvl>
@@ -3473,7 +3490,7 @@
         <w:ind w:left="5040" w:hanging="360"/>
       </w:pPr>
       <w:rPr>
-        <w:rFonts w:hint="default" w:ascii="Symbol" w:hAnsi="Symbol"/>
+        <w:rFonts w:ascii="Symbol" w:hAnsi="Symbol" w:hint="default"/>
         <w:sz w:val="20"/>
       </w:rPr>
     </w:lvl>
@@ -3489,7 +3506,7 @@
         <w:ind w:left="5760" w:hanging="360"/>
       </w:pPr>
       <w:rPr>
-        <w:rFonts w:hint="default" w:ascii="Symbol" w:hAnsi="Symbol"/>
+        <w:rFonts w:ascii="Symbol" w:hAnsi="Symbol" w:hint="default"/>
         <w:sz w:val="20"/>
       </w:rPr>
     </w:lvl>
@@ -3505,7 +3522,7 @@
         <w:ind w:left="6480" w:hanging="360"/>
       </w:pPr>
       <w:rPr>
-        <w:rFonts w:hint="default" w:ascii="Symbol" w:hAnsi="Symbol"/>
+        <w:rFonts w:ascii="Symbol" w:hAnsi="Symbol" w:hint="default"/>
         <w:sz w:val="20"/>
       </w:rPr>
     </w:lvl>
@@ -3526,7 +3543,7 @@
         <w:ind w:left="720" w:hanging="360"/>
       </w:pPr>
       <w:rPr>
-        <w:rFonts w:hint="default" w:ascii="Symbol" w:hAnsi="Symbol"/>
+        <w:rFonts w:ascii="Symbol" w:hAnsi="Symbol" w:hint="default"/>
         <w:sz w:val="20"/>
       </w:rPr>
     </w:lvl>
@@ -3542,7 +3559,7 @@
         <w:ind w:left="1440" w:hanging="360"/>
       </w:pPr>
       <w:rPr>
-        <w:rFonts w:hint="default" w:ascii="Symbol" w:hAnsi="Symbol"/>
+        <w:rFonts w:ascii="Symbol" w:hAnsi="Symbol" w:hint="default"/>
         <w:sz w:val="20"/>
       </w:rPr>
     </w:lvl>
@@ -3558,7 +3575,7 @@
         <w:ind w:left="2160" w:hanging="360"/>
       </w:pPr>
       <w:rPr>
-        <w:rFonts w:hint="default" w:ascii="Symbol" w:hAnsi="Symbol"/>
+        <w:rFonts w:ascii="Symbol" w:hAnsi="Symbol" w:hint="default"/>
         <w:sz w:val="20"/>
       </w:rPr>
     </w:lvl>
@@ -3574,7 +3591,7 @@
         <w:ind w:left="2880" w:hanging="360"/>
       </w:pPr>
       <w:rPr>
-        <w:rFonts w:hint="default" w:ascii="Symbol" w:hAnsi="Symbol"/>
+        <w:rFonts w:ascii="Symbol" w:hAnsi="Symbol" w:hint="default"/>
         <w:sz w:val="20"/>
       </w:rPr>
     </w:lvl>
@@ -3590,7 +3607,7 @@
         <w:ind w:left="3600" w:hanging="360"/>
       </w:pPr>
       <w:rPr>
-        <w:rFonts w:hint="default" w:ascii="Symbol" w:hAnsi="Symbol"/>
+        <w:rFonts w:ascii="Symbol" w:hAnsi="Symbol" w:hint="default"/>
         <w:sz w:val="20"/>
       </w:rPr>
     </w:lvl>
@@ -3606,7 +3623,7 @@
         <w:ind w:left="4320" w:hanging="360"/>
       </w:pPr>
       <w:rPr>
-        <w:rFonts w:hint="default" w:ascii="Symbol" w:hAnsi="Symbol"/>
+        <w:rFonts w:ascii="Symbol" w:hAnsi="Symbol" w:hint="default"/>
         <w:sz w:val="20"/>
       </w:rPr>
     </w:lvl>
@@ -3622,7 +3639,7 @@
         <w:ind w:left="5040" w:hanging="360"/>
       </w:pPr>
       <w:rPr>
-        <w:rFonts w:hint="default" w:ascii="Symbol" w:hAnsi="Symbol"/>
+        <w:rFonts w:ascii="Symbol" w:hAnsi="Symbol" w:hint="default"/>
         <w:sz w:val="20"/>
       </w:rPr>
     </w:lvl>
@@ -3638,7 +3655,7 @@
         <w:ind w:left="5760" w:hanging="360"/>
       </w:pPr>
       <w:rPr>
-        <w:rFonts w:hint="default" w:ascii="Symbol" w:hAnsi="Symbol"/>
+        <w:rFonts w:ascii="Symbol" w:hAnsi="Symbol" w:hint="default"/>
         <w:sz w:val="20"/>
       </w:rPr>
     </w:lvl>
@@ -3654,7 +3671,7 @@
         <w:ind w:left="6480" w:hanging="360"/>
       </w:pPr>
       <w:rPr>
-        <w:rFonts w:hint="default" w:ascii="Symbol" w:hAnsi="Symbol"/>
+        <w:rFonts w:ascii="Symbol" w:hAnsi="Symbol" w:hint="default"/>
         <w:sz w:val="20"/>
       </w:rPr>
     </w:lvl>
@@ -3785,7 +3802,7 @@
         <w:ind w:left="720" w:hanging="360"/>
       </w:pPr>
       <w:rPr>
-        <w:rFonts w:hint="default" w:ascii="Symbol" w:hAnsi="Symbol"/>
+        <w:rFonts w:ascii="Symbol" w:hAnsi="Symbol" w:hint="default"/>
       </w:rPr>
     </w:lvl>
     <w:lvl w:ilvl="1" w:tplc="240A0003" w:tentative="1">
@@ -3797,7 +3814,7 @@
         <w:ind w:left="1440" w:hanging="360"/>
       </w:pPr>
       <w:rPr>
-        <w:rFonts w:hint="default" w:ascii="Courier New" w:hAnsi="Courier New" w:cs="Courier New"/>
+        <w:rFonts w:ascii="Courier New" w:hAnsi="Courier New" w:cs="Courier New" w:hint="default"/>
       </w:rPr>
     </w:lvl>
     <w:lvl w:ilvl="2" w:tplc="240A0005" w:tentative="1">
@@ -3809,7 +3826,7 @@
         <w:ind w:left="2160" w:hanging="360"/>
       </w:pPr>
       <w:rPr>
-        <w:rFonts w:hint="default" w:ascii="Wingdings" w:hAnsi="Wingdings"/>
+        <w:rFonts w:ascii="Wingdings" w:hAnsi="Wingdings" w:hint="default"/>
       </w:rPr>
     </w:lvl>
     <w:lvl w:ilvl="3" w:tplc="240A0001" w:tentative="1">
@@ -3821,7 +3838,7 @@
         <w:ind w:left="2880" w:hanging="360"/>
       </w:pPr>
       <w:rPr>
-        <w:rFonts w:hint="default" w:ascii="Symbol" w:hAnsi="Symbol"/>
+        <w:rFonts w:ascii="Symbol" w:hAnsi="Symbol" w:hint="default"/>
       </w:rPr>
     </w:lvl>
     <w:lvl w:ilvl="4" w:tplc="240A0003" w:tentative="1">
@@ -3833,7 +3850,7 @@
         <w:ind w:left="3600" w:hanging="360"/>
       </w:pPr>
       <w:rPr>
-        <w:rFonts w:hint="default" w:ascii="Courier New" w:hAnsi="Courier New" w:cs="Courier New"/>
+        <w:rFonts w:ascii="Courier New" w:hAnsi="Courier New" w:cs="Courier New" w:hint="default"/>
       </w:rPr>
     </w:lvl>
     <w:lvl w:ilvl="5" w:tplc="240A0005" w:tentative="1">
@@ -3845,7 +3862,7 @@
         <w:ind w:left="4320" w:hanging="360"/>
       </w:pPr>
       <w:rPr>
-        <w:rFonts w:hint="default" w:ascii="Wingdings" w:hAnsi="Wingdings"/>
+        <w:rFonts w:ascii="Wingdings" w:hAnsi="Wingdings" w:hint="default"/>
       </w:rPr>
     </w:lvl>
     <w:lvl w:ilvl="6" w:tplc="240A0001" w:tentative="1">
@@ -3857,7 +3874,7 @@
         <w:ind w:left="5040" w:hanging="360"/>
       </w:pPr>
       <w:rPr>
-        <w:rFonts w:hint="default" w:ascii="Symbol" w:hAnsi="Symbol"/>
+        <w:rFonts w:ascii="Symbol" w:hAnsi="Symbol" w:hint="default"/>
       </w:rPr>
     </w:lvl>
     <w:lvl w:ilvl="7" w:tplc="240A0003" w:tentative="1">
@@ -3869,7 +3886,7 @@
         <w:ind w:left="5760" w:hanging="360"/>
       </w:pPr>
       <w:rPr>
-        <w:rFonts w:hint="default" w:ascii="Courier New" w:hAnsi="Courier New" w:cs="Courier New"/>
+        <w:rFonts w:ascii="Courier New" w:hAnsi="Courier New" w:cs="Courier New" w:hint="default"/>
       </w:rPr>
     </w:lvl>
     <w:lvl w:ilvl="8" w:tplc="240A0005" w:tentative="1">
@@ -3881,7 +3898,7 @@
         <w:ind w:left="6480" w:hanging="360"/>
       </w:pPr>
       <w:rPr>
-        <w:rFonts w:hint="default" w:ascii="Wingdings" w:hAnsi="Wingdings"/>
+        <w:rFonts w:ascii="Wingdings" w:hAnsi="Wingdings" w:hint="default"/>
       </w:rPr>
     </w:lvl>
   </w:abstractNum>
@@ -3901,7 +3918,7 @@
         <w:ind w:left="720" w:hanging="360"/>
       </w:pPr>
       <w:rPr>
-        <w:rFonts w:hint="default" w:ascii="Symbol" w:hAnsi="Symbol"/>
+        <w:rFonts w:ascii="Symbol" w:hAnsi="Symbol" w:hint="default"/>
         <w:sz w:val="20"/>
       </w:rPr>
     </w:lvl>
@@ -3917,7 +3934,7 @@
         <w:ind w:left="1440" w:hanging="360"/>
       </w:pPr>
       <w:rPr>
-        <w:rFonts w:hint="default" w:ascii="Symbol" w:hAnsi="Symbol"/>
+        <w:rFonts w:ascii="Symbol" w:hAnsi="Symbol" w:hint="default"/>
         <w:sz w:val="20"/>
       </w:rPr>
     </w:lvl>
@@ -3933,7 +3950,7 @@
         <w:ind w:left="2160" w:hanging="360"/>
       </w:pPr>
       <w:rPr>
-        <w:rFonts w:hint="default" w:ascii="Symbol" w:hAnsi="Symbol"/>
+        <w:rFonts w:ascii="Symbol" w:hAnsi="Symbol" w:hint="default"/>
         <w:sz w:val="20"/>
       </w:rPr>
     </w:lvl>
@@ -3949,7 +3966,7 @@
         <w:ind w:left="2880" w:hanging="360"/>
       </w:pPr>
       <w:rPr>
-        <w:rFonts w:hint="default" w:ascii="Symbol" w:hAnsi="Symbol"/>
+        <w:rFonts w:ascii="Symbol" w:hAnsi="Symbol" w:hint="default"/>
         <w:sz w:val="20"/>
       </w:rPr>
     </w:lvl>
@@ -3965,7 +3982,7 @@
         <w:ind w:left="3600" w:hanging="360"/>
       </w:pPr>
       <w:rPr>
-        <w:rFonts w:hint="default" w:ascii="Symbol" w:hAnsi="Symbol"/>
+        <w:rFonts w:ascii="Symbol" w:hAnsi="Symbol" w:hint="default"/>
         <w:sz w:val="20"/>
       </w:rPr>
     </w:lvl>
@@ -3981,7 +3998,7 @@
         <w:ind w:left="4320" w:hanging="360"/>
       </w:pPr>
       <w:rPr>
-        <w:rFonts w:hint="default" w:ascii="Symbol" w:hAnsi="Symbol"/>
+        <w:rFonts w:ascii="Symbol" w:hAnsi="Symbol" w:hint="default"/>
         <w:sz w:val="20"/>
       </w:rPr>
     </w:lvl>
@@ -3997,7 +4014,7 @@
         <w:ind w:left="5040" w:hanging="360"/>
       </w:pPr>
       <w:rPr>
-        <w:rFonts w:hint="default" w:ascii="Symbol" w:hAnsi="Symbol"/>
+        <w:rFonts w:ascii="Symbol" w:hAnsi="Symbol" w:hint="default"/>
         <w:sz w:val="20"/>
       </w:rPr>
     </w:lvl>
@@ -4013,7 +4030,7 @@
         <w:ind w:left="5760" w:hanging="360"/>
       </w:pPr>
       <w:rPr>
-        <w:rFonts w:hint="default" w:ascii="Symbol" w:hAnsi="Symbol"/>
+        <w:rFonts w:ascii="Symbol" w:hAnsi="Symbol" w:hint="default"/>
         <w:sz w:val="20"/>
       </w:rPr>
     </w:lvl>
@@ -4029,7 +4046,7 @@
         <w:ind w:left="6480" w:hanging="360"/>
       </w:pPr>
       <w:rPr>
-        <w:rFonts w:hint="default" w:ascii="Symbol" w:hAnsi="Symbol"/>
+        <w:rFonts w:ascii="Symbol" w:hAnsi="Symbol" w:hint="default"/>
         <w:sz w:val="20"/>
       </w:rPr>
     </w:lvl>
@@ -4050,7 +4067,7 @@
         <w:ind w:left="720" w:hanging="360"/>
       </w:pPr>
       <w:rPr>
-        <w:rFonts w:hint="default" w:ascii="Symbol" w:hAnsi="Symbol"/>
+        <w:rFonts w:ascii="Symbol" w:hAnsi="Symbol" w:hint="default"/>
         <w:sz w:val="20"/>
       </w:rPr>
     </w:lvl>
@@ -4066,7 +4083,7 @@
         <w:ind w:left="1440" w:hanging="360"/>
       </w:pPr>
       <w:rPr>
-        <w:rFonts w:hint="default" w:ascii="Symbol" w:hAnsi="Symbol"/>
+        <w:rFonts w:ascii="Symbol" w:hAnsi="Symbol" w:hint="default"/>
         <w:sz w:val="20"/>
       </w:rPr>
     </w:lvl>
@@ -4082,7 +4099,7 @@
         <w:ind w:left="2160" w:hanging="360"/>
       </w:pPr>
       <w:rPr>
-        <w:rFonts w:hint="default" w:ascii="Symbol" w:hAnsi="Symbol"/>
+        <w:rFonts w:ascii="Symbol" w:hAnsi="Symbol" w:hint="default"/>
         <w:sz w:val="20"/>
       </w:rPr>
     </w:lvl>
@@ -4098,7 +4115,7 @@
         <w:ind w:left="2880" w:hanging="360"/>
       </w:pPr>
       <w:rPr>
-        <w:rFonts w:hint="default" w:ascii="Symbol" w:hAnsi="Symbol"/>
+        <w:rFonts w:ascii="Symbol" w:hAnsi="Symbol" w:hint="default"/>
         <w:sz w:val="20"/>
       </w:rPr>
     </w:lvl>
@@ -4114,7 +4131,7 @@
         <w:ind w:left="3600" w:hanging="360"/>
       </w:pPr>
       <w:rPr>
-        <w:rFonts w:hint="default" w:ascii="Symbol" w:hAnsi="Symbol"/>
+        <w:rFonts w:ascii="Symbol" w:hAnsi="Symbol" w:hint="default"/>
         <w:sz w:val="20"/>
       </w:rPr>
     </w:lvl>
@@ -4130,7 +4147,7 @@
         <w:ind w:left="4320" w:hanging="360"/>
       </w:pPr>
       <w:rPr>
-        <w:rFonts w:hint="default" w:ascii="Symbol" w:hAnsi="Symbol"/>
+        <w:rFonts w:ascii="Symbol" w:hAnsi="Symbol" w:hint="default"/>
         <w:sz w:val="20"/>
       </w:rPr>
     </w:lvl>
@@ -4146,7 +4163,7 @@
         <w:ind w:left="5040" w:hanging="360"/>
       </w:pPr>
       <w:rPr>
-        <w:rFonts w:hint="default" w:ascii="Symbol" w:hAnsi="Symbol"/>
+        <w:rFonts w:ascii="Symbol" w:hAnsi="Symbol" w:hint="default"/>
         <w:sz w:val="20"/>
       </w:rPr>
     </w:lvl>
@@ -4162,7 +4179,7 @@
         <w:ind w:left="5760" w:hanging="360"/>
       </w:pPr>
       <w:rPr>
-        <w:rFonts w:hint="default" w:ascii="Symbol" w:hAnsi="Symbol"/>
+        <w:rFonts w:ascii="Symbol" w:hAnsi="Symbol" w:hint="default"/>
         <w:sz w:val="20"/>
       </w:rPr>
     </w:lvl>
@@ -4178,7 +4195,7 @@
         <w:ind w:left="6480" w:hanging="360"/>
       </w:pPr>
       <w:rPr>
-        <w:rFonts w:hint="default" w:ascii="Symbol" w:hAnsi="Symbol"/>
+        <w:rFonts w:ascii="Symbol" w:hAnsi="Symbol" w:hint="default"/>
         <w:sz w:val="20"/>
       </w:rPr>
     </w:lvl>
@@ -4196,7 +4213,7 @@
         <w:ind w:left="720" w:hanging="360"/>
       </w:pPr>
       <w:rPr>
-        <w:rFonts w:hint="default" w:ascii="Symbol" w:hAnsi="Symbol"/>
+        <w:rFonts w:ascii="Symbol" w:hAnsi="Symbol" w:hint="default"/>
       </w:rPr>
     </w:lvl>
     <w:lvl w:ilvl="1" w:tplc="0CE051B0">
@@ -4208,7 +4225,7 @@
         <w:ind w:left="1440" w:hanging="360"/>
       </w:pPr>
       <w:rPr>
-        <w:rFonts w:hint="default" w:ascii="Courier New" w:hAnsi="Courier New"/>
+        <w:rFonts w:ascii="Courier New" w:hAnsi="Courier New" w:hint="default"/>
       </w:rPr>
     </w:lvl>
     <w:lvl w:ilvl="2" w:tplc="5D30793A">
@@ -4220,7 +4237,7 @@
         <w:ind w:left="2160" w:hanging="360"/>
       </w:pPr>
       <w:rPr>
-        <w:rFonts w:hint="default" w:ascii="Wingdings" w:hAnsi="Wingdings"/>
+        <w:rFonts w:ascii="Wingdings" w:hAnsi="Wingdings" w:hint="default"/>
       </w:rPr>
     </w:lvl>
     <w:lvl w:ilvl="3" w:tplc="4CC46E42">
@@ -4232,7 +4249,7 @@
         <w:ind w:left="2880" w:hanging="360"/>
       </w:pPr>
       <w:rPr>
-        <w:rFonts w:hint="default" w:ascii="Symbol" w:hAnsi="Symbol"/>
+        <w:rFonts w:ascii="Symbol" w:hAnsi="Symbol" w:hint="default"/>
       </w:rPr>
     </w:lvl>
     <w:lvl w:ilvl="4" w:tplc="4590F3E6">
@@ -4244,7 +4261,7 @@
         <w:ind w:left="3600" w:hanging="360"/>
       </w:pPr>
       <w:rPr>
-        <w:rFonts w:hint="default" w:ascii="Courier New" w:hAnsi="Courier New"/>
+        <w:rFonts w:ascii="Courier New" w:hAnsi="Courier New" w:hint="default"/>
       </w:rPr>
     </w:lvl>
     <w:lvl w:ilvl="5" w:tplc="4CBA1098">
@@ -4256,7 +4273,7 @@
         <w:ind w:left="4320" w:hanging="360"/>
       </w:pPr>
       <w:rPr>
-        <w:rFonts w:hint="default" w:ascii="Wingdings" w:hAnsi="Wingdings"/>
+        <w:rFonts w:ascii="Wingdings" w:hAnsi="Wingdings" w:hint="default"/>
       </w:rPr>
     </w:lvl>
     <w:lvl w:ilvl="6" w:tplc="E6D40B38">
@@ -4268,7 +4285,7 @@
         <w:ind w:left="5040" w:hanging="360"/>
       </w:pPr>
       <w:rPr>
-        <w:rFonts w:hint="default" w:ascii="Symbol" w:hAnsi="Symbol"/>
+        <w:rFonts w:ascii="Symbol" w:hAnsi="Symbol" w:hint="default"/>
       </w:rPr>
     </w:lvl>
     <w:lvl w:ilvl="7" w:tplc="BAEC7AFE">
@@ -4280,7 +4297,7 @@
         <w:ind w:left="5760" w:hanging="360"/>
       </w:pPr>
       <w:rPr>
-        <w:rFonts w:hint="default" w:ascii="Courier New" w:hAnsi="Courier New"/>
+        <w:rFonts w:ascii="Courier New" w:hAnsi="Courier New" w:hint="default"/>
       </w:rPr>
     </w:lvl>
     <w:lvl w:ilvl="8" w:tplc="C31E0CAE">
@@ -4292,7 +4309,7 @@
         <w:ind w:left="6480" w:hanging="360"/>
       </w:pPr>
       <w:rPr>
-        <w:rFonts w:hint="default" w:ascii="Wingdings" w:hAnsi="Wingdings"/>
+        <w:rFonts w:ascii="Wingdings" w:hAnsi="Wingdings" w:hint="default"/>
       </w:rPr>
     </w:lvl>
   </w:abstractNum>
@@ -4309,7 +4326,7 @@
         <w:ind w:left="720" w:hanging="360"/>
       </w:pPr>
       <w:rPr>
-        <w:rFonts w:hint="default" w:ascii="Symbol" w:hAnsi="Symbol"/>
+        <w:rFonts w:ascii="Symbol" w:hAnsi="Symbol" w:hint="default"/>
       </w:rPr>
     </w:lvl>
     <w:lvl w:ilvl="1" w:tplc="DFAA29D2">
@@ -4321,7 +4338,7 @@
         <w:ind w:left="1440" w:hanging="360"/>
       </w:pPr>
       <w:rPr>
-        <w:rFonts w:hint="default" w:ascii="Courier New" w:hAnsi="Courier New"/>
+        <w:rFonts w:ascii="Courier New" w:hAnsi="Courier New" w:hint="default"/>
       </w:rPr>
     </w:lvl>
     <w:lvl w:ilvl="2" w:tplc="A6186698">
@@ -4333,7 +4350,7 @@
         <w:ind w:left="2160" w:hanging="360"/>
       </w:pPr>
       <w:rPr>
-        <w:rFonts w:hint="default" w:ascii="Wingdings" w:hAnsi="Wingdings"/>
+        <w:rFonts w:ascii="Wingdings" w:hAnsi="Wingdings" w:hint="default"/>
       </w:rPr>
     </w:lvl>
     <w:lvl w:ilvl="3" w:tplc="51EEA014">
@@ -4345,7 +4362,7 @@
         <w:ind w:left="2880" w:hanging="360"/>
       </w:pPr>
       <w:rPr>
-        <w:rFonts w:hint="default" w:ascii="Symbol" w:hAnsi="Symbol"/>
+        <w:rFonts w:ascii="Symbol" w:hAnsi="Symbol" w:hint="default"/>
       </w:rPr>
     </w:lvl>
     <w:lvl w:ilvl="4" w:tplc="9F14613E">
@@ -4357,7 +4374,7 @@
         <w:ind w:left="3600" w:hanging="360"/>
       </w:pPr>
       <w:rPr>
-        <w:rFonts w:hint="default" w:ascii="Courier New" w:hAnsi="Courier New"/>
+        <w:rFonts w:ascii="Courier New" w:hAnsi="Courier New" w:hint="default"/>
       </w:rPr>
     </w:lvl>
     <w:lvl w:ilvl="5" w:tplc="096825C0">
@@ -4369,7 +4386,7 @@
         <w:ind w:left="4320" w:hanging="360"/>
       </w:pPr>
       <w:rPr>
-        <w:rFonts w:hint="default" w:ascii="Wingdings" w:hAnsi="Wingdings"/>
+        <w:rFonts w:ascii="Wingdings" w:hAnsi="Wingdings" w:hint="default"/>
       </w:rPr>
     </w:lvl>
     <w:lvl w:ilvl="6" w:tplc="7F2C395E">
@@ -4381,7 +4398,7 @@
         <w:ind w:left="5040" w:hanging="360"/>
       </w:pPr>
       <w:rPr>
-        <w:rFonts w:hint="default" w:ascii="Symbol" w:hAnsi="Symbol"/>
+        <w:rFonts w:ascii="Symbol" w:hAnsi="Symbol" w:hint="default"/>
       </w:rPr>
     </w:lvl>
     <w:lvl w:ilvl="7" w:tplc="29BEB436">
@@ -4393,7 +4410,7 @@
         <w:ind w:left="5760" w:hanging="360"/>
       </w:pPr>
       <w:rPr>
-        <w:rFonts w:hint="default" w:ascii="Courier New" w:hAnsi="Courier New"/>
+        <w:rFonts w:ascii="Courier New" w:hAnsi="Courier New" w:hint="default"/>
       </w:rPr>
     </w:lvl>
     <w:lvl w:ilvl="8" w:tplc="EFA430E6">
@@ -4405,7 +4422,7 @@
         <w:ind w:left="6480" w:hanging="360"/>
       </w:pPr>
       <w:rPr>
-        <w:rFonts w:hint="default" w:ascii="Wingdings" w:hAnsi="Wingdings"/>
+        <w:rFonts w:ascii="Wingdings" w:hAnsi="Wingdings" w:hint="default"/>
       </w:rPr>
     </w:lvl>
   </w:abstractNum>
@@ -4425,7 +4442,7 @@
         <w:ind w:left="720" w:hanging="360"/>
       </w:pPr>
       <w:rPr>
-        <w:rFonts w:hint="default" w:ascii="Symbol" w:hAnsi="Symbol"/>
+        <w:rFonts w:ascii="Symbol" w:hAnsi="Symbol" w:hint="default"/>
         <w:sz w:val="20"/>
       </w:rPr>
     </w:lvl>
@@ -4441,7 +4458,7 @@
         <w:ind w:left="1440" w:hanging="360"/>
       </w:pPr>
       <w:rPr>
-        <w:rFonts w:hint="default" w:ascii="Symbol" w:hAnsi="Symbol"/>
+        <w:rFonts w:ascii="Symbol" w:hAnsi="Symbol" w:hint="default"/>
         <w:sz w:val="20"/>
       </w:rPr>
     </w:lvl>
@@ -4457,7 +4474,7 @@
         <w:ind w:left="2160" w:hanging="360"/>
       </w:pPr>
       <w:rPr>
-        <w:rFonts w:hint="default" w:ascii="Symbol" w:hAnsi="Symbol"/>
+        <w:rFonts w:ascii="Symbol" w:hAnsi="Symbol" w:hint="default"/>
         <w:sz w:val="20"/>
       </w:rPr>
     </w:lvl>
@@ -4473,7 +4490,7 @@
         <w:ind w:left="2880" w:hanging="360"/>
       </w:pPr>
       <w:rPr>
-        <w:rFonts w:hint="default" w:ascii="Symbol" w:hAnsi="Symbol"/>
+        <w:rFonts w:ascii="Symbol" w:hAnsi="Symbol" w:hint="default"/>
         <w:sz w:val="20"/>
       </w:rPr>
     </w:lvl>
@@ -4489,7 +4506,7 @@
         <w:ind w:left="3600" w:hanging="360"/>
       </w:pPr>
       <w:rPr>
-        <w:rFonts w:hint="default" w:ascii="Symbol" w:hAnsi="Symbol"/>
+        <w:rFonts w:ascii="Symbol" w:hAnsi="Symbol" w:hint="default"/>
         <w:sz w:val="20"/>
       </w:rPr>
     </w:lvl>
@@ -4505,7 +4522,7 @@
         <w:ind w:left="4320" w:hanging="360"/>
       </w:pPr>
       <w:rPr>
-        <w:rFonts w:hint="default" w:ascii="Symbol" w:hAnsi="Symbol"/>
+        <w:rFonts w:ascii="Symbol" w:hAnsi="Symbol" w:hint="default"/>
         <w:sz w:val="20"/>
       </w:rPr>
     </w:lvl>
@@ -4521,7 +4538,7 @@
         <w:ind w:left="5040" w:hanging="360"/>
       </w:pPr>
       <w:rPr>
-        <w:rFonts w:hint="default" w:ascii="Symbol" w:hAnsi="Symbol"/>
+        <w:rFonts w:ascii="Symbol" w:hAnsi="Symbol" w:hint="default"/>
         <w:sz w:val="20"/>
       </w:rPr>
     </w:lvl>
@@ -4537,7 +4554,7 @@
         <w:ind w:left="5760" w:hanging="360"/>
       </w:pPr>
       <w:rPr>
-        <w:rFonts w:hint="default" w:ascii="Symbol" w:hAnsi="Symbol"/>
+        <w:rFonts w:ascii="Symbol" w:hAnsi="Symbol" w:hint="default"/>
         <w:sz w:val="20"/>
       </w:rPr>
     </w:lvl>
@@ -4553,7 +4570,7 @@
         <w:ind w:left="6480" w:hanging="360"/>
       </w:pPr>
       <w:rPr>
-        <w:rFonts w:hint="default" w:ascii="Symbol" w:hAnsi="Symbol"/>
+        <w:rFonts w:ascii="Symbol" w:hAnsi="Symbol" w:hint="default"/>
         <w:sz w:val="20"/>
       </w:rPr>
     </w:lvl>
@@ -4574,7 +4591,7 @@
         <w:ind w:left="720" w:hanging="360"/>
       </w:pPr>
       <w:rPr>
-        <w:rFonts w:hint="default" w:ascii="Symbol" w:hAnsi="Symbol"/>
+        <w:rFonts w:ascii="Symbol" w:hAnsi="Symbol" w:hint="default"/>
         <w:sz w:val="20"/>
       </w:rPr>
     </w:lvl>
@@ -4590,7 +4607,7 @@
         <w:ind w:left="1440" w:hanging="360"/>
       </w:pPr>
       <w:rPr>
-        <w:rFonts w:hint="default" w:ascii="Symbol" w:hAnsi="Symbol"/>
+        <w:rFonts w:ascii="Symbol" w:hAnsi="Symbol" w:hint="default"/>
         <w:sz w:val="20"/>
       </w:rPr>
     </w:lvl>
@@ -4606,7 +4623,7 @@
         <w:ind w:left="2160" w:hanging="360"/>
       </w:pPr>
       <w:rPr>
-        <w:rFonts w:hint="default" w:ascii="Symbol" w:hAnsi="Symbol"/>
+        <w:rFonts w:ascii="Symbol" w:hAnsi="Symbol" w:hint="default"/>
         <w:sz w:val="20"/>
       </w:rPr>
     </w:lvl>
@@ -4622,7 +4639,7 @@
         <w:ind w:left="2880" w:hanging="360"/>
       </w:pPr>
       <w:rPr>
-        <w:rFonts w:hint="default" w:ascii="Symbol" w:hAnsi="Symbol"/>
+        <w:rFonts w:ascii="Symbol" w:hAnsi="Symbol" w:hint="default"/>
         <w:sz w:val="20"/>
       </w:rPr>
     </w:lvl>
@@ -4638,7 +4655,7 @@
         <w:ind w:left="3600" w:hanging="360"/>
       </w:pPr>
       <w:rPr>
-        <w:rFonts w:hint="default" w:ascii="Symbol" w:hAnsi="Symbol"/>
+        <w:rFonts w:ascii="Symbol" w:hAnsi="Symbol" w:hint="default"/>
         <w:sz w:val="20"/>
       </w:rPr>
     </w:lvl>
@@ -4654,7 +4671,7 @@
         <w:ind w:left="4320" w:hanging="360"/>
       </w:pPr>
       <w:rPr>
-        <w:rFonts w:hint="default" w:ascii="Symbol" w:hAnsi="Symbol"/>
+        <w:rFonts w:ascii="Symbol" w:hAnsi="Symbol" w:hint="default"/>
         <w:sz w:val="20"/>
       </w:rPr>
     </w:lvl>
@@ -4670,7 +4687,7 @@
         <w:ind w:left="5040" w:hanging="360"/>
       </w:pPr>
       <w:rPr>
-        <w:rFonts w:hint="default" w:ascii="Symbol" w:hAnsi="Symbol"/>
+        <w:rFonts w:ascii="Symbol" w:hAnsi="Symbol" w:hint="default"/>
         <w:sz w:val="20"/>
       </w:rPr>
     </w:lvl>
@@ -4686,7 +4703,7 @@
         <w:ind w:left="5760" w:hanging="360"/>
       </w:pPr>
       <w:rPr>
-        <w:rFonts w:hint="default" w:ascii="Symbol" w:hAnsi="Symbol"/>
+        <w:rFonts w:ascii="Symbol" w:hAnsi="Symbol" w:hint="default"/>
         <w:sz w:val="20"/>
       </w:rPr>
     </w:lvl>
@@ -4702,7 +4719,7 @@
         <w:ind w:left="6480" w:hanging="360"/>
       </w:pPr>
       <w:rPr>
-        <w:rFonts w:hint="default" w:ascii="Symbol" w:hAnsi="Symbol"/>
+        <w:rFonts w:ascii="Symbol" w:hAnsi="Symbol" w:hint="default"/>
         <w:sz w:val="20"/>
       </w:rPr>
     </w:lvl>
@@ -4723,7 +4740,7 @@
         <w:ind w:left="720" w:hanging="360"/>
       </w:pPr>
       <w:rPr>
-        <w:rFonts w:hint="default" w:ascii="Symbol" w:hAnsi="Symbol"/>
+        <w:rFonts w:ascii="Symbol" w:hAnsi="Symbol" w:hint="default"/>
         <w:sz w:val="20"/>
       </w:rPr>
     </w:lvl>
@@ -4739,7 +4756,7 @@
         <w:ind w:left="1440" w:hanging="360"/>
       </w:pPr>
       <w:rPr>
-        <w:rFonts w:hint="default" w:ascii="Symbol" w:hAnsi="Symbol"/>
+        <w:rFonts w:ascii="Symbol" w:hAnsi="Symbol" w:hint="default"/>
         <w:sz w:val="20"/>
       </w:rPr>
     </w:lvl>
@@ -4755,7 +4772,7 @@
         <w:ind w:left="2160" w:hanging="360"/>
       </w:pPr>
       <w:rPr>
-        <w:rFonts w:hint="default" w:ascii="Symbol" w:hAnsi="Symbol"/>
+        <w:rFonts w:ascii="Symbol" w:hAnsi="Symbol" w:hint="default"/>
         <w:sz w:val="20"/>
       </w:rPr>
     </w:lvl>
@@ -4771,7 +4788,7 @@
         <w:ind w:left="2880" w:hanging="360"/>
       </w:pPr>
       <w:rPr>
-        <w:rFonts w:hint="default" w:ascii="Symbol" w:hAnsi="Symbol"/>
+        <w:rFonts w:ascii="Symbol" w:hAnsi="Symbol" w:hint="default"/>
         <w:sz w:val="20"/>
       </w:rPr>
     </w:lvl>
@@ -4787,7 +4804,7 @@
         <w:ind w:left="3600" w:hanging="360"/>
       </w:pPr>
       <w:rPr>
-        <w:rFonts w:hint="default" w:ascii="Symbol" w:hAnsi="Symbol"/>
+        <w:rFonts w:ascii="Symbol" w:hAnsi="Symbol" w:hint="default"/>
         <w:sz w:val="20"/>
       </w:rPr>
     </w:lvl>
@@ -4803,7 +4820,7 @@
         <w:ind w:left="4320" w:hanging="360"/>
       </w:pPr>
       <w:rPr>
-        <w:rFonts w:hint="default" w:ascii="Symbol" w:hAnsi="Symbol"/>
+        <w:rFonts w:ascii="Symbol" w:hAnsi="Symbol" w:hint="default"/>
         <w:sz w:val="20"/>
       </w:rPr>
     </w:lvl>
@@ -4819,7 +4836,7 @@
         <w:ind w:left="5040" w:hanging="360"/>
       </w:pPr>
       <w:rPr>
-        <w:rFonts w:hint="default" w:ascii="Symbol" w:hAnsi="Symbol"/>
+        <w:rFonts w:ascii="Symbol" w:hAnsi="Symbol" w:hint="default"/>
         <w:sz w:val="20"/>
       </w:rPr>
     </w:lvl>
@@ -4835,7 +4852,7 @@
         <w:ind w:left="5760" w:hanging="360"/>
       </w:pPr>
       <w:rPr>
-        <w:rFonts w:hint="default" w:ascii="Symbol" w:hAnsi="Symbol"/>
+        <w:rFonts w:ascii="Symbol" w:hAnsi="Symbol" w:hint="default"/>
         <w:sz w:val="20"/>
       </w:rPr>
     </w:lvl>
@@ -4851,7 +4868,7 @@
         <w:ind w:left="6480" w:hanging="360"/>
       </w:pPr>
       <w:rPr>
-        <w:rFonts w:hint="default" w:ascii="Symbol" w:hAnsi="Symbol"/>
+        <w:rFonts w:ascii="Symbol" w:hAnsi="Symbol" w:hint="default"/>
         <w:sz w:val="20"/>
       </w:rPr>
     </w:lvl>
@@ -4872,7 +4889,7 @@
         <w:ind w:left="720" w:hanging="360"/>
       </w:pPr>
       <w:rPr>
-        <w:rFonts w:hint="default" w:ascii="Symbol" w:hAnsi="Symbol"/>
+        <w:rFonts w:ascii="Symbol" w:hAnsi="Symbol" w:hint="default"/>
         <w:sz w:val="20"/>
       </w:rPr>
     </w:lvl>
@@ -4888,7 +4905,7 @@
         <w:ind w:left="1440" w:hanging="360"/>
       </w:pPr>
       <w:rPr>
-        <w:rFonts w:hint="default" w:ascii="Symbol" w:hAnsi="Symbol"/>
+        <w:rFonts w:ascii="Symbol" w:hAnsi="Symbol" w:hint="default"/>
         <w:sz w:val="20"/>
       </w:rPr>
     </w:lvl>
@@ -4904,7 +4921,7 @@
         <w:ind w:left="2160" w:hanging="360"/>
       </w:pPr>
       <w:rPr>
-        <w:rFonts w:hint="default" w:ascii="Symbol" w:hAnsi="Symbol"/>
+        <w:rFonts w:ascii="Symbol" w:hAnsi="Symbol" w:hint="default"/>
         <w:sz w:val="20"/>
       </w:rPr>
     </w:lvl>
@@ -4920,7 +4937,7 @@
         <w:ind w:left="2880" w:hanging="360"/>
       </w:pPr>
       <w:rPr>
-        <w:rFonts w:hint="default" w:ascii="Symbol" w:hAnsi="Symbol"/>
+        <w:rFonts w:ascii="Symbol" w:hAnsi="Symbol" w:hint="default"/>
         <w:sz w:val="20"/>
       </w:rPr>
     </w:lvl>
@@ -4936,7 +4953,7 @@
         <w:ind w:left="3600" w:hanging="360"/>
       </w:pPr>
       <w:rPr>
-        <w:rFonts w:hint="default" w:ascii="Symbol" w:hAnsi="Symbol"/>
+        <w:rFonts w:ascii="Symbol" w:hAnsi="Symbol" w:hint="default"/>
         <w:sz w:val="20"/>
       </w:rPr>
     </w:lvl>
@@ -4952,7 +4969,7 @@
         <w:ind w:left="4320" w:hanging="360"/>
       </w:pPr>
       <w:rPr>
-        <w:rFonts w:hint="default" w:ascii="Symbol" w:hAnsi="Symbol"/>
+        <w:rFonts w:ascii="Symbol" w:hAnsi="Symbol" w:hint="default"/>
         <w:sz w:val="20"/>
       </w:rPr>
     </w:lvl>
@@ -4968,7 +4985,7 @@
         <w:ind w:left="5040" w:hanging="360"/>
       </w:pPr>
       <w:rPr>
-        <w:rFonts w:hint="default" w:ascii="Symbol" w:hAnsi="Symbol"/>
+        <w:rFonts w:ascii="Symbol" w:hAnsi="Symbol" w:hint="default"/>
         <w:sz w:val="20"/>
       </w:rPr>
     </w:lvl>
@@ -4984,7 +5001,7 @@
         <w:ind w:left="5760" w:hanging="360"/>
       </w:pPr>
       <w:rPr>
-        <w:rFonts w:hint="default" w:ascii="Symbol" w:hAnsi="Symbol"/>
+        <w:rFonts w:ascii="Symbol" w:hAnsi="Symbol" w:hint="default"/>
         <w:sz w:val="20"/>
       </w:rPr>
     </w:lvl>
@@ -5000,7 +5017,7 @@
         <w:ind w:left="6480" w:hanging="360"/>
       </w:pPr>
       <w:rPr>
-        <w:rFonts w:hint="default" w:ascii="Symbol" w:hAnsi="Symbol"/>
+        <w:rFonts w:ascii="Symbol" w:hAnsi="Symbol" w:hint="default"/>
         <w:sz w:val="20"/>
       </w:rPr>
     </w:lvl>
@@ -5085,7 +5102,7 @@
   <w:docDefaults>
     <w:rPrDefault>
       <w:rPr>
-        <w:rFonts w:ascii="Arial" w:hAnsi="Arial" w:eastAsia="Arial" w:cs="Arial"/>
+        <w:rFonts w:ascii="Arial" w:eastAsia="Arial" w:hAnsi="Arial" w:cs="Arial"/>
         <w:sz w:val="22"/>
         <w:szCs w:val="22"/>
         <w:lang w:val="es-CO" w:eastAsia="es-CO" w:bidi="ar-SA"/>
@@ -5102,14 +5119,14 @@
   <w:latentStyles w:defLockedState="0" w:defUIPriority="99" w:defSemiHidden="0" w:defUnhideWhenUsed="0" w:defQFormat="0" w:count="376">
     <w:lsdException w:name="Normal" w:uiPriority="0" w:qFormat="1"/>
     <w:lsdException w:name="heading 1" w:uiPriority="9" w:qFormat="1"/>
-    <w:lsdException w:name="heading 2" w:uiPriority="9" w:semiHidden="1" w:unhideWhenUsed="1" w:qFormat="1"/>
-    <w:lsdException w:name="heading 3" w:uiPriority="9" w:semiHidden="1" w:unhideWhenUsed="1" w:qFormat="1"/>
-    <w:lsdException w:name="heading 4" w:uiPriority="9" w:semiHidden="1" w:unhideWhenUsed="1" w:qFormat="1"/>
-    <w:lsdException w:name="heading 5" w:uiPriority="9" w:semiHidden="1" w:unhideWhenUsed="1" w:qFormat="1"/>
-    <w:lsdException w:name="heading 6" w:uiPriority="9" w:semiHidden="1" w:unhideWhenUsed="1" w:qFormat="1"/>
-    <w:lsdException w:name="heading 7" w:uiPriority="9" w:semiHidden="1" w:unhideWhenUsed="1" w:qFormat="1"/>
-    <w:lsdException w:name="heading 8" w:uiPriority="9" w:semiHidden="1" w:unhideWhenUsed="1" w:qFormat="1"/>
-    <w:lsdException w:name="heading 9" w:uiPriority="9" w:semiHidden="1" w:unhideWhenUsed="1" w:qFormat="1"/>
+    <w:lsdException w:name="heading 2" w:semiHidden="1" w:uiPriority="9" w:unhideWhenUsed="1" w:qFormat="1"/>
+    <w:lsdException w:name="heading 3" w:semiHidden="1" w:uiPriority="9" w:unhideWhenUsed="1" w:qFormat="1"/>
+    <w:lsdException w:name="heading 4" w:semiHidden="1" w:uiPriority="9" w:unhideWhenUsed="1" w:qFormat="1"/>
+    <w:lsdException w:name="heading 5" w:semiHidden="1" w:uiPriority="9" w:unhideWhenUsed="1" w:qFormat="1"/>
+    <w:lsdException w:name="heading 6" w:semiHidden="1" w:uiPriority="9" w:unhideWhenUsed="1" w:qFormat="1"/>
+    <w:lsdException w:name="heading 7" w:semiHidden="1" w:uiPriority="9" w:unhideWhenUsed="1" w:qFormat="1"/>
+    <w:lsdException w:name="heading 8" w:semiHidden="1" w:uiPriority="9" w:unhideWhenUsed="1" w:qFormat="1"/>
+    <w:lsdException w:name="heading 9" w:semiHidden="1" w:uiPriority="9" w:unhideWhenUsed="1" w:qFormat="1"/>
     <w:lsdException w:name="index 1" w:semiHidden="1" w:unhideWhenUsed="1"/>
     <w:lsdException w:name="index 2" w:semiHidden="1" w:unhideWhenUsed="1"/>
     <w:lsdException w:name="index 3" w:semiHidden="1" w:unhideWhenUsed="1"/>
@@ -5119,22 +5136,22 @@
     <w:lsdException w:name="index 7" w:semiHidden="1" w:unhideWhenUsed="1"/>
     <w:lsdException w:name="index 8" w:semiHidden="1" w:unhideWhenUsed="1"/>
     <w:lsdException w:name="index 9" w:semiHidden="1" w:unhideWhenUsed="1"/>
-    <w:lsdException w:name="toc 1" w:uiPriority="39" w:semiHidden="1" w:unhideWhenUsed="1"/>
-    <w:lsdException w:name="toc 2" w:uiPriority="39" w:semiHidden="1" w:unhideWhenUsed="1"/>
-    <w:lsdException w:name="toc 3" w:uiPriority="39" w:semiHidden="1" w:unhideWhenUsed="1"/>
-    <w:lsdException w:name="toc 4" w:uiPriority="39" w:semiHidden="1" w:unhideWhenUsed="1"/>
-    <w:lsdException w:name="toc 5" w:uiPriority="39" w:semiHidden="1" w:unhideWhenUsed="1"/>
-    <w:lsdException w:name="toc 6" w:uiPriority="39" w:semiHidden="1" w:unhideWhenUsed="1"/>
-    <w:lsdException w:name="toc 7" w:uiPriority="39" w:semiHidden="1" w:unhideWhenUsed="1"/>
-    <w:lsdException w:name="toc 8" w:uiPriority="39" w:semiHidden="1" w:unhideWhenUsed="1"/>
-    <w:lsdException w:name="toc 9" w:uiPriority="39" w:semiHidden="1" w:unhideWhenUsed="1"/>
+    <w:lsdException w:name="toc 1" w:semiHidden="1" w:uiPriority="39" w:unhideWhenUsed="1"/>
+    <w:lsdException w:name="toc 2" w:semiHidden="1" w:uiPriority="39" w:unhideWhenUsed="1"/>
+    <w:lsdException w:name="toc 3" w:semiHidden="1" w:uiPriority="39" w:unhideWhenUsed="1"/>
+    <w:lsdException w:name="toc 4" w:semiHidden="1" w:uiPriority="39" w:unhideWhenUsed="1"/>
+    <w:lsdException w:name="toc 5" w:semiHidden="1" w:uiPriority="39" w:unhideWhenUsed="1"/>
+    <w:lsdException w:name="toc 6" w:semiHidden="1" w:uiPriority="39" w:unhideWhenUsed="1"/>
+    <w:lsdException w:name="toc 7" w:semiHidden="1" w:uiPriority="39" w:unhideWhenUsed="1"/>
+    <w:lsdException w:name="toc 8" w:semiHidden="1" w:uiPriority="39" w:unhideWhenUsed="1"/>
+    <w:lsdException w:name="toc 9" w:semiHidden="1" w:uiPriority="39" w:unhideWhenUsed="1"/>
     <w:lsdException w:name="Normal Indent" w:semiHidden="1" w:unhideWhenUsed="1"/>
     <w:lsdException w:name="footnote text" w:semiHidden="1" w:unhideWhenUsed="1"/>
     <w:lsdException w:name="annotation text" w:semiHidden="1" w:unhideWhenUsed="1"/>
     <w:lsdException w:name="header" w:semiHidden="1" w:unhideWhenUsed="1"/>
     <w:lsdException w:name="footer" w:semiHidden="1" w:unhideWhenUsed="1"/>
     <w:lsdException w:name="index heading" w:semiHidden="1" w:unhideWhenUsed="1"/>
-    <w:lsdException w:name="caption" w:uiPriority="35" w:semiHidden="1" w:unhideWhenUsed="1" w:qFormat="1"/>
+    <w:lsdException w:name="caption" w:semiHidden="1" w:uiPriority="35" w:unhideWhenUsed="1" w:qFormat="1"/>
     <w:lsdException w:name="table of figures" w:semiHidden="1" w:unhideWhenUsed="1"/>
     <w:lsdException w:name="envelope address" w:semiHidden="1" w:unhideWhenUsed="1"/>
     <w:lsdException w:name="envelope return" w:semiHidden="1" w:unhideWhenUsed="1"/>
@@ -5165,7 +5182,7 @@
     <w:lsdException w:name="Title" w:uiPriority="10" w:qFormat="1"/>
     <w:lsdException w:name="Closing" w:semiHidden="1" w:unhideWhenUsed="1"/>
     <w:lsdException w:name="Signature" w:semiHidden="1" w:unhideWhenUsed="1"/>
-    <w:lsdException w:name="Default Paragraph Font" w:uiPriority="1" w:semiHidden="1" w:unhideWhenUsed="1"/>
+    <w:lsdException w:name="Default Paragraph Font" w:semiHidden="1" w:uiPriority="1" w:unhideWhenUsed="1"/>
     <w:lsdException w:name="Body Text" w:semiHidden="1" w:unhideWhenUsed="1"/>
     <w:lsdException w:name="Body Text Indent" w:semiHidden="1" w:unhideWhenUsed="1"/>
     <w:lsdException w:name="List Continue" w:semiHidden="1" w:unhideWhenUsed="1"/>
@@ -5365,8 +5382,8 @@
     <w:lsdException w:name="Subtle Reference" w:uiPriority="31" w:qFormat="1"/>
     <w:lsdException w:name="Intense Reference" w:uiPriority="32" w:qFormat="1"/>
     <w:lsdException w:name="Book Title" w:uiPriority="33" w:qFormat="1"/>
-    <w:lsdException w:name="Bibliography" w:uiPriority="37" w:semiHidden="1" w:unhideWhenUsed="1"/>
-    <w:lsdException w:name="TOC Heading" w:uiPriority="39" w:semiHidden="1" w:unhideWhenUsed="1" w:qFormat="1"/>
+    <w:lsdException w:name="Bibliography" w:semiHidden="1" w:uiPriority="37" w:unhideWhenUsed="1"/>
+    <w:lsdException w:name="TOC Heading" w:semiHidden="1" w:uiPriority="39" w:unhideWhenUsed="1" w:qFormat="1"/>
     <w:lsdException w:name="Plain Table 1" w:uiPriority="41"/>
     <w:lsdException w:name="Plain Table 2" w:uiPriority="42"/>
     <w:lsdException w:name="Plain Table 3" w:uiPriority="43"/>
@@ -5477,7 +5494,7 @@
     <w:lsdException w:name="Unresolved Mention" w:semiHidden="1" w:unhideWhenUsed="1"/>
     <w:lsdException w:name="Smart Link" w:semiHidden="1" w:unhideWhenUsed="1"/>
   </w:latentStyles>
-  <w:style w:type="paragraph" w:styleId="Normal" w:default="1">
+  <w:style w:type="paragraph" w:default="1" w:styleId="Normal">
     <w:name w:val="Normal"/>
     <w:qFormat/>
   </w:style>
@@ -5589,12 +5606,13 @@
       <w:szCs w:val="24"/>
     </w:rPr>
   </w:style>
-  <w:style w:type="character" w:styleId="Fuentedeprrafopredeter" w:default="1">
+  <w:style w:type="character" w:default="1" w:styleId="Fuentedeprrafopredeter">
     <w:name w:val="Default Paragraph Font"/>
     <w:uiPriority w:val="1"/>
+    <w:semiHidden/>
     <w:unhideWhenUsed/>
   </w:style>
-  <w:style w:type="table" w:styleId="Tablanormal" w:default="1">
+  <w:style w:type="table" w:default="1" w:styleId="Tablanormal">
     <w:name w:val="Normal Table"/>
     <w:uiPriority w:val="99"/>
     <w:semiHidden/>
@@ -5609,7 +5627,7 @@
       </w:tblCellMar>
     </w:tblPr>
   </w:style>
-  <w:style w:type="numbering" w:styleId="Sinlista" w:default="1">
+  <w:style w:type="numbering" w:default="1" w:styleId="Sinlista">
     <w:name w:val="No List"/>
     <w:uiPriority w:val="99"/>
     <w:semiHidden/>
@@ -5632,10 +5650,10 @@
       <w:szCs w:val="72"/>
     </w:rPr>
   </w:style>
-  <w:style w:type="paragraph" w:styleId="Normal0" w:customStyle="1">
+  <w:style w:type="paragraph" w:customStyle="1" w:styleId="Normal0">
     <w:name w:val="Normal0"/>
   </w:style>
-  <w:style w:type="table" w:styleId="NormalTable0" w:customStyle="1">
+  <w:style w:type="table" w:customStyle="1" w:styleId="NormalTable0">
     <w:name w:val="Normal Table0"/>
     <w:tblPr>
       <w:tblCellMar>
@@ -5646,7 +5664,7 @@
       </w:tblCellMar>
     </w:tblPr>
   </w:style>
-  <w:style w:type="paragraph" w:styleId="heading10" w:customStyle="1">
+  <w:style w:type="paragraph" w:customStyle="1" w:styleId="heading10">
     <w:name w:val="heading 10"/>
     <w:basedOn w:val="Normal0"/>
     <w:next w:val="Normal0"/>
@@ -5661,7 +5679,7 @@
       <w:szCs w:val="28"/>
     </w:rPr>
   </w:style>
-  <w:style w:type="paragraph" w:styleId="heading20" w:customStyle="1">
+  <w:style w:type="paragraph" w:customStyle="1" w:styleId="heading20">
     <w:name w:val="heading 20"/>
     <w:basedOn w:val="Normal0"/>
     <w:next w:val="Normal0"/>
@@ -5674,7 +5692,7 @@
       <w:szCs w:val="24"/>
     </w:rPr>
   </w:style>
-  <w:style w:type="paragraph" w:styleId="heading30" w:customStyle="1">
+  <w:style w:type="paragraph" w:customStyle="1" w:styleId="heading30">
     <w:name w:val="heading 30"/>
     <w:basedOn w:val="Normal0"/>
     <w:next w:val="Normal0"/>
@@ -5687,7 +5705,7 @@
       <w:szCs w:val="24"/>
     </w:rPr>
   </w:style>
-  <w:style w:type="paragraph" w:styleId="heading40" w:customStyle="1">
+  <w:style w:type="paragraph" w:customStyle="1" w:styleId="heading40">
     <w:name w:val="heading 40"/>
     <w:basedOn w:val="Normal0"/>
     <w:next w:val="Normal0"/>
@@ -5700,7 +5718,7 @@
       <w:szCs w:val="24"/>
     </w:rPr>
   </w:style>
-  <w:style w:type="paragraph" w:styleId="heading50" w:customStyle="1">
+  <w:style w:type="paragraph" w:customStyle="1" w:styleId="heading50">
     <w:name w:val="heading 50"/>
     <w:basedOn w:val="Normal0"/>
     <w:next w:val="Normal0"/>
@@ -5713,7 +5731,7 @@
       <w:szCs w:val="24"/>
     </w:rPr>
   </w:style>
-  <w:style w:type="paragraph" w:styleId="heading60" w:customStyle="1">
+  <w:style w:type="paragraph" w:customStyle="1" w:styleId="heading60">
     <w:name w:val="heading 60"/>
     <w:basedOn w:val="Normal0"/>
     <w:next w:val="Normal0"/>
@@ -5726,7 +5744,7 @@
       <w:szCs w:val="24"/>
     </w:rPr>
   </w:style>
-  <w:style w:type="paragraph" w:styleId="Title0" w:customStyle="1">
+  <w:style w:type="paragraph" w:customStyle="1" w:styleId="Title0">
     <w:name w:val="Title0"/>
     <w:basedOn w:val="Normal0"/>
     <w:next w:val="Normal0"/>
@@ -5741,10 +5759,10 @@
       <w:szCs w:val="72"/>
     </w:rPr>
   </w:style>
-  <w:style w:type="paragraph" w:styleId="Normal1" w:customStyle="1">
+  <w:style w:type="paragraph" w:customStyle="1" w:styleId="Normal1">
     <w:name w:val="Normal1"/>
   </w:style>
-  <w:style w:type="table" w:styleId="NormalTable1" w:customStyle="1">
+  <w:style w:type="table" w:customStyle="1" w:styleId="NormalTable1">
     <w:name w:val="Normal Table1"/>
     <w:tblPr>
       <w:tblCellMar>
@@ -5755,7 +5773,7 @@
       </w:tblCellMar>
     </w:tblPr>
   </w:style>
-  <w:style w:type="paragraph" w:styleId="heading11" w:customStyle="1">
+  <w:style w:type="paragraph" w:customStyle="1" w:styleId="heading11">
     <w:name w:val="heading 11"/>
     <w:basedOn w:val="Normal1"/>
     <w:next w:val="Normal1"/>
@@ -5770,7 +5788,7 @@
       <w:szCs w:val="28"/>
     </w:rPr>
   </w:style>
-  <w:style w:type="paragraph" w:styleId="heading21" w:customStyle="1">
+  <w:style w:type="paragraph" w:customStyle="1" w:styleId="heading21">
     <w:name w:val="heading 21"/>
     <w:basedOn w:val="Normal1"/>
     <w:next w:val="Normal1"/>
@@ -5783,7 +5801,7 @@
       <w:szCs w:val="24"/>
     </w:rPr>
   </w:style>
-  <w:style w:type="paragraph" w:styleId="heading31" w:customStyle="1">
+  <w:style w:type="paragraph" w:customStyle="1" w:styleId="heading31">
     <w:name w:val="heading 31"/>
     <w:basedOn w:val="Normal1"/>
     <w:next w:val="Normal1"/>
@@ -5796,7 +5814,7 @@
       <w:szCs w:val="24"/>
     </w:rPr>
   </w:style>
-  <w:style w:type="paragraph" w:styleId="heading41" w:customStyle="1">
+  <w:style w:type="paragraph" w:customStyle="1" w:styleId="heading41">
     <w:name w:val="heading 41"/>
     <w:basedOn w:val="Normal1"/>
     <w:next w:val="Normal1"/>
@@ -5809,7 +5827,7 @@
       <w:szCs w:val="24"/>
     </w:rPr>
   </w:style>
-  <w:style w:type="paragraph" w:styleId="heading51" w:customStyle="1">
+  <w:style w:type="paragraph" w:customStyle="1" w:styleId="heading51">
     <w:name w:val="heading 51"/>
     <w:basedOn w:val="Normal1"/>
     <w:next w:val="Normal1"/>
@@ -5822,7 +5840,7 @@
       <w:szCs w:val="24"/>
     </w:rPr>
   </w:style>
-  <w:style w:type="paragraph" w:styleId="heading61" w:customStyle="1">
+  <w:style w:type="paragraph" w:customStyle="1" w:styleId="heading61">
     <w:name w:val="heading 61"/>
     <w:basedOn w:val="Normal1"/>
     <w:next w:val="Normal1"/>
@@ -5835,7 +5853,7 @@
       <w:szCs w:val="24"/>
     </w:rPr>
   </w:style>
-  <w:style w:type="paragraph" w:styleId="Title1" w:customStyle="1">
+  <w:style w:type="paragraph" w:customStyle="1" w:styleId="Title1">
     <w:name w:val="Title1"/>
     <w:basedOn w:val="Normal1"/>
     <w:next w:val="Normal1"/>
@@ -5850,10 +5868,10 @@
       <w:szCs w:val="72"/>
     </w:rPr>
   </w:style>
-  <w:style w:type="paragraph" w:styleId="Normal2" w:customStyle="1">
+  <w:style w:type="paragraph" w:customStyle="1" w:styleId="Normal2">
     <w:name w:val="Normal2"/>
   </w:style>
-  <w:style w:type="table" w:styleId="NormalTable2" w:customStyle="1">
+  <w:style w:type="table" w:customStyle="1" w:styleId="NormalTable2">
     <w:name w:val="Normal Table2"/>
     <w:tblPr>
       <w:tblCellMar>
@@ -5864,7 +5882,7 @@
       </w:tblCellMar>
     </w:tblPr>
   </w:style>
-  <w:style w:type="paragraph" w:styleId="heading12" w:customStyle="1">
+  <w:style w:type="paragraph" w:customStyle="1" w:styleId="heading12">
     <w:name w:val="heading 12"/>
     <w:basedOn w:val="Normal2"/>
     <w:next w:val="Normal2"/>
@@ -5879,7 +5897,7 @@
       <w:szCs w:val="28"/>
     </w:rPr>
   </w:style>
-  <w:style w:type="paragraph" w:styleId="heading22" w:customStyle="1">
+  <w:style w:type="paragraph" w:customStyle="1" w:styleId="heading22">
     <w:name w:val="heading 22"/>
     <w:basedOn w:val="Normal2"/>
     <w:next w:val="Normal2"/>
@@ -5892,7 +5910,7 @@
       <w:szCs w:val="24"/>
     </w:rPr>
   </w:style>
-  <w:style w:type="paragraph" w:styleId="heading32" w:customStyle="1">
+  <w:style w:type="paragraph" w:customStyle="1" w:styleId="heading32">
     <w:name w:val="heading 32"/>
     <w:basedOn w:val="Normal2"/>
     <w:next w:val="Normal2"/>
@@ -5905,7 +5923,7 @@
       <w:szCs w:val="24"/>
     </w:rPr>
   </w:style>
-  <w:style w:type="paragraph" w:styleId="heading42" w:customStyle="1">
+  <w:style w:type="paragraph" w:customStyle="1" w:styleId="heading42">
     <w:name w:val="heading 42"/>
     <w:basedOn w:val="Normal2"/>
     <w:next w:val="Normal2"/>
@@ -5918,7 +5936,7 @@
       <w:szCs w:val="24"/>
     </w:rPr>
   </w:style>
-  <w:style w:type="paragraph" w:styleId="heading52" w:customStyle="1">
+  <w:style w:type="paragraph" w:customStyle="1" w:styleId="heading52">
     <w:name w:val="heading 52"/>
     <w:basedOn w:val="Normal2"/>
     <w:next w:val="Normal2"/>
@@ -5931,7 +5949,7 @@
       <w:szCs w:val="24"/>
     </w:rPr>
   </w:style>
-  <w:style w:type="paragraph" w:styleId="heading62" w:customStyle="1">
+  <w:style w:type="paragraph" w:customStyle="1" w:styleId="heading62">
     <w:name w:val="heading 62"/>
     <w:basedOn w:val="Normal2"/>
     <w:next w:val="Normal2"/>
@@ -5944,7 +5962,7 @@
       <w:szCs w:val="24"/>
     </w:rPr>
   </w:style>
-  <w:style w:type="paragraph" w:styleId="Title2" w:customStyle="1">
+  <w:style w:type="paragraph" w:customStyle="1" w:styleId="Title2">
     <w:name w:val="Title2"/>
     <w:basedOn w:val="Normal2"/>
     <w:next w:val="Normal2"/>
@@ -5959,10 +5977,10 @@
       <w:szCs w:val="72"/>
     </w:rPr>
   </w:style>
-  <w:style w:type="paragraph" w:styleId="Normal3" w:customStyle="1">
+  <w:style w:type="paragraph" w:customStyle="1" w:styleId="Normal3">
     <w:name w:val="Normal3"/>
   </w:style>
-  <w:style w:type="table" w:styleId="NormalTable3" w:customStyle="1">
+  <w:style w:type="table" w:customStyle="1" w:styleId="NormalTable3">
     <w:name w:val="Normal Table3"/>
     <w:tblPr>
       <w:tblCellMar>
@@ -5973,7 +5991,7 @@
       </w:tblCellMar>
     </w:tblPr>
   </w:style>
-  <w:style w:type="paragraph" w:styleId="heading13" w:customStyle="1">
+  <w:style w:type="paragraph" w:customStyle="1" w:styleId="heading13">
     <w:name w:val="heading 13"/>
     <w:basedOn w:val="Normal3"/>
     <w:next w:val="Normal3"/>
@@ -5988,7 +6006,7 @@
       <w:szCs w:val="28"/>
     </w:rPr>
   </w:style>
-  <w:style w:type="paragraph" w:styleId="heading23" w:customStyle="1">
+  <w:style w:type="paragraph" w:customStyle="1" w:styleId="heading23">
     <w:name w:val="heading 23"/>
     <w:basedOn w:val="Normal3"/>
     <w:next w:val="Normal3"/>
@@ -6001,7 +6019,7 @@
       <w:szCs w:val="24"/>
     </w:rPr>
   </w:style>
-  <w:style w:type="paragraph" w:styleId="heading33" w:customStyle="1">
+  <w:style w:type="paragraph" w:customStyle="1" w:styleId="heading33">
     <w:name w:val="heading 33"/>
     <w:basedOn w:val="Normal3"/>
     <w:next w:val="Normal3"/>
@@ -6014,7 +6032,7 @@
       <w:szCs w:val="24"/>
     </w:rPr>
   </w:style>
-  <w:style w:type="paragraph" w:styleId="heading43" w:customStyle="1">
+  <w:style w:type="paragraph" w:customStyle="1" w:styleId="heading43">
     <w:name w:val="heading 43"/>
     <w:basedOn w:val="Normal3"/>
     <w:next w:val="Normal3"/>
@@ -6027,7 +6045,7 @@
       <w:szCs w:val="24"/>
     </w:rPr>
   </w:style>
-  <w:style w:type="paragraph" w:styleId="heading53" w:customStyle="1">
+  <w:style w:type="paragraph" w:customStyle="1" w:styleId="heading53">
     <w:name w:val="heading 53"/>
     <w:basedOn w:val="Normal3"/>
     <w:next w:val="Normal3"/>
@@ -6040,7 +6058,7 @@
       <w:szCs w:val="24"/>
     </w:rPr>
   </w:style>
-  <w:style w:type="paragraph" w:styleId="heading63" w:customStyle="1">
+  <w:style w:type="paragraph" w:customStyle="1" w:styleId="heading63">
     <w:name w:val="heading 63"/>
     <w:basedOn w:val="Normal3"/>
     <w:next w:val="Normal3"/>
@@ -6053,7 +6071,7 @@
       <w:szCs w:val="24"/>
     </w:rPr>
   </w:style>
-  <w:style w:type="paragraph" w:styleId="Title3" w:customStyle="1">
+  <w:style w:type="paragraph" w:customStyle="1" w:styleId="Title3">
     <w:name w:val="Title3"/>
     <w:basedOn w:val="Normal3"/>
     <w:next w:val="Normal3"/>
@@ -6068,10 +6086,10 @@
       <w:szCs w:val="72"/>
     </w:rPr>
   </w:style>
-  <w:style w:type="paragraph" w:styleId="Normal4" w:customStyle="1">
+  <w:style w:type="paragraph" w:customStyle="1" w:styleId="Normal4">
     <w:name w:val="Normal4"/>
   </w:style>
-  <w:style w:type="table" w:styleId="NormalTable4" w:customStyle="1">
+  <w:style w:type="table" w:customStyle="1" w:styleId="NormalTable4">
     <w:name w:val="Normal Table4"/>
     <w:tblPr>
       <w:tblCellMar>
@@ -6082,7 +6100,7 @@
       </w:tblCellMar>
     </w:tblPr>
   </w:style>
-  <w:style w:type="paragraph" w:styleId="heading14" w:customStyle="1">
+  <w:style w:type="paragraph" w:customStyle="1" w:styleId="heading14">
     <w:name w:val="heading 14"/>
     <w:basedOn w:val="Normal4"/>
     <w:next w:val="Normal4"/>
@@ -6097,7 +6115,7 @@
       <w:szCs w:val="28"/>
     </w:rPr>
   </w:style>
-  <w:style w:type="paragraph" w:styleId="heading24" w:customStyle="1">
+  <w:style w:type="paragraph" w:customStyle="1" w:styleId="heading24">
     <w:name w:val="heading 24"/>
     <w:basedOn w:val="Normal4"/>
     <w:next w:val="Normal4"/>
@@ -6110,7 +6128,7 @@
       <w:szCs w:val="24"/>
     </w:rPr>
   </w:style>
-  <w:style w:type="paragraph" w:styleId="heading34" w:customStyle="1">
+  <w:style w:type="paragraph" w:customStyle="1" w:styleId="heading34">
     <w:name w:val="heading 34"/>
     <w:basedOn w:val="Normal4"/>
     <w:next w:val="Normal4"/>
@@ -6123,7 +6141,7 @@
       <w:szCs w:val="24"/>
     </w:rPr>
   </w:style>
-  <w:style w:type="paragraph" w:styleId="heading44" w:customStyle="1">
+  <w:style w:type="paragraph" w:customStyle="1" w:styleId="heading44">
     <w:name w:val="heading 44"/>
     <w:basedOn w:val="Normal4"/>
     <w:next w:val="Normal4"/>
@@ -6136,7 +6154,7 @@
       <w:szCs w:val="24"/>
     </w:rPr>
   </w:style>
-  <w:style w:type="paragraph" w:styleId="heading54" w:customStyle="1">
+  <w:style w:type="paragraph" w:customStyle="1" w:styleId="heading54">
     <w:name w:val="heading 54"/>
     <w:basedOn w:val="Normal4"/>
     <w:next w:val="Normal4"/>
@@ -6149,7 +6167,7 @@
       <w:szCs w:val="24"/>
     </w:rPr>
   </w:style>
-  <w:style w:type="paragraph" w:styleId="heading64" w:customStyle="1">
+  <w:style w:type="paragraph" w:customStyle="1" w:styleId="heading64">
     <w:name w:val="heading 64"/>
     <w:basedOn w:val="Normal4"/>
     <w:next w:val="Normal4"/>
@@ -6162,7 +6180,7 @@
       <w:szCs w:val="24"/>
     </w:rPr>
   </w:style>
-  <w:style w:type="paragraph" w:styleId="Title4" w:customStyle="1">
+  <w:style w:type="paragraph" w:customStyle="1" w:styleId="Title4">
     <w:name w:val="Title4"/>
     <w:basedOn w:val="Normal4"/>
     <w:next w:val="Normal4"/>
@@ -6177,10 +6195,10 @@
       <w:szCs w:val="72"/>
     </w:rPr>
   </w:style>
-  <w:style w:type="paragraph" w:styleId="Normal5" w:customStyle="1">
+  <w:style w:type="paragraph" w:customStyle="1" w:styleId="Normal5">
     <w:name w:val="Normal5"/>
   </w:style>
-  <w:style w:type="table" w:styleId="NormalTable5" w:customStyle="1">
+  <w:style w:type="table" w:customStyle="1" w:styleId="NormalTable5">
     <w:name w:val="Normal Table5"/>
     <w:tblPr>
       <w:tblCellMar>
@@ -6191,7 +6209,7 @@
       </w:tblCellMar>
     </w:tblPr>
   </w:style>
-  <w:style w:type="paragraph" w:styleId="heading15" w:customStyle="1">
+  <w:style w:type="paragraph" w:customStyle="1" w:styleId="heading15">
     <w:name w:val="heading 15"/>
     <w:basedOn w:val="Normal5"/>
     <w:next w:val="Normal5"/>
@@ -6206,7 +6224,7 @@
       <w:szCs w:val="28"/>
     </w:rPr>
   </w:style>
-  <w:style w:type="paragraph" w:styleId="heading25" w:customStyle="1">
+  <w:style w:type="paragraph" w:customStyle="1" w:styleId="heading25">
     <w:name w:val="heading 25"/>
     <w:basedOn w:val="Normal5"/>
     <w:next w:val="Normal5"/>
@@ -6219,7 +6237,7 @@
       <w:szCs w:val="24"/>
     </w:rPr>
   </w:style>
-  <w:style w:type="paragraph" w:styleId="heading35" w:customStyle="1">
+  <w:style w:type="paragraph" w:customStyle="1" w:styleId="heading35">
     <w:name w:val="heading 35"/>
     <w:basedOn w:val="Normal5"/>
     <w:next w:val="Normal5"/>
@@ -6232,7 +6250,7 @@
       <w:szCs w:val="24"/>
     </w:rPr>
   </w:style>
-  <w:style w:type="paragraph" w:styleId="heading45" w:customStyle="1">
+  <w:style w:type="paragraph" w:customStyle="1" w:styleId="heading45">
     <w:name w:val="heading 45"/>
     <w:basedOn w:val="Normal5"/>
     <w:next w:val="Normal5"/>
@@ -6245,7 +6263,7 @@
       <w:szCs w:val="24"/>
     </w:rPr>
   </w:style>
-  <w:style w:type="paragraph" w:styleId="heading55" w:customStyle="1">
+  <w:style w:type="paragraph" w:customStyle="1" w:styleId="heading55">
     <w:name w:val="heading 55"/>
     <w:basedOn w:val="Normal5"/>
     <w:next w:val="Normal5"/>
@@ -6258,7 +6276,7 @@
       <w:szCs w:val="24"/>
     </w:rPr>
   </w:style>
-  <w:style w:type="paragraph" w:styleId="heading65" w:customStyle="1">
+  <w:style w:type="paragraph" w:customStyle="1" w:styleId="heading65">
     <w:name w:val="heading 65"/>
     <w:basedOn w:val="Normal5"/>
     <w:next w:val="Normal5"/>
@@ -6271,7 +6289,7 @@
       <w:szCs w:val="24"/>
     </w:rPr>
   </w:style>
-  <w:style w:type="paragraph" w:styleId="Title5" w:customStyle="1">
+  <w:style w:type="paragraph" w:customStyle="1" w:styleId="Title5">
     <w:name w:val="Title5"/>
     <w:basedOn w:val="Normal5"/>
     <w:next w:val="Normal5"/>
@@ -6286,10 +6304,10 @@
       <w:szCs w:val="72"/>
     </w:rPr>
   </w:style>
-  <w:style w:type="paragraph" w:styleId="Normal6" w:customStyle="1">
+  <w:style w:type="paragraph" w:customStyle="1" w:styleId="Normal6">
     <w:name w:val="Normal6"/>
   </w:style>
-  <w:style w:type="table" w:styleId="NormalTable6" w:customStyle="1">
+  <w:style w:type="table" w:customStyle="1" w:styleId="NormalTable6">
     <w:name w:val="Normal Table6"/>
     <w:tblPr>
       <w:tblCellMar>
@@ -6300,7 +6318,7 @@
       </w:tblCellMar>
     </w:tblPr>
   </w:style>
-  <w:style w:type="paragraph" w:styleId="heading16" w:customStyle="1">
+  <w:style w:type="paragraph" w:customStyle="1" w:styleId="heading16">
     <w:name w:val="heading 16"/>
     <w:basedOn w:val="Normal6"/>
     <w:next w:val="Normal6"/>
@@ -6315,7 +6333,7 @@
       <w:szCs w:val="28"/>
     </w:rPr>
   </w:style>
-  <w:style w:type="paragraph" w:styleId="heading26" w:customStyle="1">
+  <w:style w:type="paragraph" w:customStyle="1" w:styleId="heading26">
     <w:name w:val="heading 26"/>
     <w:basedOn w:val="Normal6"/>
     <w:next w:val="Normal6"/>
@@ -6328,7 +6346,7 @@
       <w:szCs w:val="24"/>
     </w:rPr>
   </w:style>
-  <w:style w:type="paragraph" w:styleId="heading36" w:customStyle="1">
+  <w:style w:type="paragraph" w:customStyle="1" w:styleId="heading36">
     <w:name w:val="heading 36"/>
     <w:basedOn w:val="Normal6"/>
     <w:next w:val="Normal6"/>
@@ -6341,7 +6359,7 @@
       <w:szCs w:val="24"/>
     </w:rPr>
   </w:style>
-  <w:style w:type="paragraph" w:styleId="heading46" w:customStyle="1">
+  <w:style w:type="paragraph" w:customStyle="1" w:styleId="heading46">
     <w:name w:val="heading 46"/>
     <w:basedOn w:val="Normal6"/>
     <w:next w:val="Normal6"/>
@@ -6354,7 +6372,7 @@
       <w:szCs w:val="24"/>
     </w:rPr>
   </w:style>
-  <w:style w:type="paragraph" w:styleId="heading56" w:customStyle="1">
+  <w:style w:type="paragraph" w:customStyle="1" w:styleId="heading56">
     <w:name w:val="heading 56"/>
     <w:basedOn w:val="Normal6"/>
     <w:next w:val="Normal6"/>
@@ -6367,7 +6385,7 @@
       <w:szCs w:val="24"/>
     </w:rPr>
   </w:style>
-  <w:style w:type="paragraph" w:styleId="heading66" w:customStyle="1">
+  <w:style w:type="paragraph" w:customStyle="1" w:styleId="heading66">
     <w:name w:val="heading 66"/>
     <w:basedOn w:val="Normal6"/>
     <w:next w:val="Normal6"/>
@@ -6380,7 +6398,7 @@
       <w:szCs w:val="24"/>
     </w:rPr>
   </w:style>
-  <w:style w:type="paragraph" w:styleId="Title6" w:customStyle="1">
+  <w:style w:type="paragraph" w:customStyle="1" w:styleId="Title6">
     <w:name w:val="Title6"/>
     <w:basedOn w:val="Normal6"/>
     <w:next w:val="Normal6"/>
@@ -6395,10 +6413,10 @@
       <w:szCs w:val="72"/>
     </w:rPr>
   </w:style>
-  <w:style w:type="paragraph" w:styleId="Normal7" w:customStyle="1">
+  <w:style w:type="paragraph" w:customStyle="1" w:styleId="Normal7">
     <w:name w:val="Normal7"/>
   </w:style>
-  <w:style w:type="table" w:styleId="NormalTable7" w:customStyle="1">
+  <w:style w:type="table" w:customStyle="1" w:styleId="NormalTable7">
     <w:name w:val="Normal Table7"/>
     <w:tblPr>
       <w:tblCellMar>
@@ -6409,7 +6427,7 @@
       </w:tblCellMar>
     </w:tblPr>
   </w:style>
-  <w:style w:type="paragraph" w:styleId="heading17" w:customStyle="1">
+  <w:style w:type="paragraph" w:customStyle="1" w:styleId="heading17">
     <w:name w:val="heading 17"/>
     <w:basedOn w:val="Normal7"/>
     <w:next w:val="Normal7"/>
@@ -6424,7 +6442,7 @@
       <w:szCs w:val="28"/>
     </w:rPr>
   </w:style>
-  <w:style w:type="paragraph" w:styleId="heading27" w:customStyle="1">
+  <w:style w:type="paragraph" w:customStyle="1" w:styleId="heading27">
     <w:name w:val="heading 27"/>
     <w:basedOn w:val="Normal7"/>
     <w:next w:val="Normal7"/>
@@ -6437,7 +6455,7 @@
       <w:szCs w:val="24"/>
     </w:rPr>
   </w:style>
-  <w:style w:type="paragraph" w:styleId="heading37" w:customStyle="1">
+  <w:style w:type="paragraph" w:customStyle="1" w:styleId="heading37">
     <w:name w:val="heading 37"/>
     <w:basedOn w:val="Normal7"/>
     <w:next w:val="Normal7"/>
@@ -6450,7 +6468,7 @@
       <w:szCs w:val="24"/>
     </w:rPr>
   </w:style>
-  <w:style w:type="paragraph" w:styleId="heading47" w:customStyle="1">
+  <w:style w:type="paragraph" w:customStyle="1" w:styleId="heading47">
     <w:name w:val="heading 47"/>
     <w:basedOn w:val="Normal7"/>
     <w:next w:val="Normal7"/>
@@ -6463,7 +6481,7 @@
       <w:szCs w:val="24"/>
     </w:rPr>
   </w:style>
-  <w:style w:type="paragraph" w:styleId="heading57" w:customStyle="1">
+  <w:style w:type="paragraph" w:customStyle="1" w:styleId="heading57">
     <w:name w:val="heading 57"/>
     <w:basedOn w:val="Normal7"/>
     <w:next w:val="Normal7"/>
@@ -6476,7 +6494,7 @@
       <w:szCs w:val="24"/>
     </w:rPr>
   </w:style>
-  <w:style w:type="paragraph" w:styleId="heading67" w:customStyle="1">
+  <w:style w:type="paragraph" w:customStyle="1" w:styleId="heading67">
     <w:name w:val="heading 67"/>
     <w:basedOn w:val="Normal7"/>
     <w:next w:val="Normal7"/>
@@ -6489,7 +6507,7 @@
       <w:szCs w:val="24"/>
     </w:rPr>
   </w:style>
-  <w:style w:type="paragraph" w:styleId="Title7" w:customStyle="1">
+  <w:style w:type="paragraph" w:customStyle="1" w:styleId="Title7">
     <w:name w:val="Title7"/>
     <w:basedOn w:val="Normal7"/>
     <w:next w:val="Normal7"/>
@@ -6504,10 +6522,10 @@
       <w:szCs w:val="72"/>
     </w:rPr>
   </w:style>
-  <w:style w:type="paragraph" w:styleId="Normal8" w:customStyle="1">
+  <w:style w:type="paragraph" w:customStyle="1" w:styleId="Normal8">
     <w:name w:val="Normal8"/>
   </w:style>
-  <w:style w:type="table" w:styleId="NormalTable8" w:customStyle="1">
+  <w:style w:type="table" w:customStyle="1" w:styleId="NormalTable8">
     <w:name w:val="Normal Table8"/>
     <w:tblPr>
       <w:tblCellMar>
@@ -6518,7 +6536,7 @@
       </w:tblCellMar>
     </w:tblPr>
   </w:style>
-  <w:style w:type="paragraph" w:styleId="heading18" w:customStyle="1">
+  <w:style w:type="paragraph" w:customStyle="1" w:styleId="heading18">
     <w:name w:val="heading 18"/>
     <w:basedOn w:val="Normal8"/>
     <w:next w:val="Normal8"/>
@@ -6533,7 +6551,7 @@
       <w:szCs w:val="28"/>
     </w:rPr>
   </w:style>
-  <w:style w:type="paragraph" w:styleId="heading28" w:customStyle="1">
+  <w:style w:type="paragraph" w:customStyle="1" w:styleId="heading28">
     <w:name w:val="heading 28"/>
     <w:basedOn w:val="Normal8"/>
     <w:next w:val="Normal8"/>
@@ -6546,7 +6564,7 @@
       <w:szCs w:val="24"/>
     </w:rPr>
   </w:style>
-  <w:style w:type="paragraph" w:styleId="heading38" w:customStyle="1">
+  <w:style w:type="paragraph" w:customStyle="1" w:styleId="heading38">
     <w:name w:val="heading 38"/>
     <w:basedOn w:val="Normal8"/>
     <w:next w:val="Normal8"/>
@@ -6559,7 +6577,7 @@
       <w:szCs w:val="24"/>
     </w:rPr>
   </w:style>
-  <w:style w:type="paragraph" w:styleId="heading48" w:customStyle="1">
+  <w:style w:type="paragraph" w:customStyle="1" w:styleId="heading48">
     <w:name w:val="heading 48"/>
     <w:basedOn w:val="Normal8"/>
     <w:next w:val="Normal8"/>
@@ -6572,7 +6590,7 @@
       <w:szCs w:val="24"/>
     </w:rPr>
   </w:style>
-  <w:style w:type="paragraph" w:styleId="heading58" w:customStyle="1">
+  <w:style w:type="paragraph" w:customStyle="1" w:styleId="heading58">
     <w:name w:val="heading 58"/>
     <w:basedOn w:val="Normal8"/>
     <w:next w:val="Normal8"/>
@@ -6585,7 +6603,7 @@
       <w:szCs w:val="24"/>
     </w:rPr>
   </w:style>
-  <w:style w:type="paragraph" w:styleId="heading68" w:customStyle="1">
+  <w:style w:type="paragraph" w:customStyle="1" w:styleId="heading68">
     <w:name w:val="heading 68"/>
     <w:basedOn w:val="Normal8"/>
     <w:next w:val="Normal8"/>
@@ -6598,7 +6616,7 @@
       <w:szCs w:val="24"/>
     </w:rPr>
   </w:style>
-  <w:style w:type="paragraph" w:styleId="Title8" w:customStyle="1">
+  <w:style w:type="paragraph" w:customStyle="1" w:styleId="Title8">
     <w:name w:val="Title8"/>
     <w:basedOn w:val="Normal8"/>
     <w:next w:val="Normal8"/>
@@ -6613,10 +6631,10 @@
       <w:szCs w:val="72"/>
     </w:rPr>
   </w:style>
-  <w:style w:type="paragraph" w:styleId="Normal9" w:customStyle="1">
+  <w:style w:type="paragraph" w:customStyle="1" w:styleId="Normal9">
     <w:name w:val="Normal9"/>
   </w:style>
-  <w:style w:type="table" w:styleId="NormalTable9" w:customStyle="1">
+  <w:style w:type="table" w:customStyle="1" w:styleId="NormalTable9">
     <w:name w:val="Normal Table9"/>
     <w:tblPr>
       <w:tblCellMar>
@@ -6627,7 +6645,7 @@
       </w:tblCellMar>
     </w:tblPr>
   </w:style>
-  <w:style w:type="paragraph" w:styleId="heading19" w:customStyle="1">
+  <w:style w:type="paragraph" w:customStyle="1" w:styleId="heading19">
     <w:name w:val="heading 19"/>
     <w:basedOn w:val="Normal9"/>
     <w:next w:val="Normal9"/>
@@ -6642,7 +6660,7 @@
       <w:szCs w:val="28"/>
     </w:rPr>
   </w:style>
-  <w:style w:type="paragraph" w:styleId="heading29" w:customStyle="1">
+  <w:style w:type="paragraph" w:customStyle="1" w:styleId="heading29">
     <w:name w:val="heading 29"/>
     <w:basedOn w:val="Normal9"/>
     <w:next w:val="Normal9"/>
@@ -6655,7 +6673,7 @@
       <w:szCs w:val="24"/>
     </w:rPr>
   </w:style>
-  <w:style w:type="paragraph" w:styleId="heading39" w:customStyle="1">
+  <w:style w:type="paragraph" w:customStyle="1" w:styleId="heading39">
     <w:name w:val="heading 39"/>
     <w:basedOn w:val="Normal9"/>
     <w:next w:val="Normal9"/>
@@ -6668,7 +6686,7 @@
       <w:szCs w:val="24"/>
     </w:rPr>
   </w:style>
-  <w:style w:type="paragraph" w:styleId="heading49" w:customStyle="1">
+  <w:style w:type="paragraph" w:customStyle="1" w:styleId="heading49">
     <w:name w:val="heading 49"/>
     <w:basedOn w:val="Normal9"/>
     <w:next w:val="Normal9"/>
@@ -6681,7 +6699,7 @@
       <w:szCs w:val="24"/>
     </w:rPr>
   </w:style>
-  <w:style w:type="paragraph" w:styleId="heading59" w:customStyle="1">
+  <w:style w:type="paragraph" w:customStyle="1" w:styleId="heading59">
     <w:name w:val="heading 59"/>
     <w:basedOn w:val="Normal9"/>
     <w:next w:val="Normal9"/>
@@ -6694,7 +6712,7 @@
       <w:szCs w:val="24"/>
     </w:rPr>
   </w:style>
-  <w:style w:type="paragraph" w:styleId="heading69" w:customStyle="1">
+  <w:style w:type="paragraph" w:customStyle="1" w:styleId="heading69">
     <w:name w:val="heading 69"/>
     <w:basedOn w:val="Normal9"/>
     <w:next w:val="Normal9"/>
@@ -6707,7 +6725,7 @@
       <w:szCs w:val="24"/>
     </w:rPr>
   </w:style>
-  <w:style w:type="paragraph" w:styleId="Title9" w:customStyle="1">
+  <w:style w:type="paragraph" w:customStyle="1" w:styleId="Title9">
     <w:name w:val="Title9"/>
     <w:basedOn w:val="Normal9"/>
     <w:next w:val="Normal9"/>
@@ -6722,10 +6740,10 @@
       <w:szCs w:val="72"/>
     </w:rPr>
   </w:style>
-  <w:style w:type="paragraph" w:styleId="Normal10" w:customStyle="1">
+  <w:style w:type="paragraph" w:customStyle="1" w:styleId="Normal10">
     <w:name w:val="Normal10"/>
   </w:style>
-  <w:style w:type="table" w:styleId="NormalTable10" w:customStyle="1">
+  <w:style w:type="table" w:customStyle="1" w:styleId="NormalTable10">
     <w:name w:val="Normal Table10"/>
     <w:tblPr>
       <w:tblCellMar>
@@ -6736,7 +6754,7 @@
       </w:tblCellMar>
     </w:tblPr>
   </w:style>
-  <w:style w:type="paragraph" w:styleId="heading110" w:customStyle="1">
+  <w:style w:type="paragraph" w:customStyle="1" w:styleId="heading110">
     <w:name w:val="heading 110"/>
     <w:basedOn w:val="Normal10"/>
     <w:next w:val="Normal10"/>
@@ -6751,7 +6769,7 @@
       <w:szCs w:val="28"/>
     </w:rPr>
   </w:style>
-  <w:style w:type="paragraph" w:styleId="heading210" w:customStyle="1">
+  <w:style w:type="paragraph" w:customStyle="1" w:styleId="heading210">
     <w:name w:val="heading 210"/>
     <w:basedOn w:val="Normal10"/>
     <w:next w:val="Normal10"/>
@@ -6764,7 +6782,7 @@
       <w:szCs w:val="24"/>
     </w:rPr>
   </w:style>
-  <w:style w:type="paragraph" w:styleId="heading310" w:customStyle="1">
+  <w:style w:type="paragraph" w:customStyle="1" w:styleId="heading310">
     <w:name w:val="heading 310"/>
     <w:basedOn w:val="Normal10"/>
     <w:next w:val="Normal10"/>
@@ -6777,7 +6795,7 @@
       <w:szCs w:val="24"/>
     </w:rPr>
   </w:style>
-  <w:style w:type="paragraph" w:styleId="heading410" w:customStyle="1">
+  <w:style w:type="paragraph" w:customStyle="1" w:styleId="heading410">
     <w:name w:val="heading 410"/>
     <w:basedOn w:val="Normal10"/>
     <w:next w:val="Normal10"/>
@@ -6790,7 +6808,7 @@
       <w:szCs w:val="24"/>
     </w:rPr>
   </w:style>
-  <w:style w:type="paragraph" w:styleId="heading510" w:customStyle="1">
+  <w:style w:type="paragraph" w:customStyle="1" w:styleId="heading510">
     <w:name w:val="heading 510"/>
     <w:basedOn w:val="Normal10"/>
     <w:next w:val="Normal10"/>
@@ -6803,7 +6821,7 @@
       <w:szCs w:val="24"/>
     </w:rPr>
   </w:style>
-  <w:style w:type="paragraph" w:styleId="heading610" w:customStyle="1">
+  <w:style w:type="paragraph" w:customStyle="1" w:styleId="heading610">
     <w:name w:val="heading 610"/>
     <w:basedOn w:val="Normal10"/>
     <w:next w:val="Normal10"/>
@@ -6816,7 +6834,7 @@
       <w:szCs w:val="24"/>
     </w:rPr>
   </w:style>
-  <w:style w:type="paragraph" w:styleId="Title10" w:customStyle="1">
+  <w:style w:type="paragraph" w:customStyle="1" w:styleId="Title10">
     <w:name w:val="Title10"/>
     <w:basedOn w:val="Normal10"/>
     <w:next w:val="Normal10"/>
@@ -6831,10 +6849,10 @@
       <w:szCs w:val="72"/>
     </w:rPr>
   </w:style>
-  <w:style w:type="paragraph" w:styleId="Normal11" w:customStyle="1">
+  <w:style w:type="paragraph" w:customStyle="1" w:styleId="Normal11">
     <w:name w:val="Normal11"/>
   </w:style>
-  <w:style w:type="table" w:styleId="NormalTable11" w:customStyle="1">
+  <w:style w:type="table" w:customStyle="1" w:styleId="NormalTable11">
     <w:name w:val="Normal Table11"/>
     <w:tblPr>
       <w:tblCellMar>
@@ -6845,7 +6863,7 @@
       </w:tblCellMar>
     </w:tblPr>
   </w:style>
-  <w:style w:type="paragraph" w:styleId="heading111" w:customStyle="1">
+  <w:style w:type="paragraph" w:customStyle="1" w:styleId="heading111">
     <w:name w:val="heading 111"/>
     <w:basedOn w:val="Normal11"/>
     <w:next w:val="Normal11"/>
@@ -6860,7 +6878,7 @@
       <w:szCs w:val="28"/>
     </w:rPr>
   </w:style>
-  <w:style w:type="paragraph" w:styleId="heading211" w:customStyle="1">
+  <w:style w:type="paragraph" w:customStyle="1" w:styleId="heading211">
     <w:name w:val="heading 211"/>
     <w:basedOn w:val="Normal11"/>
     <w:next w:val="Normal11"/>
@@ -6873,7 +6891,7 @@
       <w:szCs w:val="24"/>
     </w:rPr>
   </w:style>
-  <w:style w:type="paragraph" w:styleId="heading311" w:customStyle="1">
+  <w:style w:type="paragraph" w:customStyle="1" w:styleId="heading311">
     <w:name w:val="heading 311"/>
     <w:basedOn w:val="Normal11"/>
     <w:next w:val="Normal11"/>
@@ -6886,7 +6904,7 @@
       <w:szCs w:val="24"/>
     </w:rPr>
   </w:style>
-  <w:style w:type="paragraph" w:styleId="heading411" w:customStyle="1">
+  <w:style w:type="paragraph" w:customStyle="1" w:styleId="heading411">
     <w:name w:val="heading 411"/>
     <w:basedOn w:val="Normal11"/>
     <w:next w:val="Normal11"/>
@@ -6899,7 +6917,7 @@
       <w:szCs w:val="24"/>
     </w:rPr>
   </w:style>
-  <w:style w:type="paragraph" w:styleId="heading511" w:customStyle="1">
+  <w:style w:type="paragraph" w:customStyle="1" w:styleId="heading511">
     <w:name w:val="heading 511"/>
     <w:basedOn w:val="Normal11"/>
     <w:next w:val="Normal11"/>
@@ -6912,7 +6930,7 @@
       <w:szCs w:val="24"/>
     </w:rPr>
   </w:style>
-  <w:style w:type="paragraph" w:styleId="heading611" w:customStyle="1">
+  <w:style w:type="paragraph" w:customStyle="1" w:styleId="heading611">
     <w:name w:val="heading 611"/>
     <w:basedOn w:val="Normal11"/>
     <w:next w:val="Normal11"/>
@@ -6925,7 +6943,7 @@
       <w:szCs w:val="24"/>
     </w:rPr>
   </w:style>
-  <w:style w:type="paragraph" w:styleId="Title11" w:customStyle="1">
+  <w:style w:type="paragraph" w:customStyle="1" w:styleId="Title11">
     <w:name w:val="Title11"/>
     <w:basedOn w:val="Normal11"/>
     <w:next w:val="Normal11"/>
@@ -6940,10 +6958,10 @@
       <w:szCs w:val="72"/>
     </w:rPr>
   </w:style>
-  <w:style w:type="paragraph" w:styleId="Normal12" w:customStyle="1">
+  <w:style w:type="paragraph" w:customStyle="1" w:styleId="Normal12">
     <w:name w:val="Normal12"/>
   </w:style>
-  <w:style w:type="table" w:styleId="NormalTable12" w:customStyle="1">
+  <w:style w:type="table" w:customStyle="1" w:styleId="NormalTable12">
     <w:name w:val="Normal Table12"/>
     <w:tblPr>
       <w:tblCellMar>
@@ -6954,7 +6972,7 @@
       </w:tblCellMar>
     </w:tblPr>
   </w:style>
-  <w:style w:type="paragraph" w:styleId="heading112" w:customStyle="1">
+  <w:style w:type="paragraph" w:customStyle="1" w:styleId="heading112">
     <w:name w:val="heading 112"/>
     <w:basedOn w:val="Normal12"/>
     <w:next w:val="Normal12"/>
@@ -6969,7 +6987,7 @@
       <w:szCs w:val="28"/>
     </w:rPr>
   </w:style>
-  <w:style w:type="paragraph" w:styleId="heading212" w:customStyle="1">
+  <w:style w:type="paragraph" w:customStyle="1" w:styleId="heading212">
     <w:name w:val="heading 212"/>
     <w:basedOn w:val="Normal12"/>
     <w:next w:val="Normal12"/>
@@ -6982,7 +7000,7 @@
       <w:szCs w:val="24"/>
     </w:rPr>
   </w:style>
-  <w:style w:type="paragraph" w:styleId="heading312" w:customStyle="1">
+  <w:style w:type="paragraph" w:customStyle="1" w:styleId="heading312">
     <w:name w:val="heading 312"/>
     <w:basedOn w:val="Normal12"/>
     <w:next w:val="Normal12"/>
@@ -6995,7 +7013,7 @@
       <w:szCs w:val="24"/>
     </w:rPr>
   </w:style>
-  <w:style w:type="paragraph" w:styleId="heading412" w:customStyle="1">
+  <w:style w:type="paragraph" w:customStyle="1" w:styleId="heading412">
     <w:name w:val="heading 412"/>
     <w:basedOn w:val="Normal12"/>
     <w:next w:val="Normal12"/>
@@ -7008,7 +7026,7 @@
       <w:szCs w:val="24"/>
     </w:rPr>
   </w:style>
-  <w:style w:type="paragraph" w:styleId="heading512" w:customStyle="1">
+  <w:style w:type="paragraph" w:customStyle="1" w:styleId="heading512">
     <w:name w:val="heading 512"/>
     <w:basedOn w:val="Normal12"/>
     <w:next w:val="Normal12"/>
@@ -7021,7 +7039,7 @@
       <w:szCs w:val="24"/>
     </w:rPr>
   </w:style>
-  <w:style w:type="paragraph" w:styleId="heading612" w:customStyle="1">
+  <w:style w:type="paragraph" w:customStyle="1" w:styleId="heading612">
     <w:name w:val="heading 612"/>
     <w:basedOn w:val="Normal12"/>
     <w:next w:val="Normal12"/>
@@ -7034,7 +7052,7 @@
       <w:szCs w:val="24"/>
     </w:rPr>
   </w:style>
-  <w:style w:type="paragraph" w:styleId="Title12" w:customStyle="1">
+  <w:style w:type="paragraph" w:customStyle="1" w:styleId="Title12">
     <w:name w:val="Title12"/>
     <w:basedOn w:val="Normal12"/>
     <w:next w:val="Normal12"/>
@@ -7049,10 +7067,10 @@
       <w:szCs w:val="72"/>
     </w:rPr>
   </w:style>
-  <w:style w:type="paragraph" w:styleId="Normal13" w:customStyle="1">
+  <w:style w:type="paragraph" w:customStyle="1" w:styleId="Normal13">
     <w:name w:val="Normal13"/>
   </w:style>
-  <w:style w:type="table" w:styleId="NormalTable13" w:customStyle="1">
+  <w:style w:type="table" w:customStyle="1" w:styleId="NormalTable13">
     <w:name w:val="Normal Table13"/>
     <w:tblPr>
       <w:tblCellMar>
@@ -7063,7 +7081,7 @@
       </w:tblCellMar>
     </w:tblPr>
   </w:style>
-  <w:style w:type="paragraph" w:styleId="heading113" w:customStyle="1">
+  <w:style w:type="paragraph" w:customStyle="1" w:styleId="heading113">
     <w:name w:val="heading 113"/>
     <w:basedOn w:val="Normal13"/>
     <w:next w:val="Normal13"/>
@@ -7078,7 +7096,7 @@
       <w:szCs w:val="28"/>
     </w:rPr>
   </w:style>
-  <w:style w:type="paragraph" w:styleId="heading213" w:customStyle="1">
+  <w:style w:type="paragraph" w:customStyle="1" w:styleId="heading213">
     <w:name w:val="heading 213"/>
     <w:basedOn w:val="Normal13"/>
     <w:next w:val="Normal13"/>
@@ -7091,7 +7109,7 @@
       <w:szCs w:val="24"/>
     </w:rPr>
   </w:style>
-  <w:style w:type="paragraph" w:styleId="heading313" w:customStyle="1">
+  <w:style w:type="paragraph" w:customStyle="1" w:styleId="heading313">
     <w:name w:val="heading 313"/>
     <w:basedOn w:val="Normal13"/>
     <w:next w:val="Normal13"/>
@@ -7104,7 +7122,7 @@
       <w:szCs w:val="24"/>
     </w:rPr>
   </w:style>
-  <w:style w:type="paragraph" w:styleId="heading413" w:customStyle="1">
+  <w:style w:type="paragraph" w:customStyle="1" w:styleId="heading413">
     <w:name w:val="heading 413"/>
     <w:basedOn w:val="Normal13"/>
     <w:next w:val="Normal13"/>
@@ -7117,7 +7135,7 @@
       <w:szCs w:val="24"/>
     </w:rPr>
   </w:style>
-  <w:style w:type="paragraph" w:styleId="heading513" w:customStyle="1">
+  <w:style w:type="paragraph" w:customStyle="1" w:styleId="heading513">
     <w:name w:val="heading 513"/>
     <w:basedOn w:val="Normal13"/>
     <w:next w:val="Normal13"/>
@@ -7130,7 +7148,7 @@
       <w:szCs w:val="24"/>
     </w:rPr>
   </w:style>
-  <w:style w:type="paragraph" w:styleId="heading613" w:customStyle="1">
+  <w:style w:type="paragraph" w:customStyle="1" w:styleId="heading613">
     <w:name w:val="heading 613"/>
     <w:basedOn w:val="Normal13"/>
     <w:next w:val="Normal13"/>
@@ -7143,7 +7161,7 @@
       <w:szCs w:val="24"/>
     </w:rPr>
   </w:style>
-  <w:style w:type="paragraph" w:styleId="Title13" w:customStyle="1">
+  <w:style w:type="paragraph" w:customStyle="1" w:styleId="Title13">
     <w:name w:val="Title13"/>
     <w:basedOn w:val="Normal13"/>
     <w:next w:val="Normal13"/>
@@ -7158,10 +7176,10 @@
       <w:szCs w:val="72"/>
     </w:rPr>
   </w:style>
-  <w:style w:type="paragraph" w:styleId="Normal14" w:customStyle="1">
+  <w:style w:type="paragraph" w:customStyle="1" w:styleId="Normal14">
     <w:name w:val="Normal14"/>
   </w:style>
-  <w:style w:type="table" w:styleId="NormalTable14" w:customStyle="1">
+  <w:style w:type="table" w:customStyle="1" w:styleId="NormalTable14">
     <w:name w:val="Normal Table14"/>
     <w:tblPr>
       <w:tblCellMar>
@@ -7172,7 +7190,7 @@
       </w:tblCellMar>
     </w:tblPr>
   </w:style>
-  <w:style w:type="paragraph" w:styleId="heading114" w:customStyle="1">
+  <w:style w:type="paragraph" w:customStyle="1" w:styleId="heading114">
     <w:name w:val="heading 114"/>
     <w:basedOn w:val="Normal14"/>
     <w:next w:val="Normal14"/>
@@ -7187,7 +7205,7 @@
       <w:szCs w:val="28"/>
     </w:rPr>
   </w:style>
-  <w:style w:type="paragraph" w:styleId="heading214" w:customStyle="1">
+  <w:style w:type="paragraph" w:customStyle="1" w:styleId="heading214">
     <w:name w:val="heading 214"/>
     <w:basedOn w:val="Normal14"/>
     <w:next w:val="Normal14"/>
@@ -7200,7 +7218,7 @@
       <w:szCs w:val="24"/>
     </w:rPr>
   </w:style>
-  <w:style w:type="paragraph" w:styleId="heading314" w:customStyle="1">
+  <w:style w:type="paragraph" w:customStyle="1" w:styleId="heading314">
     <w:name w:val="heading 314"/>
     <w:basedOn w:val="Normal14"/>
     <w:next w:val="Normal14"/>
@@ -7213,7 +7231,7 @@
       <w:szCs w:val="24"/>
     </w:rPr>
   </w:style>
-  <w:style w:type="paragraph" w:styleId="heading414" w:customStyle="1">
+  <w:style w:type="paragraph" w:customStyle="1" w:styleId="heading414">
     <w:name w:val="heading 414"/>
     <w:basedOn w:val="Normal14"/>
     <w:next w:val="Normal14"/>
@@ -7226,7 +7244,7 @@
       <w:szCs w:val="24"/>
     </w:rPr>
   </w:style>
-  <w:style w:type="paragraph" w:styleId="heading514" w:customStyle="1">
+  <w:style w:type="paragraph" w:customStyle="1" w:styleId="heading514">
     <w:name w:val="heading 514"/>
     <w:basedOn w:val="Normal14"/>
     <w:next w:val="Normal14"/>
@@ -7239,7 +7257,7 @@
       <w:szCs w:val="24"/>
     </w:rPr>
   </w:style>
-  <w:style w:type="paragraph" w:styleId="heading614" w:customStyle="1">
+  <w:style w:type="paragraph" w:customStyle="1" w:styleId="heading614">
     <w:name w:val="heading 614"/>
     <w:basedOn w:val="Normal14"/>
     <w:next w:val="Normal14"/>
@@ -7252,7 +7270,7 @@
       <w:szCs w:val="24"/>
     </w:rPr>
   </w:style>
-  <w:style w:type="paragraph" w:styleId="Title14" w:customStyle="1">
+  <w:style w:type="paragraph" w:customStyle="1" w:styleId="Title14">
     <w:name w:val="Title14"/>
     <w:basedOn w:val="Normal14"/>
     <w:next w:val="Normal14"/>
@@ -7267,10 +7285,10 @@
       <w:szCs w:val="72"/>
     </w:rPr>
   </w:style>
-  <w:style w:type="paragraph" w:styleId="Normal15" w:customStyle="1">
+  <w:style w:type="paragraph" w:customStyle="1" w:styleId="Normal15">
     <w:name w:val="Normal15"/>
   </w:style>
-  <w:style w:type="table" w:styleId="NormalTable15" w:customStyle="1">
+  <w:style w:type="table" w:customStyle="1" w:styleId="NormalTable15">
     <w:name w:val="Normal Table15"/>
     <w:tblPr>
       <w:tblCellMar>
@@ -7281,7 +7299,7 @@
       </w:tblCellMar>
     </w:tblPr>
   </w:style>
-  <w:style w:type="paragraph" w:styleId="heading115" w:customStyle="1">
+  <w:style w:type="paragraph" w:customStyle="1" w:styleId="heading115">
     <w:name w:val="heading 115"/>
     <w:basedOn w:val="Normal15"/>
     <w:next w:val="Normal15"/>
@@ -7296,7 +7314,7 @@
       <w:szCs w:val="28"/>
     </w:rPr>
   </w:style>
-  <w:style w:type="paragraph" w:styleId="heading215" w:customStyle="1">
+  <w:style w:type="paragraph" w:customStyle="1" w:styleId="heading215">
     <w:name w:val="heading 215"/>
     <w:basedOn w:val="Normal15"/>
     <w:next w:val="Normal15"/>
@@ -7309,7 +7327,7 @@
       <w:szCs w:val="24"/>
     </w:rPr>
   </w:style>
-  <w:style w:type="paragraph" w:styleId="heading315" w:customStyle="1">
+  <w:style w:type="paragraph" w:customStyle="1" w:styleId="heading315">
     <w:name w:val="heading 315"/>
     <w:basedOn w:val="Normal15"/>
     <w:next w:val="Normal15"/>
@@ -7322,7 +7340,7 @@
       <w:szCs w:val="24"/>
     </w:rPr>
   </w:style>
-  <w:style w:type="paragraph" w:styleId="heading415" w:customStyle="1">
+  <w:style w:type="paragraph" w:customStyle="1" w:styleId="heading415">
     <w:name w:val="heading 415"/>
     <w:basedOn w:val="Normal15"/>
     <w:next w:val="Normal15"/>
@@ -7335,7 +7353,7 @@
       <w:szCs w:val="24"/>
     </w:rPr>
   </w:style>
-  <w:style w:type="paragraph" w:styleId="heading515" w:customStyle="1">
+  <w:style w:type="paragraph" w:customStyle="1" w:styleId="heading515">
     <w:name w:val="heading 515"/>
     <w:basedOn w:val="Normal15"/>
     <w:next w:val="Normal15"/>
@@ -7348,7 +7366,7 @@
       <w:szCs w:val="24"/>
     </w:rPr>
   </w:style>
-  <w:style w:type="paragraph" w:styleId="heading615" w:customStyle="1">
+  <w:style w:type="paragraph" w:customStyle="1" w:styleId="heading615">
     <w:name w:val="heading 615"/>
     <w:basedOn w:val="Normal15"/>
     <w:next w:val="Normal15"/>
@@ -7361,7 +7379,7 @@
       <w:szCs w:val="24"/>
     </w:rPr>
   </w:style>
-  <w:style w:type="paragraph" w:styleId="Title15" w:customStyle="1">
+  <w:style w:type="paragraph" w:customStyle="1" w:styleId="Title15">
     <w:name w:val="Title15"/>
     <w:basedOn w:val="Normal15"/>
     <w:next w:val="Normal15"/>
@@ -7388,14 +7406,14 @@
       <w:spacing w:before="360" w:after="80"/>
     </w:pPr>
     <w:rPr>
-      <w:rFonts w:ascii="Georgia" w:hAnsi="Georgia" w:eastAsia="Georgia" w:cs="Georgia"/>
+      <w:rFonts w:ascii="Georgia" w:eastAsia="Georgia" w:hAnsi="Georgia" w:cs="Georgia"/>
       <w:i/>
       <w:color w:val="666666"/>
       <w:sz w:val="48"/>
       <w:szCs w:val="48"/>
     </w:rPr>
   </w:style>
-  <w:style w:type="paragraph" w:styleId="Subtitle0" w:customStyle="1">
+  <w:style w:type="paragraph" w:customStyle="1" w:styleId="Subtitle0">
     <w:name w:val="Subtitle0"/>
     <w:basedOn w:val="Normal15"/>
     <w:next w:val="Normal15"/>
@@ -7405,14 +7423,14 @@
       <w:spacing w:before="360" w:after="80"/>
     </w:pPr>
     <w:rPr>
-      <w:rFonts w:ascii="Georgia" w:hAnsi="Georgia" w:eastAsia="Georgia" w:cs="Georgia"/>
+      <w:rFonts w:ascii="Georgia" w:eastAsia="Georgia" w:hAnsi="Georgia" w:cs="Georgia"/>
       <w:i/>
       <w:color w:val="666666"/>
       <w:sz w:val="48"/>
       <w:szCs w:val="48"/>
     </w:rPr>
   </w:style>
-  <w:style w:type="paragraph" w:styleId="Subtitle1" w:customStyle="1">
+  <w:style w:type="paragraph" w:customStyle="1" w:styleId="Subtitle1">
     <w:name w:val="Subtitle1"/>
     <w:basedOn w:val="Normal15"/>
     <w:next w:val="Normal15"/>
@@ -7422,14 +7440,14 @@
       <w:spacing w:before="360" w:after="80"/>
     </w:pPr>
     <w:rPr>
-      <w:rFonts w:ascii="Georgia" w:hAnsi="Georgia" w:eastAsia="Georgia" w:cs="Georgia"/>
+      <w:rFonts w:ascii="Georgia" w:eastAsia="Georgia" w:hAnsi="Georgia" w:cs="Georgia"/>
       <w:i/>
       <w:color w:val="666666"/>
       <w:sz w:val="48"/>
       <w:szCs w:val="48"/>
     </w:rPr>
   </w:style>
-  <w:style w:type="paragraph" w:styleId="Subtitle2" w:customStyle="1">
+  <w:style w:type="paragraph" w:customStyle="1" w:styleId="Subtitle2">
     <w:name w:val="Subtitle2"/>
     <w:basedOn w:val="Normal15"/>
     <w:next w:val="Normal15"/>
@@ -7439,14 +7457,14 @@
       <w:spacing w:before="360" w:after="80"/>
     </w:pPr>
     <w:rPr>
-      <w:rFonts w:ascii="Georgia" w:hAnsi="Georgia" w:eastAsia="Georgia" w:cs="Georgia"/>
+      <w:rFonts w:ascii="Georgia" w:eastAsia="Georgia" w:hAnsi="Georgia" w:cs="Georgia"/>
       <w:i/>
       <w:color w:val="666666"/>
       <w:sz w:val="48"/>
       <w:szCs w:val="48"/>
     </w:rPr>
   </w:style>
-  <w:style w:type="paragraph" w:styleId="Subtitle3" w:customStyle="1">
+  <w:style w:type="paragraph" w:customStyle="1" w:styleId="Subtitle3">
     <w:name w:val="Subtitle3"/>
     <w:basedOn w:val="Normal15"/>
     <w:next w:val="Normal15"/>
@@ -7456,14 +7474,14 @@
       <w:spacing w:before="360" w:after="80"/>
     </w:pPr>
     <w:rPr>
-      <w:rFonts w:ascii="Georgia" w:hAnsi="Georgia" w:eastAsia="Georgia" w:cs="Georgia"/>
+      <w:rFonts w:ascii="Georgia" w:eastAsia="Georgia" w:hAnsi="Georgia" w:cs="Georgia"/>
       <w:i/>
       <w:color w:val="666666"/>
       <w:sz w:val="48"/>
       <w:szCs w:val="48"/>
     </w:rPr>
   </w:style>
-  <w:style w:type="paragraph" w:styleId="Subtitle4" w:customStyle="1">
+  <w:style w:type="paragraph" w:customStyle="1" w:styleId="Subtitle4">
     <w:name w:val="Subtitle4"/>
     <w:basedOn w:val="Normal15"/>
     <w:next w:val="Normal15"/>
@@ -7473,14 +7491,14 @@
       <w:spacing w:before="360" w:after="80"/>
     </w:pPr>
     <w:rPr>
-      <w:rFonts w:ascii="Georgia" w:hAnsi="Georgia" w:eastAsia="Georgia" w:cs="Georgia"/>
+      <w:rFonts w:ascii="Georgia" w:eastAsia="Georgia" w:hAnsi="Georgia" w:cs="Georgia"/>
       <w:i/>
       <w:color w:val="666666"/>
       <w:sz w:val="48"/>
       <w:szCs w:val="48"/>
     </w:rPr>
   </w:style>
-  <w:style w:type="paragraph" w:styleId="Subtitle5" w:customStyle="1">
+  <w:style w:type="paragraph" w:customStyle="1" w:styleId="Subtitle5">
     <w:name w:val="Subtitle5"/>
     <w:basedOn w:val="Normal15"/>
     <w:next w:val="Normal15"/>
@@ -7490,14 +7508,14 @@
       <w:spacing w:before="360" w:after="80"/>
     </w:pPr>
     <w:rPr>
-      <w:rFonts w:ascii="Georgia" w:hAnsi="Georgia" w:eastAsia="Georgia" w:cs="Georgia"/>
+      <w:rFonts w:ascii="Georgia" w:eastAsia="Georgia" w:hAnsi="Georgia" w:cs="Georgia"/>
       <w:i/>
       <w:color w:val="666666"/>
       <w:sz w:val="48"/>
       <w:szCs w:val="48"/>
     </w:rPr>
   </w:style>
-  <w:style w:type="paragraph" w:styleId="Subtitle6" w:customStyle="1">
+  <w:style w:type="paragraph" w:customStyle="1" w:styleId="Subtitle6">
     <w:name w:val="Subtitle6"/>
     <w:basedOn w:val="Normal15"/>
     <w:next w:val="Normal15"/>
@@ -7507,14 +7525,14 @@
       <w:spacing w:before="360" w:after="80"/>
     </w:pPr>
     <w:rPr>
-      <w:rFonts w:ascii="Georgia" w:hAnsi="Georgia" w:eastAsia="Georgia" w:cs="Georgia"/>
+      <w:rFonts w:ascii="Georgia" w:eastAsia="Georgia" w:hAnsi="Georgia" w:cs="Georgia"/>
       <w:i/>
       <w:color w:val="666666"/>
       <w:sz w:val="48"/>
       <w:szCs w:val="48"/>
     </w:rPr>
   </w:style>
-  <w:style w:type="paragraph" w:styleId="Subtitle7" w:customStyle="1">
+  <w:style w:type="paragraph" w:customStyle="1" w:styleId="Subtitle7">
     <w:name w:val="Subtitle7"/>
     <w:basedOn w:val="Normal15"/>
     <w:next w:val="Normal15"/>
@@ -7524,14 +7542,14 @@
       <w:spacing w:before="360" w:after="80"/>
     </w:pPr>
     <w:rPr>
-      <w:rFonts w:ascii="Georgia" w:hAnsi="Georgia" w:eastAsia="Georgia" w:cs="Georgia"/>
+      <w:rFonts w:ascii="Georgia" w:eastAsia="Georgia" w:hAnsi="Georgia" w:cs="Georgia"/>
       <w:i/>
       <w:color w:val="666666"/>
       <w:sz w:val="48"/>
       <w:szCs w:val="48"/>
     </w:rPr>
   </w:style>
-  <w:style w:type="paragraph" w:styleId="Subtitle8" w:customStyle="1">
+  <w:style w:type="paragraph" w:customStyle="1" w:styleId="Subtitle8">
     <w:name w:val="Subtitle8"/>
     <w:basedOn w:val="Normal15"/>
     <w:next w:val="Normal15"/>
@@ -7541,14 +7559,14 @@
       <w:spacing w:before="360" w:after="80"/>
     </w:pPr>
     <w:rPr>
-      <w:rFonts w:ascii="Georgia" w:hAnsi="Georgia" w:eastAsia="Georgia" w:cs="Georgia"/>
+      <w:rFonts w:ascii="Georgia" w:eastAsia="Georgia" w:hAnsi="Georgia" w:cs="Georgia"/>
       <w:i/>
       <w:color w:val="666666"/>
       <w:sz w:val="48"/>
       <w:szCs w:val="48"/>
     </w:rPr>
   </w:style>
-  <w:style w:type="paragraph" w:styleId="Subtitle9" w:customStyle="1">
+  <w:style w:type="paragraph" w:customStyle="1" w:styleId="Subtitle9">
     <w:name w:val="Subtitle9"/>
     <w:basedOn w:val="Normal15"/>
     <w:next w:val="Normal15"/>
@@ -7558,14 +7576,14 @@
       <w:spacing w:before="360" w:after="80"/>
     </w:pPr>
     <w:rPr>
-      <w:rFonts w:ascii="Georgia" w:hAnsi="Georgia" w:eastAsia="Georgia" w:cs="Georgia"/>
+      <w:rFonts w:ascii="Georgia" w:eastAsia="Georgia" w:hAnsi="Georgia" w:cs="Georgia"/>
       <w:i/>
       <w:color w:val="666666"/>
       <w:sz w:val="48"/>
       <w:szCs w:val="48"/>
     </w:rPr>
   </w:style>
-  <w:style w:type="paragraph" w:styleId="Subtitle10" w:customStyle="1">
+  <w:style w:type="paragraph" w:customStyle="1" w:styleId="Subtitle10">
     <w:name w:val="Subtitle10"/>
     <w:basedOn w:val="Normal15"/>
     <w:next w:val="Normal15"/>
@@ -7575,14 +7593,14 @@
       <w:spacing w:before="360" w:after="80"/>
     </w:pPr>
     <w:rPr>
-      <w:rFonts w:ascii="Georgia" w:hAnsi="Georgia" w:eastAsia="Georgia" w:cs="Georgia"/>
+      <w:rFonts w:ascii="Georgia" w:eastAsia="Georgia" w:hAnsi="Georgia" w:cs="Georgia"/>
       <w:i/>
       <w:color w:val="666666"/>
       <w:sz w:val="48"/>
       <w:szCs w:val="48"/>
     </w:rPr>
   </w:style>
-  <w:style w:type="paragraph" w:styleId="Subtitle11" w:customStyle="1">
+  <w:style w:type="paragraph" w:customStyle="1" w:styleId="Subtitle11">
     <w:name w:val="Subtitle11"/>
     <w:basedOn w:val="Normal15"/>
     <w:next w:val="Normal15"/>
@@ -7592,14 +7610,14 @@
       <w:spacing w:before="360" w:after="80"/>
     </w:pPr>
     <w:rPr>
-      <w:rFonts w:ascii="Georgia" w:hAnsi="Georgia" w:eastAsia="Georgia" w:cs="Georgia"/>
+      <w:rFonts w:ascii="Georgia" w:eastAsia="Georgia" w:hAnsi="Georgia" w:cs="Georgia"/>
       <w:i/>
       <w:color w:val="666666"/>
       <w:sz w:val="48"/>
       <w:szCs w:val="48"/>
     </w:rPr>
   </w:style>
-  <w:style w:type="paragraph" w:styleId="Subtitle12" w:customStyle="1">
+  <w:style w:type="paragraph" w:customStyle="1" w:styleId="Subtitle12">
     <w:name w:val="Subtitle12"/>
     <w:basedOn w:val="Normal15"/>
     <w:next w:val="Normal15"/>
@@ -7609,14 +7627,14 @@
       <w:spacing w:before="360" w:after="80"/>
     </w:pPr>
     <w:rPr>
-      <w:rFonts w:ascii="Georgia" w:hAnsi="Georgia" w:eastAsia="Georgia" w:cs="Georgia"/>
+      <w:rFonts w:ascii="Georgia" w:eastAsia="Georgia" w:hAnsi="Georgia" w:cs="Georgia"/>
       <w:i/>
       <w:color w:val="666666"/>
       <w:sz w:val="48"/>
       <w:szCs w:val="48"/>
     </w:rPr>
   </w:style>
-  <w:style w:type="paragraph" w:styleId="Subtitle13" w:customStyle="1">
+  <w:style w:type="paragraph" w:customStyle="1" w:styleId="Subtitle13">
     <w:name w:val="Subtitle13"/>
     <w:basedOn w:val="Normal15"/>
     <w:next w:val="Normal15"/>
@@ -7626,14 +7644,14 @@
       <w:spacing w:before="360" w:after="80"/>
     </w:pPr>
     <w:rPr>
-      <w:rFonts w:ascii="Georgia" w:hAnsi="Georgia" w:eastAsia="Georgia" w:cs="Georgia"/>
+      <w:rFonts w:ascii="Georgia" w:eastAsia="Georgia" w:hAnsi="Georgia" w:cs="Georgia"/>
       <w:i/>
       <w:color w:val="666666"/>
       <w:sz w:val="48"/>
       <w:szCs w:val="48"/>
     </w:rPr>
   </w:style>
-  <w:style w:type="paragraph" w:styleId="Subtitle14" w:customStyle="1">
+  <w:style w:type="paragraph" w:customStyle="1" w:styleId="Subtitle14">
     <w:name w:val="Subtitle14"/>
     <w:basedOn w:val="Normal15"/>
     <w:next w:val="Normal15"/>
@@ -7643,14 +7661,14 @@
       <w:spacing w:before="360" w:after="80"/>
     </w:pPr>
     <w:rPr>
-      <w:rFonts w:ascii="Georgia" w:hAnsi="Georgia" w:eastAsia="Georgia" w:cs="Georgia"/>
+      <w:rFonts w:ascii="Georgia" w:eastAsia="Georgia" w:hAnsi="Georgia" w:cs="Georgia"/>
       <w:i/>
       <w:color w:val="666666"/>
       <w:sz w:val="48"/>
       <w:szCs w:val="48"/>
     </w:rPr>
   </w:style>
-  <w:style w:type="paragraph" w:styleId="Subtitle15" w:customStyle="1">
+  <w:style w:type="paragraph" w:customStyle="1" w:styleId="Subtitle15">
     <w:name w:val="Subtitle15"/>
     <w:basedOn w:val="Normal15"/>
     <w:next w:val="Normal15"/>
@@ -7660,7 +7678,7 @@
       <w:spacing w:before="360" w:after="80"/>
     </w:pPr>
     <w:rPr>
-      <w:rFonts w:ascii="Georgia" w:hAnsi="Georgia" w:eastAsia="Georgia" w:cs="Georgia"/>
+      <w:rFonts w:ascii="Georgia" w:eastAsia="Georgia" w:hAnsi="Georgia" w:cs="Georgia"/>
       <w:i/>
       <w:color w:val="666666"/>
       <w:sz w:val="48"/>
@@ -7693,7 +7711,7 @@
       <w:spacing w:before="0" w:after="0"/>
     </w:pPr>
   </w:style>
-  <w:style w:type="character" w:styleId="EncabezadoCar" w:customStyle="1">
+  <w:style w:type="character" w:customStyle="1" w:styleId="EncabezadoCar">
     <w:name w:val="Encabezado Car"/>
     <w:basedOn w:val="Fuentedeprrafopredeter"/>
     <w:link w:val="Encabezado"/>
@@ -7717,7 +7735,7 @@
       <w:spacing w:before="0" w:after="0"/>
     </w:pPr>
   </w:style>
-  <w:style w:type="character" w:styleId="PiedepginaCar" w:customStyle="1">
+  <w:style w:type="character" w:customStyle="1" w:styleId="PiedepginaCar">
     <w:name w:val="Pie de página Car"/>
     <w:basedOn w:val="Fuentedeprrafopredeter"/>
     <w:link w:val="Piedepgina"/>
@@ -8072,32 +8090,6 @@
 </file>
 
 <file path=customXml/item1.xml><?xml version="1.0" encoding="utf-8"?>
-<p:properties xmlns:p="http://schemas.microsoft.com/office/2006/metadata/properties" xmlns:xsi="http://www.w3.org/2001/XMLSchema-instance" xmlns:pc="http://schemas.microsoft.com/office/infopath/2007/PartnerControls">
-  <documentManagement>
-    <TaxCatchAll xmlns="b8b05679-8aa8-4882-8470-e321e59ce162" xsi:nil="true"/>
-    <lcf76f155ced4ddcb4097134ff3c332f xmlns="5ac550b3-3b11-46a8-b6fa-d40a3c9cf4bb">
-      <Terms xmlns="http://schemas.microsoft.com/office/infopath/2007/PartnerControls"/>
-    </lcf76f155ced4ddcb4097134ff3c332f>
-  </documentManagement>
-</p:properties>
-</file>
-
-<file path=customXml/item2.xml><?xml version="1.0" encoding="utf-8"?>
-<?mso-contentType ?>
-<FormTemplates xmlns="http://schemas.microsoft.com/sharepoint/v3/contenttype/forms">
-  <Display>DocumentLibraryForm</Display>
-  <Edit>DocumentLibraryForm</Edit>
-  <New>DocumentLibraryForm</New>
-</FormTemplates>
-</file>
-
-<file path=customXml/item3.xml><?xml version="1.0" encoding="utf-8"?>
-<go:gDocsCustomXmlDataStorage xmlns:go="http://customooxmlschemas.google.com/" xmlns:r="http://schemas.openxmlformats.org/officeDocument/2006/relationships">
-  <go:docsCustomData xmlns:go="http://customooxmlschemas.google.com/" roundtripDataSignature="AMtx7miwDKvjJp3yhbFhknX14CGvnuU66w==">AMUW2mVrCy9/qSx0iTt+WC8AdpJsaneo8qEq1+p/PharGONzMmQH3s7oe8fgl0BvD06p1xl/TfiLc7bep0ddQAlADfnykdpK7Y5b7KspYpinx5qkZ8qjgwE=</go:docsCustomData>
-</go:gDocsCustomXmlDataStorage>
-</file>
-
-<file path=customXml/item4.xml><?xml version="1.0" encoding="utf-8"?>
 <ct:contentTypeSchema xmlns:ct="http://schemas.microsoft.com/office/2006/metadata/contentType" xmlns:ma="http://schemas.microsoft.com/office/2006/metadata/properties/metaAttributes" ct:_="" ma:_="" ma:contentTypeName="Document" ma:contentTypeID="0x01010020D0480EA186DB47A725A8FBD1DC791C" ma:contentTypeVersion="11" ma:contentTypeDescription="Create a new document." ma:contentTypeScope="" ma:versionID="fe9fd950816a52e5945d83cefd9b5ae3">
   <xsd:schema xmlns:xsd="http://www.w3.org/2001/XMLSchema" xmlns:xs="http://www.w3.org/2001/XMLSchema" xmlns:p="http://schemas.microsoft.com/office/2006/metadata/properties" xmlns:ns2="5ac550b3-3b11-46a8-b6fa-d40a3c9cf4bb" xmlns:ns3="b8b05679-8aa8-4882-8470-e321e59ce162" targetNamespace="http://schemas.microsoft.com/office/2006/metadata/properties" ma:root="true" ma:fieldsID="9b29b335ee6cd492fd2011459656dcca" ns2:_="" ns3:_="">
     <xsd:import namespace="5ac550b3-3b11-46a8-b6fa-d40a3c9cf4bb"/>
@@ -8292,7 +8284,52 @@
 </ct:contentTypeSchema>
 </file>
 
+<file path=customXml/item2.xml><?xml version="1.0" encoding="utf-8"?>
+<p:properties xmlns:p="http://schemas.microsoft.com/office/2006/metadata/properties" xmlns:xsi="http://www.w3.org/2001/XMLSchema-instance" xmlns:pc="http://schemas.microsoft.com/office/infopath/2007/PartnerControls">
+  <documentManagement>
+    <TaxCatchAll xmlns="b8b05679-8aa8-4882-8470-e321e59ce162" xsi:nil="true"/>
+    <lcf76f155ced4ddcb4097134ff3c332f xmlns="5ac550b3-3b11-46a8-b6fa-d40a3c9cf4bb">
+      <Terms xmlns="http://schemas.microsoft.com/office/infopath/2007/PartnerControls"/>
+    </lcf76f155ced4ddcb4097134ff3c332f>
+  </documentManagement>
+</p:properties>
+</file>
+
+<file path=customXml/item3.xml><?xml version="1.0" encoding="utf-8"?>
+<?mso-contentType ?>
+<FormTemplates xmlns="http://schemas.microsoft.com/sharepoint/v3/contenttype/forms">
+  <Display>DocumentLibraryForm</Display>
+  <Edit>DocumentLibraryForm</Edit>
+  <New>DocumentLibraryForm</New>
+</FormTemplates>
+</file>
+
+<file path=customXml/item4.xml><?xml version="1.0" encoding="utf-8"?>
+<go:gDocsCustomXmlDataStorage xmlns:go="http://customooxmlschemas.google.com/" xmlns:r="http://schemas.openxmlformats.org/officeDocument/2006/relationships">
+  <go:docsCustomData xmlns:go="http://customooxmlschemas.google.com/" roundtripDataSignature="AMtx7miwDKvjJp3yhbFhknX14CGvnuU66w==">AMUW2mVrCy9/qSx0iTt+WC8AdpJsaneo8qEq1+p/PharGONzMmQH3s7oe8fgl0BvD06p1xl/TfiLc7bep0ddQAlADfnykdpK7Y5b7KspYpinx5qkZ8qjgwE=</go:docsCustomData>
+</go:gDocsCustomXmlDataStorage>
+</file>
+
 <file path=customXml/itemProps1.xml><?xml version="1.0" encoding="utf-8"?>
+<ds:datastoreItem xmlns:ds="http://schemas.openxmlformats.org/officeDocument/2006/customXml" ds:itemID="{C38DB5BC-6DFF-4C47-90F5-25507F3317B2}">
+  <ds:schemaRefs>
+    <ds:schemaRef ds:uri="http://schemas.microsoft.com/office/2006/metadata/contentType"/>
+    <ds:schemaRef ds:uri="http://schemas.microsoft.com/office/2006/metadata/properties/metaAttributes"/>
+    <ds:schemaRef ds:uri="http://www.w3.org/2001/XMLSchema"/>
+    <ds:schemaRef ds:uri="http://schemas.microsoft.com/office/2006/metadata/properties"/>
+    <ds:schemaRef ds:uri="5ac550b3-3b11-46a8-b6fa-d40a3c9cf4bb"/>
+    <ds:schemaRef ds:uri="b8b05679-8aa8-4882-8470-e321e59ce162"/>
+    <ds:schemaRef ds:uri="http://schemas.microsoft.com/office/2006/documentManagement/types"/>
+    <ds:schemaRef ds:uri="http://schemas.microsoft.com/office/infopath/2007/PartnerControls"/>
+    <ds:schemaRef ds:uri="http://schemas.openxmlformats.org/package/2006/metadata/core-properties"/>
+    <ds:schemaRef ds:uri="http://purl.org/dc/elements/1.1/"/>
+    <ds:schemaRef ds:uri="http://purl.org/dc/terms/"/>
+    <ds:schemaRef ds:uri="http://schemas.microsoft.com/internal/obd"/>
+  </ds:schemaRefs>
+</ds:datastoreItem>
+</file>
+
+<file path=customXml/itemProps2.xml><?xml version="1.0" encoding="utf-8"?>
 <ds:datastoreItem xmlns:ds="http://schemas.openxmlformats.org/officeDocument/2006/customXml" ds:itemID="{6A8661F8-167D-4B83-A8CB-2A59B3108EF7}">
   <ds:schemaRefs>
     <ds:schemaRef ds:uri="http://schemas.microsoft.com/office/2006/metadata/properties"/>
@@ -8303,7 +8340,7 @@
 </ds:datastoreItem>
 </file>
 
-<file path=customXml/itemProps2.xml><?xml version="1.0" encoding="utf-8"?>
+<file path=customXml/itemProps3.xml><?xml version="1.0" encoding="utf-8"?>
 <ds:datastoreItem xmlns:ds="http://schemas.openxmlformats.org/officeDocument/2006/customXml" ds:itemID="{CE48D4E0-9978-4762-AF5C-7F04098F19F4}">
   <ds:schemaRefs>
     <ds:schemaRef ds:uri="http://schemas.microsoft.com/sharepoint/v3/contenttype/forms"/>
@@ -8311,15 +8348,11 @@
 </ds:datastoreItem>
 </file>
 
-<file path=customXml/itemProps3.xml><?xml version="1.0" encoding="utf-8"?>
+<file path=customXml/itemProps4.xml><?xml version="1.0" encoding="utf-8"?>
 <ds:datastoreItem xmlns:ds="http://schemas.openxmlformats.org/officeDocument/2006/customXml" ds:itemID="{11111111-1234-1234-1234-123412341234}">
   <ds:schemaRefs>
     <ds:schemaRef ds:uri="http://customooxmlschemas.google.com/"/>
     <ds:schemaRef ds:uri="http://schemas.openxmlformats.org/officeDocument/2006/relationships"/>
   </ds:schemaRefs>
 </ds:datastoreItem>
-</file>
-
-<file path=customXml/itemProps4.xml><?xml version="1.0" encoding="utf-8"?>
-<ds:datastoreItem xmlns:ds="http://schemas.openxmlformats.org/officeDocument/2006/customXml" ds:itemID="{C38DB5BC-6DFF-4C47-90F5-25507F3317B2}"/>
 </file>
</xml_diff>